<commit_message>
Report: Evaluation and Discussion, Generation, updating, added references before I forget
</commit_message>
<xml_diff>
--- a/Documentation/Reports/Project-Report.docx
+++ b/Documentation/Reports/Project-Report.docx
@@ -791,7 +791,43 @@
                 <w:sz w:val="22"/>
                 <w:lang w:val="en-GB" w:eastAsia="en-GB"/>
               </w:rPr>
-              <w:t>Acknowledgements</w:t>
+              <w:t>Acknowled</w:t>
+            </w:r>
+            <w:r>
+              <w:rPr>
+                <w:rFonts w:ascii="Arial" w:hAnsi="Arial" w:cs="Arial"/>
+                <w:noProof/>
+                <w:sz w:val="22"/>
+                <w:lang w:val="en-GB" w:eastAsia="en-GB"/>
+              </w:rPr>
+              <w:t>g</w:t>
+            </w:r>
+            <w:r>
+              <w:rPr>
+                <w:rFonts w:ascii="Arial" w:hAnsi="Arial" w:cs="Arial"/>
+                <w:noProof/>
+                <w:sz w:val="22"/>
+                <w:lang w:val="en-GB" w:eastAsia="en-GB"/>
+              </w:rPr>
+              <w:t>em</w:t>
+            </w:r>
+            <w:r>
+              <w:rPr>
+                <w:rFonts w:ascii="Arial" w:hAnsi="Arial" w:cs="Arial"/>
+                <w:noProof/>
+                <w:sz w:val="22"/>
+                <w:lang w:val="en-GB" w:eastAsia="en-GB"/>
+              </w:rPr>
+              <w:t>e</w:t>
+            </w:r>
+            <w:r>
+              <w:rPr>
+                <w:rFonts w:ascii="Arial" w:hAnsi="Arial" w:cs="Arial"/>
+                <w:noProof/>
+                <w:sz w:val="22"/>
+                <w:lang w:val="en-GB" w:eastAsia="en-GB"/>
+              </w:rPr>
+              <w:t>nts</w:t>
             </w:r>
             <w:r>
               <w:rPr>
@@ -1208,10 +1244,13 @@
         </w:p>
         <w:p>
           <w:pPr>
-            <w:spacing w:after="0" w:line="240" w:lineRule="auto"/>
+            <w:pStyle w:val="TOC2"/>
+            <w:tabs>
+              <w:tab w:val="right" w:leader="dot" w:pos="9016"/>
+            </w:tabs>
             <w:rPr>
               <w:rFonts w:ascii="Arial" w:hAnsi="Arial" w:cs="Arial"/>
-              <w:sz w:val="22"/>
+              <w:noProof/>
               <w:lang w:val="en-GB" w:eastAsia="en-GB"/>
             </w:rPr>
           </w:pPr>
@@ -1223,6 +1262,683 @@
             </w:rPr>
             <w:fldChar w:fldCharType="end"/>
           </w:r>
+          <w:hyperlink w:anchor="_Toc226415489" w:history="1">
+            <w:r>
+              <w:rPr>
+                <w:rFonts w:ascii="Arial" w:hAnsi="Arial" w:cs="Arial"/>
+                <w:noProof/>
+                <w:lang w:val="en-GB" w:eastAsia="en-GB"/>
+              </w:rPr>
+              <w:t>Proced</w:t>
+            </w:r>
+            <w:r>
+              <w:rPr>
+                <w:rFonts w:ascii="Arial" w:hAnsi="Arial" w:cs="Arial"/>
+                <w:noProof/>
+                <w:lang w:val="en-GB" w:eastAsia="en-GB"/>
+              </w:rPr>
+              <w:t>u</w:t>
+            </w:r>
+            <w:r>
+              <w:rPr>
+                <w:rFonts w:ascii="Arial" w:hAnsi="Arial" w:cs="Arial"/>
+                <w:noProof/>
+                <w:lang w:val="en-GB" w:eastAsia="en-GB"/>
+              </w:rPr>
+              <w:t>ral Generation</w:t>
+            </w:r>
+            <w:r>
+              <w:rPr>
+                <w:rFonts w:ascii="Arial" w:hAnsi="Arial" w:cs="Arial"/>
+                <w:noProof/>
+                <w:lang w:val="en-GB" w:eastAsia="en-GB"/>
+              </w:rPr>
+              <w:tab/>
+            </w:r>
+            <w:r>
+              <w:rPr>
+                <w:rFonts w:ascii="Arial" w:hAnsi="Arial" w:cs="Arial"/>
+                <w:noProof/>
+                <w:lang w:val="en-GB" w:eastAsia="en-GB"/>
+              </w:rPr>
+              <w:fldChar w:fldCharType="begin"/>
+            </w:r>
+            <w:r>
+              <w:rPr>
+                <w:rFonts w:ascii="Arial" w:hAnsi="Arial" w:cs="Arial"/>
+                <w:noProof/>
+                <w:lang w:val="en-GB" w:eastAsia="en-GB"/>
+              </w:rPr>
+              <w:instrText xml:space="preserve"> PAGEREF _Toc226415489 \h </w:instrText>
+            </w:r>
+            <w:r>
+              <w:rPr>
+                <w:rFonts w:ascii="Arial" w:hAnsi="Arial" w:cs="Arial"/>
+                <w:noProof/>
+                <w:lang w:val="en-GB" w:eastAsia="en-GB"/>
+              </w:rPr>
+            </w:r>
+            <w:r>
+              <w:rPr>
+                <w:rFonts w:ascii="Arial" w:hAnsi="Arial" w:cs="Arial"/>
+                <w:noProof/>
+                <w:lang w:val="en-GB" w:eastAsia="en-GB"/>
+              </w:rPr>
+              <w:fldChar w:fldCharType="separate"/>
+            </w:r>
+            <w:r>
+              <w:rPr>
+                <w:rFonts w:ascii="Arial" w:hAnsi="Arial" w:cs="Arial"/>
+                <w:noProof/>
+                <w:lang w:val="en-GB" w:eastAsia="en-GB"/>
+              </w:rPr>
+              <w:t>4</w:t>
+            </w:r>
+            <w:r>
+              <w:rPr>
+                <w:rFonts w:ascii="Arial" w:hAnsi="Arial" w:cs="Arial"/>
+                <w:noProof/>
+                <w:lang w:val="en-GB" w:eastAsia="en-GB"/>
+              </w:rPr>
+              <w:fldChar w:fldCharType="end"/>
+            </w:r>
+          </w:hyperlink>
+        </w:p>
+        <w:p>
+          <w:pPr>
+            <w:tabs>
+              <w:tab w:val="right" w:leader="dot" w:pos="9016"/>
+            </w:tabs>
+            <w:spacing w:after="100" w:line="240" w:lineRule="auto"/>
+            <w:ind w:left="220"/>
+            <w:rPr>
+              <w:rFonts w:ascii="Arial" w:hAnsi="Arial" w:cs="Arial"/>
+              <w:noProof/>
+              <w:sz w:val="22"/>
+              <w:lang w:val="en-GB" w:eastAsia="en-GB"/>
+            </w:rPr>
+          </w:pPr>
+          <w:hyperlink w:anchor="_Toc226415490" w:history="1">
+            <w:r>
+              <w:rPr>
+                <w:rFonts w:ascii="Arial" w:hAnsi="Arial" w:cs="Arial"/>
+                <w:noProof/>
+                <w:sz w:val="22"/>
+                <w:lang w:val="en-GB" w:eastAsia="en-GB"/>
+              </w:rPr>
+              <w:t>Collision Detection</w:t>
+            </w:r>
+            <w:r>
+              <w:rPr>
+                <w:rFonts w:ascii="Arial" w:hAnsi="Arial" w:cs="Arial"/>
+                <w:noProof/>
+                <w:sz w:val="22"/>
+                <w:lang w:val="en-GB" w:eastAsia="en-GB"/>
+              </w:rPr>
+              <w:tab/>
+            </w:r>
+            <w:r>
+              <w:rPr>
+                <w:rFonts w:ascii="Arial" w:hAnsi="Arial" w:cs="Arial"/>
+                <w:noProof/>
+                <w:sz w:val="22"/>
+                <w:lang w:val="en-GB" w:eastAsia="en-GB"/>
+              </w:rPr>
+              <w:fldChar w:fldCharType="begin"/>
+            </w:r>
+            <w:r>
+              <w:rPr>
+                <w:rFonts w:ascii="Arial" w:hAnsi="Arial" w:cs="Arial"/>
+                <w:noProof/>
+                <w:sz w:val="22"/>
+                <w:lang w:val="en-GB" w:eastAsia="en-GB"/>
+              </w:rPr>
+              <w:instrText xml:space="preserve"> PAGEREF _Toc226415490 \h </w:instrText>
+            </w:r>
+            <w:r>
+              <w:rPr>
+                <w:rFonts w:ascii="Arial" w:hAnsi="Arial" w:cs="Arial"/>
+                <w:noProof/>
+                <w:sz w:val="22"/>
+                <w:lang w:val="en-GB" w:eastAsia="en-GB"/>
+              </w:rPr>
+            </w:r>
+            <w:r>
+              <w:rPr>
+                <w:rFonts w:ascii="Arial" w:hAnsi="Arial" w:cs="Arial"/>
+                <w:noProof/>
+                <w:sz w:val="22"/>
+                <w:lang w:val="en-GB" w:eastAsia="en-GB"/>
+              </w:rPr>
+              <w:fldChar w:fldCharType="separate"/>
+            </w:r>
+            <w:r>
+              <w:rPr>
+                <w:rFonts w:ascii="Arial" w:hAnsi="Arial" w:cs="Arial"/>
+                <w:noProof/>
+                <w:sz w:val="22"/>
+                <w:lang w:val="en-GB" w:eastAsia="en-GB"/>
+              </w:rPr>
+              <w:t>5</w:t>
+            </w:r>
+            <w:r>
+              <w:rPr>
+                <w:rFonts w:ascii="Arial" w:hAnsi="Arial" w:cs="Arial"/>
+                <w:noProof/>
+                <w:sz w:val="22"/>
+                <w:lang w:val="en-GB" w:eastAsia="en-GB"/>
+              </w:rPr>
+              <w:fldChar w:fldCharType="end"/>
+            </w:r>
+          </w:hyperlink>
+        </w:p>
+        <w:p>
+          <w:pPr>
+            <w:tabs>
+              <w:tab w:val="right" w:leader="dot" w:pos="9016"/>
+            </w:tabs>
+            <w:spacing w:after="100" w:line="240" w:lineRule="auto"/>
+            <w:ind w:left="220"/>
+            <w:rPr>
+              <w:rFonts w:ascii="Arial" w:hAnsi="Arial" w:cs="Arial"/>
+              <w:noProof/>
+              <w:sz w:val="22"/>
+              <w:lang w:val="en-GB" w:eastAsia="en-GB"/>
+            </w:rPr>
+          </w:pPr>
+          <w:hyperlink w:anchor="_Toc226415491" w:history="1">
+            <w:r>
+              <w:rPr>
+                <w:rFonts w:ascii="Arial" w:hAnsi="Arial" w:cs="Arial"/>
+                <w:noProof/>
+                <w:sz w:val="22"/>
+                <w:lang w:val="en-GB" w:eastAsia="en-GB"/>
+              </w:rPr>
+              <w:t>C++17 and Modern Game Development</w:t>
+            </w:r>
+            <w:r>
+              <w:rPr>
+                <w:rFonts w:ascii="Arial" w:hAnsi="Arial" w:cs="Arial"/>
+                <w:noProof/>
+                <w:sz w:val="22"/>
+                <w:lang w:val="en-GB" w:eastAsia="en-GB"/>
+              </w:rPr>
+              <w:tab/>
+            </w:r>
+            <w:r>
+              <w:rPr>
+                <w:rFonts w:ascii="Arial" w:hAnsi="Arial" w:cs="Arial"/>
+                <w:noProof/>
+                <w:sz w:val="22"/>
+                <w:lang w:val="en-GB" w:eastAsia="en-GB"/>
+              </w:rPr>
+              <w:fldChar w:fldCharType="begin"/>
+            </w:r>
+            <w:r>
+              <w:rPr>
+                <w:rFonts w:ascii="Arial" w:hAnsi="Arial" w:cs="Arial"/>
+                <w:noProof/>
+                <w:sz w:val="22"/>
+                <w:lang w:val="en-GB" w:eastAsia="en-GB"/>
+              </w:rPr>
+              <w:instrText xml:space="preserve"> PAGEREF _Toc226415491 \h </w:instrText>
+            </w:r>
+            <w:r>
+              <w:rPr>
+                <w:rFonts w:ascii="Arial" w:hAnsi="Arial" w:cs="Arial"/>
+                <w:noProof/>
+                <w:sz w:val="22"/>
+                <w:lang w:val="en-GB" w:eastAsia="en-GB"/>
+              </w:rPr>
+            </w:r>
+            <w:r>
+              <w:rPr>
+                <w:rFonts w:ascii="Arial" w:hAnsi="Arial" w:cs="Arial"/>
+                <w:noProof/>
+                <w:sz w:val="22"/>
+                <w:lang w:val="en-GB" w:eastAsia="en-GB"/>
+              </w:rPr>
+              <w:fldChar w:fldCharType="separate"/>
+            </w:r>
+            <w:r>
+              <w:rPr>
+                <w:rFonts w:ascii="Arial" w:hAnsi="Arial" w:cs="Arial"/>
+                <w:noProof/>
+                <w:sz w:val="22"/>
+                <w:lang w:val="en-GB" w:eastAsia="en-GB"/>
+              </w:rPr>
+              <w:t>5</w:t>
+            </w:r>
+            <w:r>
+              <w:rPr>
+                <w:rFonts w:ascii="Arial" w:hAnsi="Arial" w:cs="Arial"/>
+                <w:noProof/>
+                <w:sz w:val="22"/>
+                <w:lang w:val="en-GB" w:eastAsia="en-GB"/>
+              </w:rPr>
+              <w:fldChar w:fldCharType="end"/>
+            </w:r>
+          </w:hyperlink>
+        </w:p>
+        <w:p>
+          <w:pPr>
+            <w:tabs>
+              <w:tab w:val="right" w:leader="dot" w:pos="9016"/>
+            </w:tabs>
+            <w:spacing w:after="100" w:line="240" w:lineRule="auto"/>
+            <w:rPr>
+              <w:rFonts w:ascii="Arial" w:hAnsi="Arial" w:cs="Arial"/>
+              <w:noProof/>
+              <w:sz w:val="22"/>
+              <w:lang w:val="en-GB" w:eastAsia="en-GB"/>
+            </w:rPr>
+          </w:pPr>
+          <w:hyperlink w:anchor="_Toc226415492" w:history="1">
+            <w:r>
+              <w:rPr>
+                <w:rFonts w:ascii="Arial" w:hAnsi="Arial" w:cs="Arial"/>
+                <w:noProof/>
+                <w:sz w:val="22"/>
+                <w:lang w:val="en-GB" w:eastAsia="en-GB"/>
+              </w:rPr>
+              <w:t>Evaluation and Discussion</w:t>
+            </w:r>
+            <w:r>
+              <w:rPr>
+                <w:rFonts w:ascii="Arial" w:hAnsi="Arial" w:cs="Arial"/>
+                <w:noProof/>
+                <w:sz w:val="22"/>
+                <w:lang w:val="en-GB" w:eastAsia="en-GB"/>
+              </w:rPr>
+              <w:tab/>
+            </w:r>
+            <w:r>
+              <w:rPr>
+                <w:rFonts w:ascii="Arial" w:hAnsi="Arial" w:cs="Arial"/>
+                <w:noProof/>
+                <w:sz w:val="22"/>
+                <w:lang w:val="en-GB" w:eastAsia="en-GB"/>
+              </w:rPr>
+              <w:fldChar w:fldCharType="begin"/>
+            </w:r>
+            <w:r>
+              <w:rPr>
+                <w:rFonts w:ascii="Arial" w:hAnsi="Arial" w:cs="Arial"/>
+                <w:noProof/>
+                <w:sz w:val="22"/>
+                <w:lang w:val="en-GB" w:eastAsia="en-GB"/>
+              </w:rPr>
+              <w:instrText xml:space="preserve"> PAGEREF _Toc226415492 \h </w:instrText>
+            </w:r>
+            <w:r>
+              <w:rPr>
+                <w:rFonts w:ascii="Arial" w:hAnsi="Arial" w:cs="Arial"/>
+                <w:noProof/>
+                <w:sz w:val="22"/>
+                <w:lang w:val="en-GB" w:eastAsia="en-GB"/>
+              </w:rPr>
+            </w:r>
+            <w:r>
+              <w:rPr>
+                <w:rFonts w:ascii="Arial" w:hAnsi="Arial" w:cs="Arial"/>
+                <w:noProof/>
+                <w:sz w:val="22"/>
+                <w:lang w:val="en-GB" w:eastAsia="en-GB"/>
+              </w:rPr>
+              <w:fldChar w:fldCharType="separate"/>
+            </w:r>
+            <w:r>
+              <w:rPr>
+                <w:rFonts w:ascii="Arial" w:hAnsi="Arial" w:cs="Arial"/>
+                <w:noProof/>
+                <w:sz w:val="22"/>
+                <w:lang w:val="en-GB" w:eastAsia="en-GB"/>
+              </w:rPr>
+              <w:t>5</w:t>
+            </w:r>
+            <w:r>
+              <w:rPr>
+                <w:rFonts w:ascii="Arial" w:hAnsi="Arial" w:cs="Arial"/>
+                <w:noProof/>
+                <w:sz w:val="22"/>
+                <w:lang w:val="en-GB" w:eastAsia="en-GB"/>
+              </w:rPr>
+              <w:fldChar w:fldCharType="end"/>
+            </w:r>
+          </w:hyperlink>
+        </w:p>
+        <w:p>
+          <w:pPr>
+            <w:tabs>
+              <w:tab w:val="right" w:leader="dot" w:pos="9016"/>
+            </w:tabs>
+            <w:spacing w:after="100" w:line="240" w:lineRule="auto"/>
+            <w:ind w:left="220"/>
+            <w:rPr>
+              <w:rFonts w:ascii="Arial" w:hAnsi="Arial" w:cs="Arial"/>
+              <w:noProof/>
+              <w:sz w:val="22"/>
+              <w:lang w:val="en-GB" w:eastAsia="en-GB"/>
+            </w:rPr>
+          </w:pPr>
+          <w:hyperlink w:anchor="_Toc226415493" w:history="1">
+            <w:r>
+              <w:rPr>
+                <w:rFonts w:ascii="Arial" w:hAnsi="Arial" w:cs="Arial"/>
+                <w:noProof/>
+                <w:sz w:val="22"/>
+                <w:lang w:val="en-GB" w:eastAsia="en-GB"/>
+              </w:rPr>
+              <w:t>Architecture Quality</w:t>
+            </w:r>
+            <w:r>
+              <w:rPr>
+                <w:rFonts w:ascii="Arial" w:hAnsi="Arial" w:cs="Arial"/>
+                <w:noProof/>
+                <w:sz w:val="22"/>
+                <w:lang w:val="en-GB" w:eastAsia="en-GB"/>
+              </w:rPr>
+              <w:tab/>
+            </w:r>
+            <w:r>
+              <w:rPr>
+                <w:rFonts w:ascii="Arial" w:hAnsi="Arial" w:cs="Arial"/>
+                <w:noProof/>
+                <w:sz w:val="22"/>
+                <w:lang w:val="en-GB" w:eastAsia="en-GB"/>
+              </w:rPr>
+              <w:fldChar w:fldCharType="begin"/>
+            </w:r>
+            <w:r>
+              <w:rPr>
+                <w:rFonts w:ascii="Arial" w:hAnsi="Arial" w:cs="Arial"/>
+                <w:noProof/>
+                <w:sz w:val="22"/>
+                <w:lang w:val="en-GB" w:eastAsia="en-GB"/>
+              </w:rPr>
+              <w:instrText xml:space="preserve"> PAGEREF _Toc226415493 \h </w:instrText>
+            </w:r>
+            <w:r>
+              <w:rPr>
+                <w:rFonts w:ascii="Arial" w:hAnsi="Arial" w:cs="Arial"/>
+                <w:noProof/>
+                <w:sz w:val="22"/>
+                <w:lang w:val="en-GB" w:eastAsia="en-GB"/>
+              </w:rPr>
+            </w:r>
+            <w:r>
+              <w:rPr>
+                <w:rFonts w:ascii="Arial" w:hAnsi="Arial" w:cs="Arial"/>
+                <w:noProof/>
+                <w:sz w:val="22"/>
+                <w:lang w:val="en-GB" w:eastAsia="en-GB"/>
+              </w:rPr>
+              <w:fldChar w:fldCharType="separate"/>
+            </w:r>
+            <w:r>
+              <w:rPr>
+                <w:rFonts w:ascii="Arial" w:hAnsi="Arial" w:cs="Arial"/>
+                <w:noProof/>
+                <w:sz w:val="22"/>
+                <w:lang w:val="en-GB" w:eastAsia="en-GB"/>
+              </w:rPr>
+              <w:t>5</w:t>
+            </w:r>
+            <w:r>
+              <w:rPr>
+                <w:rFonts w:ascii="Arial" w:hAnsi="Arial" w:cs="Arial"/>
+                <w:noProof/>
+                <w:sz w:val="22"/>
+                <w:lang w:val="en-GB" w:eastAsia="en-GB"/>
+              </w:rPr>
+              <w:fldChar w:fldCharType="end"/>
+            </w:r>
+          </w:hyperlink>
+        </w:p>
+        <w:p>
+          <w:pPr>
+            <w:tabs>
+              <w:tab w:val="right" w:leader="dot" w:pos="9016"/>
+            </w:tabs>
+            <w:spacing w:after="100" w:line="240" w:lineRule="auto"/>
+            <w:ind w:left="220"/>
+            <w:rPr>
+              <w:rFonts w:ascii="Arial" w:hAnsi="Arial" w:cs="Arial"/>
+              <w:noProof/>
+              <w:sz w:val="22"/>
+              <w:lang w:val="en-GB" w:eastAsia="en-GB"/>
+            </w:rPr>
+          </w:pPr>
+          <w:hyperlink w:anchor="_Toc226415494" w:history="1">
+            <w:r>
+              <w:rPr>
+                <w:rFonts w:ascii="Arial" w:hAnsi="Arial" w:cs="Arial"/>
+                <w:noProof/>
+                <w:sz w:val="22"/>
+                <w:lang w:val="en-GB" w:eastAsia="en-GB"/>
+              </w:rPr>
+              <w:t>Procedural Gener</w:t>
+            </w:r>
+            <w:r>
+              <w:rPr>
+                <w:rFonts w:ascii="Arial" w:hAnsi="Arial" w:cs="Arial"/>
+                <w:noProof/>
+                <w:sz w:val="22"/>
+                <w:lang w:val="en-GB" w:eastAsia="en-GB"/>
+              </w:rPr>
+              <w:t>a</w:t>
+            </w:r>
+            <w:r>
+              <w:rPr>
+                <w:rFonts w:ascii="Arial" w:hAnsi="Arial" w:cs="Arial"/>
+                <w:noProof/>
+                <w:sz w:val="22"/>
+                <w:lang w:val="en-GB" w:eastAsia="en-GB"/>
+              </w:rPr>
+              <w:t xml:space="preserve">tion </w:t>
+            </w:r>
+            <w:r>
+              <w:rPr>
+                <w:rFonts w:ascii="Arial" w:hAnsi="Arial" w:cs="Arial"/>
+                <w:noProof/>
+                <w:sz w:val="22"/>
+                <w:lang w:val="en-GB" w:eastAsia="en-GB"/>
+              </w:rPr>
+              <w:t>R</w:t>
+            </w:r>
+            <w:r>
+              <w:rPr>
+                <w:rFonts w:ascii="Arial" w:hAnsi="Arial" w:cs="Arial"/>
+                <w:noProof/>
+                <w:sz w:val="22"/>
+                <w:lang w:val="en-GB" w:eastAsia="en-GB"/>
+              </w:rPr>
+              <w:t>esults</w:t>
+            </w:r>
+            <w:r>
+              <w:rPr>
+                <w:rFonts w:ascii="Arial" w:hAnsi="Arial" w:cs="Arial"/>
+                <w:noProof/>
+                <w:sz w:val="22"/>
+                <w:lang w:val="en-GB" w:eastAsia="en-GB"/>
+              </w:rPr>
+              <w:tab/>
+            </w:r>
+            <w:r>
+              <w:rPr>
+                <w:rFonts w:ascii="Arial" w:hAnsi="Arial" w:cs="Arial"/>
+                <w:noProof/>
+                <w:sz w:val="22"/>
+                <w:lang w:val="en-GB" w:eastAsia="en-GB"/>
+              </w:rPr>
+              <w:fldChar w:fldCharType="begin"/>
+            </w:r>
+            <w:r>
+              <w:rPr>
+                <w:rFonts w:ascii="Arial" w:hAnsi="Arial" w:cs="Arial"/>
+                <w:noProof/>
+                <w:sz w:val="22"/>
+                <w:lang w:val="en-GB" w:eastAsia="en-GB"/>
+              </w:rPr>
+              <w:instrText xml:space="preserve"> PAGEREF _Toc226415494 \h </w:instrText>
+            </w:r>
+            <w:r>
+              <w:rPr>
+                <w:rFonts w:ascii="Arial" w:hAnsi="Arial" w:cs="Arial"/>
+                <w:noProof/>
+                <w:sz w:val="22"/>
+                <w:lang w:val="en-GB" w:eastAsia="en-GB"/>
+              </w:rPr>
+            </w:r>
+            <w:r>
+              <w:rPr>
+                <w:rFonts w:ascii="Arial" w:hAnsi="Arial" w:cs="Arial"/>
+                <w:noProof/>
+                <w:sz w:val="22"/>
+                <w:lang w:val="en-GB" w:eastAsia="en-GB"/>
+              </w:rPr>
+              <w:fldChar w:fldCharType="separate"/>
+            </w:r>
+            <w:r>
+              <w:rPr>
+                <w:rFonts w:ascii="Arial" w:hAnsi="Arial" w:cs="Arial"/>
+                <w:noProof/>
+                <w:sz w:val="22"/>
+                <w:lang w:val="en-GB" w:eastAsia="en-GB"/>
+              </w:rPr>
+              <w:t>5</w:t>
+            </w:r>
+            <w:r>
+              <w:rPr>
+                <w:rFonts w:ascii="Arial" w:hAnsi="Arial" w:cs="Arial"/>
+                <w:noProof/>
+                <w:sz w:val="22"/>
+                <w:lang w:val="en-GB" w:eastAsia="en-GB"/>
+              </w:rPr>
+              <w:fldChar w:fldCharType="end"/>
+            </w:r>
+          </w:hyperlink>
+        </w:p>
+        <w:p>
+          <w:pPr>
+            <w:tabs>
+              <w:tab w:val="right" w:leader="dot" w:pos="9016"/>
+            </w:tabs>
+            <w:spacing w:after="100" w:line="240" w:lineRule="auto"/>
+            <w:rPr>
+              <w:rFonts w:ascii="Arial" w:hAnsi="Arial" w:cs="Arial"/>
+              <w:noProof/>
+              <w:sz w:val="22"/>
+              <w:lang w:val="en-GB" w:eastAsia="en-GB"/>
+            </w:rPr>
+          </w:pPr>
+          <w:hyperlink w:anchor="_Toc226415506" w:history="1">
+            <w:r>
+              <w:rPr>
+                <w:rFonts w:ascii="Arial" w:hAnsi="Arial" w:cs="Arial"/>
+                <w:noProof/>
+                <w:sz w:val="22"/>
+                <w:lang w:val="en-GB" w:eastAsia="en-GB"/>
+              </w:rPr>
+              <w:t>Reference</w:t>
+            </w:r>
+            <w:r>
+              <w:rPr>
+                <w:rFonts w:ascii="Arial" w:hAnsi="Arial" w:cs="Arial"/>
+                <w:noProof/>
+                <w:sz w:val="22"/>
+                <w:lang w:val="en-GB" w:eastAsia="en-GB"/>
+              </w:rPr>
+              <w:t>s</w:t>
+            </w:r>
+            <w:r>
+              <w:rPr>
+                <w:rFonts w:ascii="Arial" w:hAnsi="Arial" w:cs="Arial"/>
+                <w:noProof/>
+                <w:sz w:val="22"/>
+                <w:lang w:val="en-GB" w:eastAsia="en-GB"/>
+              </w:rPr>
+              <w:tab/>
+            </w:r>
+            <w:r>
+              <w:rPr>
+                <w:rFonts w:ascii="Arial" w:hAnsi="Arial" w:cs="Arial"/>
+                <w:noProof/>
+                <w:sz w:val="22"/>
+                <w:lang w:val="en-GB" w:eastAsia="en-GB"/>
+              </w:rPr>
+              <w:fldChar w:fldCharType="begin"/>
+            </w:r>
+            <w:r>
+              <w:rPr>
+                <w:rFonts w:ascii="Arial" w:hAnsi="Arial" w:cs="Arial"/>
+                <w:noProof/>
+                <w:sz w:val="22"/>
+                <w:lang w:val="en-GB" w:eastAsia="en-GB"/>
+              </w:rPr>
+              <w:instrText xml:space="preserve"> PAGEREF _Toc226415506 \h </w:instrText>
+            </w:r>
+            <w:r>
+              <w:rPr>
+                <w:rFonts w:ascii="Arial" w:hAnsi="Arial" w:cs="Arial"/>
+                <w:noProof/>
+                <w:sz w:val="22"/>
+                <w:lang w:val="en-GB" w:eastAsia="en-GB"/>
+              </w:rPr>
+            </w:r>
+            <w:r>
+              <w:rPr>
+                <w:rFonts w:ascii="Arial" w:hAnsi="Arial" w:cs="Arial"/>
+                <w:noProof/>
+                <w:sz w:val="22"/>
+                <w:lang w:val="en-GB" w:eastAsia="en-GB"/>
+              </w:rPr>
+              <w:fldChar w:fldCharType="separate"/>
+            </w:r>
+            <w:r>
+              <w:rPr>
+                <w:rFonts w:ascii="Arial" w:hAnsi="Arial" w:cs="Arial"/>
+                <w:noProof/>
+                <w:sz w:val="22"/>
+                <w:lang w:val="en-GB" w:eastAsia="en-GB"/>
+              </w:rPr>
+              <w:t>1</w:t>
+            </w:r>
+            <w:r>
+              <w:rPr>
+                <w:rFonts w:ascii="Arial" w:hAnsi="Arial" w:cs="Arial"/>
+                <w:noProof/>
+                <w:sz w:val="22"/>
+                <w:lang w:val="en-GB" w:eastAsia="en-GB"/>
+              </w:rPr>
+              <w:fldChar w:fldCharType="end"/>
+            </w:r>
+          </w:hyperlink>
+        </w:p>
+        <w:p>
+          <w:pPr>
+            <w:tabs>
+              <w:tab w:val="right" w:leader="dot" w:pos="9016"/>
+            </w:tabs>
+            <w:spacing w:after="100" w:line="240" w:lineRule="auto"/>
+            <w:ind w:left="220"/>
+            <w:rPr>
+              <w:rFonts w:ascii="Arial" w:hAnsi="Arial" w:cs="Arial"/>
+              <w:noProof/>
+              <w:sz w:val="22"/>
+              <w:lang w:val="en-GB" w:eastAsia="en-GB"/>
+            </w:rPr>
+          </w:pPr>
+        </w:p>
+        <w:p>
+          <w:pPr>
+            <w:spacing w:after="0" w:line="240" w:lineRule="auto"/>
+            <w:rPr>
+              <w:rFonts w:ascii="Arial" w:hAnsi="Arial" w:cs="Arial"/>
+              <w:sz w:val="22"/>
+              <w:lang w:val="en-GB" w:eastAsia="en-GB"/>
+            </w:rPr>
+          </w:pPr>
         </w:p>
       </w:sdtContent>
     </w:sdt>
@@ -1292,7 +2008,25 @@
           <w:sz w:val="22"/>
           <w:lang w:val="en-GB" w:eastAsia="en-GB"/>
         </w:rPr>
-        <w:t>I would like to thank my supervisor Omer Ali for his feedback and guidance throughout this project, and Martin Harrigan for overseeing the module. I would also like to thank the other supervisors, Amr Abdelhafez, Ben O'Shaughnessy, Libor Zachoval, and Noel O'Hara, for their time and constructive feedback during project presentations.</w:t>
+        <w:t xml:space="preserve">I would like to thank my supervisor Omer Ali for his feedback and guidance throughout this project, and Martin Harrigan for overseeing the module. I would also like to thank the other supervisors, Amr Abdelhafez, Ben O'Shaughnessy, Libor </w:t>
+      </w:r>
+      <w:proofErr w:type="spellStart"/>
+      <w:r>
+        <w:rPr>
+          <w:rFonts w:ascii="Arial" w:hAnsi="Arial" w:cs="Arial"/>
+          <w:sz w:val="22"/>
+          <w:lang w:val="en-GB" w:eastAsia="en-GB"/>
+        </w:rPr>
+        <w:t>Zachoval</w:t>
+      </w:r>
+      <w:proofErr w:type="spellEnd"/>
+      <w:r>
+        <w:rPr>
+          <w:rFonts w:ascii="Arial" w:hAnsi="Arial" w:cs="Arial"/>
+          <w:sz w:val="22"/>
+          <w:lang w:val="en-GB" w:eastAsia="en-GB"/>
+        </w:rPr>
+        <w:t>, and Noel O'Hara, for their time and constructive feedback during project presentations.</w:t>
       </w:r>
     </w:p>
     <w:p>
@@ -1310,7 +2044,25 @@
           <w:sz w:val="22"/>
           <w:lang w:val="en-GB" w:eastAsia="en-GB"/>
         </w:rPr>
-        <w:t>The following external resources were central to this project. Robert Nystrom's Game Programming Patterns (gameprogrammingpatterns.com) served as the primary architectural reference throughout development. Ken Perlin's improved noise algorithm and Robert Bridson's Poisson disk sampling paper provided the mathematical basis for the procedural generation systems. The SFML development team and the tmxlite contributors provided the core libraries the project depends on.</w:t>
+        <w:t xml:space="preserve">The following external resources were central to this project. Robert Nystrom's Game Programming Patterns (gameprogrammingpatterns.com) served as the primary architectural reference throughout development. Ken Perlin's improved noise algorithm and Robert Bridson's Poisson disk sampling paper provided the mathematical basis for the procedural generation systems. The SFML development team and the </w:t>
+      </w:r>
+      <w:proofErr w:type="spellStart"/>
+      <w:r>
+        <w:rPr>
+          <w:rFonts w:ascii="Arial" w:hAnsi="Arial" w:cs="Arial"/>
+          <w:sz w:val="22"/>
+          <w:lang w:val="en-GB" w:eastAsia="en-GB"/>
+        </w:rPr>
+        <w:t>tmxlite</w:t>
+      </w:r>
+      <w:proofErr w:type="spellEnd"/>
+      <w:r>
+        <w:rPr>
+          <w:rFonts w:ascii="Arial" w:hAnsi="Arial" w:cs="Arial"/>
+          <w:sz w:val="22"/>
+          <w:lang w:val="en-GB" w:eastAsia="en-GB"/>
+        </w:rPr>
+        <w:t xml:space="preserve"> contributors provided the core libraries the project depends on.</w:t>
       </w:r>
     </w:p>
     <w:p>
@@ -1543,7 +2295,79 @@
           <w:sz w:val="22"/>
           <w:lang w:val="en-GB" w:eastAsia="en-GB"/>
         </w:rPr>
-        <w:t>Design and implement a component-based architecture using the interfaces IRenderable, IUpdatable, IPositionable, and ICollidable.</w:t>
+        <w:t xml:space="preserve">Design and implement a component-based architecture using the interfaces </w:t>
+      </w:r>
+      <w:proofErr w:type="spellStart"/>
+      <w:r>
+        <w:rPr>
+          <w:rFonts w:ascii="Arial" w:hAnsi="Arial" w:cs="Arial"/>
+          <w:sz w:val="22"/>
+          <w:lang w:val="en-GB" w:eastAsia="en-GB"/>
+        </w:rPr>
+        <w:t>IRenderable</w:t>
+      </w:r>
+      <w:proofErr w:type="spellEnd"/>
+      <w:r>
+        <w:rPr>
+          <w:rFonts w:ascii="Arial" w:hAnsi="Arial" w:cs="Arial"/>
+          <w:sz w:val="22"/>
+          <w:lang w:val="en-GB" w:eastAsia="en-GB"/>
+        </w:rPr>
+        <w:t xml:space="preserve">, </w:t>
+      </w:r>
+      <w:proofErr w:type="spellStart"/>
+      <w:r>
+        <w:rPr>
+          <w:rFonts w:ascii="Arial" w:hAnsi="Arial" w:cs="Arial"/>
+          <w:sz w:val="22"/>
+          <w:lang w:val="en-GB" w:eastAsia="en-GB"/>
+        </w:rPr>
+        <w:t>IUpdatable</w:t>
+      </w:r>
+      <w:proofErr w:type="spellEnd"/>
+      <w:r>
+        <w:rPr>
+          <w:rFonts w:ascii="Arial" w:hAnsi="Arial" w:cs="Arial"/>
+          <w:sz w:val="22"/>
+          <w:lang w:val="en-GB" w:eastAsia="en-GB"/>
+        </w:rPr>
+        <w:t xml:space="preserve">, </w:t>
+      </w:r>
+      <w:proofErr w:type="spellStart"/>
+      <w:r>
+        <w:rPr>
+          <w:rFonts w:ascii="Arial" w:hAnsi="Arial" w:cs="Arial"/>
+          <w:sz w:val="22"/>
+          <w:lang w:val="en-GB" w:eastAsia="en-GB"/>
+        </w:rPr>
+        <w:t>IPositionable</w:t>
+      </w:r>
+      <w:proofErr w:type="spellEnd"/>
+      <w:r>
+        <w:rPr>
+          <w:rFonts w:ascii="Arial" w:hAnsi="Arial" w:cs="Arial"/>
+          <w:sz w:val="22"/>
+          <w:lang w:val="en-GB" w:eastAsia="en-GB"/>
+        </w:rPr>
+        <w:t xml:space="preserve">, and </w:t>
+      </w:r>
+      <w:proofErr w:type="spellStart"/>
+      <w:r>
+        <w:rPr>
+          <w:rFonts w:ascii="Arial" w:hAnsi="Arial" w:cs="Arial"/>
+          <w:sz w:val="22"/>
+          <w:lang w:val="en-GB" w:eastAsia="en-GB"/>
+        </w:rPr>
+        <w:t>ICollidable</w:t>
+      </w:r>
+      <w:proofErr w:type="spellEnd"/>
+      <w:r>
+        <w:rPr>
+          <w:rFonts w:ascii="Arial" w:hAnsi="Arial" w:cs="Arial"/>
+          <w:sz w:val="22"/>
+          <w:lang w:val="en-GB" w:eastAsia="en-GB"/>
+        </w:rPr>
+        <w:t>.</w:t>
       </w:r>
     </w:p>
     <w:p>
@@ -1748,7 +2572,25 @@
           <w:sz w:val="22"/>
           <w:lang w:val="en-GB" w:eastAsia="en-GB"/>
         </w:rPr>
-        <w:t>Nystrom's Game Programming Patterns (2014) is the primary reference for this project. Published as a free web resource and later as a book, it catalogues 20 patterns observed in production game codebases. Nystrom's contribution is to translate established Gang of Four patterns (Gamma, Helm, Johnson, Vlissides: 1994) into game-specific contexts and to add game-specific patterns not found in general software engineering literature, such as the Game Loop, Update Method, and Spatial Partition.</w:t>
+        <w:t xml:space="preserve">Nystrom's Game Programming Patterns (2014) is the primary reference for this project. Published as a free web resource and later as a book, it catalogues 20 patterns observed in production game codebases. Nystrom's contribution is to translate established Gang of Four patterns (Gamma, Helm, Johnson, </w:t>
+      </w:r>
+      <w:proofErr w:type="spellStart"/>
+      <w:r>
+        <w:rPr>
+          <w:rFonts w:ascii="Arial" w:hAnsi="Arial" w:cs="Arial"/>
+          <w:sz w:val="22"/>
+          <w:lang w:val="en-GB" w:eastAsia="en-GB"/>
+        </w:rPr>
+        <w:t>Vlissides</w:t>
+      </w:r>
+      <w:proofErr w:type="spellEnd"/>
+      <w:r>
+        <w:rPr>
+          <w:rFonts w:ascii="Arial" w:hAnsi="Arial" w:cs="Arial"/>
+          <w:sz w:val="22"/>
+          <w:lang w:val="en-GB" w:eastAsia="en-GB"/>
+        </w:rPr>
+        <w:t>: 1994) into game-specific contexts and to add game-specific patterns not found in general software engineering literature, such as the Game Loop, Update Method, and Spatial Partition.</w:t>
       </w:r>
     </w:p>
     <w:p>
@@ -1766,20 +2608,2338 @@
           <w:sz w:val="22"/>
           <w:lang w:val="en-GB" w:eastAsia="en-GB"/>
         </w:rPr>
-        <w:t>The patterns applied in this project are: the Component pattern (player entity design), the State pattern extended to a Pushdown Automaton (game state management), the Command pattern (input abstraction), the Flyweight pattern (shared collision data), the Spatial Partition pattern (Voronoi nearest-site lookup), the Update Method pattern (IUpdatable hierarchy), and the Observer pattern in a pull variant (HUD reading stat values at render time).</w:t>
-      </w:r>
+        <w:t>The patterns applied in this project are: the Component pattern (player entity design), the State pattern extended to a Pushdown Automaton (game state management), the Command pattern (input abstraction), the Flyweight pattern (shared collision data), the Spatial Partition pattern (Voronoi nearest-site lookup), the Update Method pattern (</w:t>
+      </w:r>
+      <w:proofErr w:type="spellStart"/>
+      <w:r>
+        <w:rPr>
+          <w:rFonts w:ascii="Arial" w:hAnsi="Arial" w:cs="Arial"/>
+          <w:sz w:val="22"/>
+          <w:lang w:val="en-GB" w:eastAsia="en-GB"/>
+        </w:rPr>
+        <w:t>IUpdatable</w:t>
+      </w:r>
+      <w:proofErr w:type="spellEnd"/>
+      <w:r>
+        <w:rPr>
+          <w:rFonts w:ascii="Arial" w:hAnsi="Arial" w:cs="Arial"/>
+          <w:sz w:val="22"/>
+          <w:lang w:val="en-GB" w:eastAsia="en-GB"/>
+        </w:rPr>
+        <w:t xml:space="preserve"> hierarchy), and the Observer pattern in a pull variant (HUD reading stat values at render time).</w:t>
+      </w:r>
+    </w:p>
+    <w:p>
+      <w:pPr>
+        <w:spacing w:before="240" w:after="120" w:line="240" w:lineRule="auto"/>
+        <w:outlineLvl w:val="1"/>
+        <w:rPr>
+          <w:rFonts w:ascii="Arial" w:hAnsi="Arial" w:cs="Arial"/>
+          <w:b/>
+          <w:bCs/>
+          <w:color w:val="1F4E79"/>
+          <w:sz w:val="28"/>
+          <w:szCs w:val="28"/>
+          <w:lang w:val="en-GB" w:eastAsia="en-GB"/>
+        </w:rPr>
+      </w:pPr>
+      <w:bookmarkStart w:id="5" w:name="_Toc226415489"/>
+      <w:r>
+        <w:rPr>
+          <w:rFonts w:ascii="Arial" w:hAnsi="Arial" w:cs="Arial"/>
+          <w:b/>
+          <w:bCs/>
+          <w:color w:val="1F4E79"/>
+          <w:sz w:val="28"/>
+          <w:szCs w:val="28"/>
+          <w:lang w:val="en-GB" w:eastAsia="en-GB"/>
+        </w:rPr>
+        <w:t>Procedural Generation</w:t>
+      </w:r>
+      <w:bookmarkEnd w:id="5"/>
+    </w:p>
+    <w:p>
+      <w:pPr>
+        <w:spacing w:after="140" w:line="240" w:lineRule="auto"/>
+        <w:rPr>
+          <w:rFonts w:ascii="Arial" w:hAnsi="Arial" w:cs="Arial"/>
+          <w:sz w:val="22"/>
+          <w:lang w:val="en-GB" w:eastAsia="en-GB"/>
+        </w:rPr>
+      </w:pPr>
+      <w:r>
+        <w:rPr>
+          <w:rFonts w:ascii="Arial" w:hAnsi="Arial" w:cs="Arial"/>
+          <w:sz w:val="22"/>
+          <w:lang w:val="en-GB" w:eastAsia="en-GB"/>
+        </w:rPr>
+        <w:t xml:space="preserve">Procedural generation in games is broadly defined as the algorithmic creation of content that would otherwise need to be </w:t>
+      </w:r>
+      <w:r>
+        <w:rPr>
+          <w:rFonts w:ascii="Arial" w:hAnsi="Arial" w:cs="Arial"/>
+          <w:sz w:val="22"/>
+          <w:lang w:val="en-GB" w:eastAsia="en-GB"/>
+        </w:rPr>
+        <w:t>hand authored</w:t>
+      </w:r>
+      <w:r>
+        <w:rPr>
+          <w:rFonts w:ascii="Arial" w:hAnsi="Arial" w:cs="Arial"/>
+          <w:sz w:val="22"/>
+          <w:lang w:val="en-GB" w:eastAsia="en-GB"/>
+        </w:rPr>
+        <w:t>. Procedural Content Generation in Games provide a taxonomy of approaches: constructive methods (Voronoi, Perlin noise) versus search-based methods (</w:t>
+      </w:r>
+      <w:r>
+        <w:rPr>
+          <w:rFonts w:ascii="Arial" w:hAnsi="Arial" w:cs="Arial"/>
+          <w:sz w:val="22"/>
+          <w:lang w:val="en-GB" w:eastAsia="en-GB"/>
+        </w:rPr>
+        <w:t>heuristic, tree search techniques</w:t>
+      </w:r>
+      <w:r>
+        <w:rPr>
+          <w:rFonts w:ascii="Arial" w:hAnsi="Arial" w:cs="Arial"/>
+          <w:sz w:val="22"/>
+          <w:lang w:val="en-GB" w:eastAsia="en-GB"/>
+        </w:rPr>
+        <w:t>). This project uses constructive methods throughout.</w:t>
+      </w:r>
+    </w:p>
+    <w:p>
+      <w:pPr>
+        <w:spacing w:after="140" w:line="240" w:lineRule="auto"/>
+        <w:rPr>
+          <w:rFonts w:ascii="Arial" w:hAnsi="Arial" w:cs="Arial"/>
+          <w:sz w:val="22"/>
+          <w:lang w:val="en-GB" w:eastAsia="en-GB"/>
+        </w:rPr>
+      </w:pPr>
+      <w:r>
+        <w:rPr>
+          <w:rFonts w:ascii="Arial" w:hAnsi="Arial" w:cs="Arial"/>
+          <w:sz w:val="22"/>
+          <w:lang w:val="en-GB" w:eastAsia="en-GB"/>
+        </w:rPr>
+        <w:t xml:space="preserve">The Voronoi </w:t>
+      </w:r>
+      <w:r>
+        <w:rPr>
+          <w:rFonts w:ascii="Arial" w:hAnsi="Arial" w:cs="Arial"/>
+          <w:sz w:val="22"/>
+          <w:lang w:val="en-GB" w:eastAsia="en-GB"/>
+        </w:rPr>
+        <w:t>algorithm</w:t>
+      </w:r>
+      <w:r>
+        <w:rPr>
+          <w:rFonts w:ascii="Arial" w:hAnsi="Arial" w:cs="Arial"/>
+          <w:sz w:val="22"/>
+          <w:lang w:val="en-GB" w:eastAsia="en-GB"/>
+        </w:rPr>
+        <w:t xml:space="preserve"> is a classical computational geometry construct dividing space into cells based on proximity to seed sites (</w:t>
+      </w:r>
+      <w:proofErr w:type="spellStart"/>
+      <w:r>
+        <w:rPr>
+          <w:rFonts w:ascii="Arial" w:hAnsi="Arial" w:cs="Arial"/>
+          <w:sz w:val="22"/>
+          <w:lang w:val="en-GB" w:eastAsia="en-GB"/>
+        </w:rPr>
+        <w:t>Voronoy</w:t>
+      </w:r>
+      <w:proofErr w:type="spellEnd"/>
+      <w:r>
+        <w:rPr>
+          <w:rFonts w:ascii="Arial" w:hAnsi="Arial" w:cs="Arial"/>
+          <w:sz w:val="22"/>
+          <w:lang w:val="en-GB" w:eastAsia="en-GB"/>
+        </w:rPr>
+        <w:t>, early 1900s)</w:t>
+      </w:r>
+      <w:r>
+        <w:rPr>
+          <w:rFonts w:ascii="Arial" w:hAnsi="Arial" w:cs="Arial"/>
+          <w:sz w:val="22"/>
+          <w:lang w:val="en-GB" w:eastAsia="en-GB"/>
+        </w:rPr>
+        <w:t>; efficient algorithms for computing it, such as Fortune’s sweep line algorithm, were developed later (Fortune, 1987)</w:t>
+      </w:r>
+      <w:r>
+        <w:rPr>
+          <w:rFonts w:ascii="Arial" w:hAnsi="Arial" w:cs="Arial"/>
+          <w:sz w:val="22"/>
+          <w:lang w:val="en-GB" w:eastAsia="en-GB"/>
+        </w:rPr>
+        <w:t xml:space="preserve"> In game terrain generation it is commonly used to create organic</w:t>
+      </w:r>
+      <w:r>
+        <w:rPr>
+          <w:rFonts w:ascii="Arial" w:hAnsi="Arial" w:cs="Arial"/>
+          <w:sz w:val="22"/>
+          <w:lang w:val="en-GB" w:eastAsia="en-GB"/>
+        </w:rPr>
+        <w:t>-</w:t>
+      </w:r>
+      <w:r>
+        <w:rPr>
+          <w:rFonts w:ascii="Arial" w:hAnsi="Arial" w:cs="Arial"/>
+          <w:sz w:val="22"/>
+          <w:lang w:val="en-GB" w:eastAsia="en-GB"/>
+        </w:rPr>
+        <w:t>looking region boundaries. The naive O(n²) implementation used initially in this project was replaced by combining Poisson disk sampling (Bridson, 2007) for site placement with a spatial hash grid for proximity queries, reducing generation time from 84ms to 11ms at the 80×80 tile test size.</w:t>
+      </w:r>
+    </w:p>
+    <w:p>
+      <w:pPr>
+        <w:spacing w:after="140" w:line="240" w:lineRule="auto"/>
+        <w:rPr>
+          <w:rFonts w:ascii="Arial" w:hAnsi="Arial" w:cs="Arial"/>
+          <w:sz w:val="22"/>
+          <w:lang w:val="en-GB" w:eastAsia="en-GB"/>
+        </w:rPr>
+      </w:pPr>
+      <w:r>
+        <w:rPr>
+          <w:rFonts w:ascii="Arial" w:hAnsi="Arial" w:cs="Arial"/>
+          <w:sz w:val="22"/>
+          <w:lang w:val="en-GB" w:eastAsia="en-GB"/>
+        </w:rPr>
+        <w:lastRenderedPageBreak/>
+        <w:t>Perlin noise (Perlin, 1985; improved in 2002) is the standard algorithm for continuous, smooth pseudo-random value fields in games. Its application for object density control in Thorns follows the standard approach of sampling octave noise at each tile position and applying a threshold to determine object placement</w:t>
+      </w:r>
+      <w:r>
+        <w:rPr>
+          <w:rFonts w:ascii="Arial" w:hAnsi="Arial" w:cs="Arial"/>
+          <w:sz w:val="22"/>
+          <w:lang w:val="en-GB" w:eastAsia="en-GB"/>
+        </w:rPr>
+        <w:t>.</w:t>
+      </w:r>
+    </w:p>
+    <w:p>
+      <w:pPr>
+        <w:spacing w:before="240" w:after="120" w:line="240" w:lineRule="auto"/>
+        <w:outlineLvl w:val="1"/>
+        <w:rPr>
+          <w:rFonts w:ascii="Arial" w:hAnsi="Arial" w:cs="Arial"/>
+          <w:b/>
+          <w:bCs/>
+          <w:color w:val="1F4E79"/>
+          <w:sz w:val="28"/>
+          <w:szCs w:val="28"/>
+          <w:lang w:val="en-GB" w:eastAsia="en-GB"/>
+        </w:rPr>
+      </w:pPr>
+      <w:bookmarkStart w:id="6" w:name="_Toc226415490"/>
+      <w:r>
+        <w:rPr>
+          <w:rFonts w:ascii="Arial" w:hAnsi="Arial" w:cs="Arial"/>
+          <w:b/>
+          <w:bCs/>
+          <w:color w:val="1F4E79"/>
+          <w:sz w:val="28"/>
+          <w:szCs w:val="28"/>
+          <w:lang w:val="en-GB" w:eastAsia="en-GB"/>
+        </w:rPr>
+        <w:t>Collision Detection</w:t>
+      </w:r>
+      <w:bookmarkEnd w:id="6"/>
+    </w:p>
+    <w:p>
+      <w:pPr>
+        <w:spacing w:after="140" w:line="240" w:lineRule="auto"/>
+        <w:rPr>
+          <w:rFonts w:ascii="Arial" w:hAnsi="Arial" w:cs="Arial"/>
+          <w:sz w:val="22"/>
+          <w:lang w:val="en-GB" w:eastAsia="en-GB"/>
+        </w:rPr>
+      </w:pPr>
+      <w:r>
+        <w:rPr>
+          <w:rFonts w:ascii="Arial" w:hAnsi="Arial" w:cs="Arial"/>
+          <w:sz w:val="22"/>
+          <w:lang w:val="en-GB" w:eastAsia="en-GB"/>
+        </w:rPr>
+        <w:t>The Separating Axis Theorem (SAT) for convex polygon collision is a well-established algorithm in real-time game physics (Ericson, 2005). For each candidate axis derived from polygon edges, both shapes are projected and tested for overlap. The minimum translation vector (MTV) is computed from the axis with the least overlap and used for resolution. This project uses SAT for narrow-phase collision after an AABB broad-phase pre-check, following standard practice.</w:t>
+      </w:r>
+    </w:p>
+    <w:p>
+      <w:pPr>
+        <w:spacing w:after="140" w:line="240" w:lineRule="auto"/>
+        <w:rPr>
+          <w:rFonts w:ascii="Arial" w:hAnsi="Arial" w:cs="Arial"/>
+          <w:sz w:val="22"/>
+          <w:lang w:val="en-GB" w:eastAsia="en-GB"/>
+        </w:rPr>
+      </w:pPr>
+      <w:r>
+        <w:rPr>
+          <w:rFonts w:ascii="Arial" w:hAnsi="Arial" w:cs="Arial"/>
+          <w:sz w:val="22"/>
+          <w:lang w:val="en-GB" w:eastAsia="en-GB"/>
+        </w:rPr>
+        <w:t xml:space="preserve">The Flyweight pattern for shared collision data addresses a specific performance concern: a 128×128 map with thousands of world objects each holding full copies of their polygon data would impose unnecessary memory overhead. By storing one shape list per object type in the </w:t>
+      </w:r>
+      <w:proofErr w:type="spellStart"/>
+      <w:r>
+        <w:rPr>
+          <w:rFonts w:ascii="Arial" w:hAnsi="Arial" w:cs="Arial"/>
+          <w:sz w:val="22"/>
+          <w:lang w:val="en-GB" w:eastAsia="en-GB"/>
+        </w:rPr>
+        <w:t>WorldObjectTemplateManager</w:t>
+      </w:r>
+      <w:proofErr w:type="spellEnd"/>
+      <w:r>
+        <w:rPr>
+          <w:rFonts w:ascii="Arial" w:hAnsi="Arial" w:cs="Arial"/>
+          <w:sz w:val="22"/>
+          <w:lang w:val="en-GB" w:eastAsia="en-GB"/>
+        </w:rPr>
+        <w:t xml:space="preserve"> and sharing it via non-owning pointers, memory usage is minimised without sacrificing access speed.</w:t>
+      </w:r>
+    </w:p>
+    <w:p>
+      <w:pPr>
+        <w:spacing w:before="240" w:after="120" w:line="240" w:lineRule="auto"/>
+        <w:outlineLvl w:val="1"/>
+        <w:rPr>
+          <w:rFonts w:ascii="Arial" w:hAnsi="Arial" w:cs="Arial"/>
+          <w:b/>
+          <w:bCs/>
+          <w:color w:val="1F4E79"/>
+          <w:sz w:val="28"/>
+          <w:szCs w:val="28"/>
+          <w:lang w:val="en-GB" w:eastAsia="en-GB"/>
+        </w:rPr>
+      </w:pPr>
+      <w:bookmarkStart w:id="7" w:name="_Toc226415491"/>
+      <w:r>
+        <w:rPr>
+          <w:rFonts w:ascii="Arial" w:hAnsi="Arial" w:cs="Arial"/>
+          <w:b/>
+          <w:bCs/>
+          <w:color w:val="1F4E79"/>
+          <w:sz w:val="28"/>
+          <w:szCs w:val="28"/>
+          <w:lang w:val="en-GB" w:eastAsia="en-GB"/>
+        </w:rPr>
+        <w:t>C++17 and Modern Game Development</w:t>
+      </w:r>
+      <w:bookmarkEnd w:id="7"/>
+    </w:p>
+    <w:p>
+      <w:pPr>
+        <w:spacing w:after="140" w:line="240" w:lineRule="auto"/>
+        <w:rPr>
+          <w:rFonts w:ascii="Arial" w:hAnsi="Arial" w:cs="Arial"/>
+          <w:sz w:val="22"/>
+          <w:lang w:val="en-GB" w:eastAsia="en-GB"/>
+        </w:rPr>
+      </w:pPr>
+      <w:r>
+        <w:rPr>
+          <w:rFonts w:ascii="Arial" w:hAnsi="Arial" w:cs="Arial"/>
+          <w:sz w:val="22"/>
+          <w:lang w:val="en-GB" w:eastAsia="en-GB"/>
+        </w:rPr>
+        <w:t xml:space="preserve">C++17 introduces several features directly applicable to games architecture. </w:t>
+      </w:r>
+      <w:proofErr w:type="gramStart"/>
+      <w:r>
+        <w:rPr>
+          <w:rFonts w:ascii="Arial" w:hAnsi="Arial" w:cs="Arial"/>
+          <w:sz w:val="22"/>
+          <w:lang w:val="en-GB" w:eastAsia="en-GB"/>
+        </w:rPr>
+        <w:t>std::</w:t>
+      </w:r>
+      <w:proofErr w:type="gramEnd"/>
+      <w:r>
+        <w:rPr>
+          <w:rFonts w:ascii="Arial" w:hAnsi="Arial" w:cs="Arial"/>
+          <w:sz w:val="22"/>
+          <w:lang w:val="en-GB" w:eastAsia="en-GB"/>
+        </w:rPr>
+        <w:t xml:space="preserve">variant provides a </w:t>
+      </w:r>
+      <w:proofErr w:type="gramStart"/>
+      <w:r>
+        <w:rPr>
+          <w:rFonts w:ascii="Arial" w:hAnsi="Arial" w:cs="Arial"/>
+          <w:sz w:val="22"/>
+          <w:lang w:val="en-GB" w:eastAsia="en-GB"/>
+        </w:rPr>
+        <w:t>type</w:t>
+      </w:r>
+      <w:proofErr w:type="gramEnd"/>
+      <w:r>
+        <w:rPr>
+          <w:rFonts w:ascii="Arial" w:hAnsi="Arial" w:cs="Arial"/>
+          <w:sz w:val="22"/>
+          <w:lang w:val="en-GB" w:eastAsia="en-GB"/>
+        </w:rPr>
+        <w:t xml:space="preserve"> </w:t>
+      </w:r>
+      <w:r>
+        <w:rPr>
+          <w:rFonts w:ascii="Arial" w:hAnsi="Arial" w:cs="Arial"/>
+          <w:sz w:val="22"/>
+          <w:lang w:val="en-GB" w:eastAsia="en-GB"/>
+        </w:rPr>
+        <w:t xml:space="preserve">safe tagged union, used in this project for the </w:t>
+      </w:r>
+      <w:proofErr w:type="spellStart"/>
+      <w:r>
+        <w:rPr>
+          <w:rFonts w:ascii="Arial" w:hAnsi="Arial" w:cs="Arial"/>
+          <w:sz w:val="22"/>
+          <w:lang w:val="en-GB" w:eastAsia="en-GB"/>
+        </w:rPr>
+        <w:t>CollisionShape</w:t>
+      </w:r>
+      <w:proofErr w:type="spellEnd"/>
+      <w:r>
+        <w:rPr>
+          <w:rFonts w:ascii="Arial" w:hAnsi="Arial" w:cs="Arial"/>
+          <w:sz w:val="22"/>
+          <w:lang w:val="en-GB" w:eastAsia="en-GB"/>
+        </w:rPr>
+        <w:t xml:space="preserve"> type (holding either </w:t>
+      </w:r>
+      <w:proofErr w:type="gramStart"/>
+      <w:r>
+        <w:rPr>
+          <w:rFonts w:ascii="Arial" w:hAnsi="Arial" w:cs="Arial"/>
+          <w:sz w:val="22"/>
+          <w:lang w:val="en-GB" w:eastAsia="en-GB"/>
+        </w:rPr>
+        <w:t>sf::</w:t>
+      </w:r>
+      <w:proofErr w:type="spellStart"/>
+      <w:proofErr w:type="gramEnd"/>
+      <w:r>
+        <w:rPr>
+          <w:rFonts w:ascii="Arial" w:hAnsi="Arial" w:cs="Arial"/>
+          <w:sz w:val="22"/>
+          <w:lang w:val="en-GB" w:eastAsia="en-GB"/>
+        </w:rPr>
+        <w:t>FloatRect</w:t>
+      </w:r>
+      <w:proofErr w:type="spellEnd"/>
+      <w:r>
+        <w:rPr>
+          <w:rFonts w:ascii="Arial" w:hAnsi="Arial" w:cs="Arial"/>
+          <w:sz w:val="22"/>
+          <w:lang w:val="en-GB" w:eastAsia="en-GB"/>
+        </w:rPr>
+        <w:t xml:space="preserve"> or </w:t>
+      </w:r>
+      <w:proofErr w:type="spellStart"/>
+      <w:r>
+        <w:rPr>
+          <w:rFonts w:ascii="Arial" w:hAnsi="Arial" w:cs="Arial"/>
+          <w:sz w:val="22"/>
+          <w:lang w:val="en-GB" w:eastAsia="en-GB"/>
+        </w:rPr>
+        <w:t>CollisionPolygon</w:t>
+      </w:r>
+      <w:proofErr w:type="spellEnd"/>
+      <w:r>
+        <w:rPr>
+          <w:rFonts w:ascii="Arial" w:hAnsi="Arial" w:cs="Arial"/>
+          <w:sz w:val="22"/>
+          <w:lang w:val="en-GB" w:eastAsia="en-GB"/>
+        </w:rPr>
+        <w:t xml:space="preserve">) and for </w:t>
+      </w:r>
+      <w:proofErr w:type="spellStart"/>
+      <w:r>
+        <w:rPr>
+          <w:rFonts w:ascii="Arial" w:hAnsi="Arial" w:cs="Arial"/>
+          <w:sz w:val="22"/>
+          <w:lang w:val="en-GB" w:eastAsia="en-GB"/>
+        </w:rPr>
+        <w:t>MapGenerator's</w:t>
+      </w:r>
+      <w:proofErr w:type="spellEnd"/>
+      <w:r>
+        <w:rPr>
+          <w:rFonts w:ascii="Arial" w:hAnsi="Arial" w:cs="Arial"/>
+          <w:sz w:val="22"/>
+          <w:lang w:val="en-GB" w:eastAsia="en-GB"/>
+        </w:rPr>
+        <w:t xml:space="preserve"> site mode selection. </w:t>
+      </w:r>
+      <w:proofErr w:type="gramStart"/>
+      <w:r>
+        <w:rPr>
+          <w:rFonts w:ascii="Arial" w:hAnsi="Arial" w:cs="Arial"/>
+          <w:sz w:val="22"/>
+          <w:lang w:val="en-GB" w:eastAsia="en-GB"/>
+        </w:rPr>
+        <w:t>std::</w:t>
+      </w:r>
+      <w:proofErr w:type="gramEnd"/>
+      <w:r>
+        <w:rPr>
+          <w:rFonts w:ascii="Arial" w:hAnsi="Arial" w:cs="Arial"/>
+          <w:sz w:val="22"/>
+          <w:lang w:val="en-GB" w:eastAsia="en-GB"/>
+        </w:rPr>
+        <w:t>visit enables type</w:t>
+      </w:r>
+      <w:r>
+        <w:rPr>
+          <w:rFonts w:ascii="Arial" w:hAnsi="Arial" w:cs="Arial"/>
+          <w:sz w:val="22"/>
+          <w:lang w:val="en-GB" w:eastAsia="en-GB"/>
+        </w:rPr>
+        <w:t xml:space="preserve"> </w:t>
+      </w:r>
+      <w:r>
+        <w:rPr>
+          <w:rFonts w:ascii="Arial" w:hAnsi="Arial" w:cs="Arial"/>
+          <w:sz w:val="22"/>
+          <w:lang w:val="en-GB" w:eastAsia="en-GB"/>
+        </w:rPr>
+        <w:t>dispatched behaviour without virtual calls, reducing runtime overhead. Smart pointers (</w:t>
+      </w:r>
+      <w:proofErr w:type="gramStart"/>
+      <w:r>
+        <w:rPr>
+          <w:rFonts w:ascii="Arial" w:hAnsi="Arial" w:cs="Arial"/>
+          <w:sz w:val="22"/>
+          <w:lang w:val="en-GB" w:eastAsia="en-GB"/>
+        </w:rPr>
+        <w:t>std::</w:t>
+      </w:r>
+      <w:proofErr w:type="spellStart"/>
+      <w:proofErr w:type="gramEnd"/>
+      <w:r>
+        <w:rPr>
+          <w:rFonts w:ascii="Arial" w:hAnsi="Arial" w:cs="Arial"/>
+          <w:sz w:val="22"/>
+          <w:lang w:val="en-GB" w:eastAsia="en-GB"/>
+        </w:rPr>
+        <w:t>unique_ptr</w:t>
+      </w:r>
+      <w:proofErr w:type="spellEnd"/>
+      <w:r>
+        <w:rPr>
+          <w:rFonts w:ascii="Arial" w:hAnsi="Arial" w:cs="Arial"/>
+          <w:sz w:val="22"/>
+          <w:lang w:val="en-GB" w:eastAsia="en-GB"/>
+        </w:rPr>
+        <w:t>) enforce RAII ownership semantics, eliminating manual memory management and the class of bugs it introduces.</w:t>
+      </w:r>
+    </w:p>
+    <w:p>
+      <w:pPr>
+        <w:spacing w:after="0" w:line="240" w:lineRule="auto"/>
+        <w:rPr>
+          <w:rFonts w:ascii="Arial" w:hAnsi="Arial" w:cs="Arial"/>
+          <w:sz w:val="22"/>
+          <w:lang w:val="en-GB" w:eastAsia="en-GB"/>
+        </w:rPr>
+      </w:pPr>
+    </w:p>
+    <w:p>
+      <w:pPr>
+        <w:pBdr>
+          <w:bottom w:val="single" w:sz="6" w:space="1" w:color="2E75B6"/>
+        </w:pBdr>
+        <w:spacing w:before="360" w:after="180" w:line="240" w:lineRule="auto"/>
+        <w:outlineLvl w:val="0"/>
+        <w:rPr>
+          <w:rFonts w:ascii="Arial" w:hAnsi="Arial" w:cs="Arial"/>
+          <w:b/>
+          <w:bCs/>
+          <w:color w:val="2E75B6"/>
+          <w:sz w:val="32"/>
+          <w:szCs w:val="32"/>
+          <w:lang w:val="en-GB" w:eastAsia="en-GB"/>
+        </w:rPr>
+      </w:pPr>
+      <w:bookmarkStart w:id="8" w:name="_Toc226415492"/>
+      <w:r>
+        <w:rPr>
+          <w:rFonts w:ascii="Arial" w:hAnsi="Arial" w:cs="Arial"/>
+          <w:b/>
+          <w:bCs/>
+          <w:color w:val="2E75B6"/>
+          <w:sz w:val="32"/>
+          <w:szCs w:val="32"/>
+          <w:lang w:val="en-GB" w:eastAsia="en-GB"/>
+        </w:rPr>
+        <w:t>Evaluation and Discussion</w:t>
+      </w:r>
+      <w:bookmarkEnd w:id="8"/>
+    </w:p>
+    <w:p>
+      <w:pPr>
+        <w:spacing w:before="240" w:after="120" w:line="240" w:lineRule="auto"/>
+        <w:outlineLvl w:val="1"/>
+        <w:rPr>
+          <w:rFonts w:ascii="Arial" w:hAnsi="Arial" w:cs="Arial"/>
+          <w:b/>
+          <w:bCs/>
+          <w:color w:val="1F4E79"/>
+          <w:sz w:val="28"/>
+          <w:szCs w:val="28"/>
+          <w:lang w:val="en-GB" w:eastAsia="en-GB"/>
+        </w:rPr>
+      </w:pPr>
+      <w:bookmarkStart w:id="9" w:name="_Toc226415493"/>
+      <w:r>
+        <w:rPr>
+          <w:rFonts w:ascii="Arial" w:hAnsi="Arial" w:cs="Arial"/>
+          <w:b/>
+          <w:bCs/>
+          <w:color w:val="1F4E79"/>
+          <w:sz w:val="28"/>
+          <w:szCs w:val="28"/>
+          <w:lang w:val="en-GB" w:eastAsia="en-GB"/>
+        </w:rPr>
+        <w:t>Architecture Quality</w:t>
+      </w:r>
+      <w:bookmarkEnd w:id="9"/>
+    </w:p>
+    <w:p>
+      <w:pPr>
+        <w:spacing w:after="140" w:line="240" w:lineRule="auto"/>
+        <w:rPr>
+          <w:rFonts w:ascii="Arial" w:hAnsi="Arial" w:cs="Arial"/>
+          <w:sz w:val="22"/>
+          <w:lang w:val="en-GB" w:eastAsia="en-GB"/>
+        </w:rPr>
+      </w:pPr>
+      <w:r>
+        <w:rPr>
+          <w:rFonts w:ascii="Arial" w:hAnsi="Arial" w:cs="Arial"/>
+          <w:sz w:val="22"/>
+          <w:lang w:val="en-GB" w:eastAsia="en-GB"/>
+        </w:rPr>
+        <w:t xml:space="preserve">The component-based architecture achieved its primary design goal: player behaviour can be modified by adding, removing, or reconfiguring components without touching the Player class itself. The </w:t>
+      </w:r>
+      <w:proofErr w:type="spellStart"/>
+      <w:r>
+        <w:rPr>
+          <w:rFonts w:ascii="Arial" w:hAnsi="Arial" w:cs="Arial"/>
+          <w:sz w:val="22"/>
+          <w:lang w:val="en-GB" w:eastAsia="en-GB"/>
+        </w:rPr>
+        <w:t>IRenderable</w:t>
+      </w:r>
+      <w:proofErr w:type="spellEnd"/>
+      <w:r>
+        <w:rPr>
+          <w:rFonts w:ascii="Arial" w:hAnsi="Arial" w:cs="Arial"/>
+          <w:sz w:val="22"/>
+          <w:lang w:val="en-GB" w:eastAsia="en-GB"/>
+        </w:rPr>
+        <w:t>/</w:t>
+      </w:r>
+      <w:proofErr w:type="spellStart"/>
+      <w:r>
+        <w:rPr>
+          <w:rFonts w:ascii="Arial" w:hAnsi="Arial" w:cs="Arial"/>
+          <w:sz w:val="22"/>
+          <w:lang w:val="en-GB" w:eastAsia="en-GB"/>
+        </w:rPr>
+        <w:t>IUpdatable</w:t>
+      </w:r>
+      <w:proofErr w:type="spellEnd"/>
+      <w:r>
+        <w:rPr>
+          <w:rFonts w:ascii="Arial" w:hAnsi="Arial" w:cs="Arial"/>
+          <w:sz w:val="22"/>
+          <w:lang w:val="en-GB" w:eastAsia="en-GB"/>
+        </w:rPr>
+        <w:t>/</w:t>
+      </w:r>
+      <w:proofErr w:type="spellStart"/>
+      <w:r>
+        <w:rPr>
+          <w:rFonts w:ascii="Arial" w:hAnsi="Arial" w:cs="Arial"/>
+          <w:sz w:val="22"/>
+          <w:lang w:val="en-GB" w:eastAsia="en-GB"/>
+        </w:rPr>
+        <w:t>IPositionable</w:t>
+      </w:r>
+      <w:proofErr w:type="spellEnd"/>
+      <w:r>
+        <w:rPr>
+          <w:rFonts w:ascii="Arial" w:hAnsi="Arial" w:cs="Arial"/>
+          <w:sz w:val="22"/>
+          <w:lang w:val="en-GB" w:eastAsia="en-GB"/>
+        </w:rPr>
+        <w:t>/</w:t>
+      </w:r>
+      <w:proofErr w:type="spellStart"/>
+      <w:r>
+        <w:rPr>
+          <w:rFonts w:ascii="Arial" w:hAnsi="Arial" w:cs="Arial"/>
+          <w:sz w:val="22"/>
+          <w:lang w:val="en-GB" w:eastAsia="en-GB"/>
+        </w:rPr>
+        <w:t>ICollidable</w:t>
+      </w:r>
+      <w:proofErr w:type="spellEnd"/>
+      <w:r>
+        <w:rPr>
+          <w:rFonts w:ascii="Arial" w:hAnsi="Arial" w:cs="Arial"/>
+          <w:sz w:val="22"/>
+          <w:lang w:val="en-GB" w:eastAsia="en-GB"/>
+        </w:rPr>
+        <w:t xml:space="preserve"> interfaces enforce a clear contract that all components implement. The </w:t>
+      </w:r>
+      <w:proofErr w:type="spellStart"/>
+      <w:r>
+        <w:rPr>
+          <w:rFonts w:ascii="Arial" w:hAnsi="Arial" w:cs="Arial"/>
+          <w:sz w:val="22"/>
+          <w:lang w:val="en-GB" w:eastAsia="en-GB"/>
+        </w:rPr>
+        <w:t>HUDComponent</w:t>
+      </w:r>
+      <w:proofErr w:type="spellEnd"/>
+      <w:r>
+        <w:rPr>
+          <w:rFonts w:ascii="Arial" w:hAnsi="Arial" w:cs="Arial"/>
+          <w:sz w:val="22"/>
+          <w:lang w:val="en-GB" w:eastAsia="en-GB"/>
+        </w:rPr>
+        <w:t xml:space="preserve"> demonstrably illustrates the Observer (pull) pattern</w:t>
+      </w:r>
+      <w:r>
+        <w:rPr>
+          <w:rFonts w:ascii="Arial" w:hAnsi="Arial" w:cs="Arial"/>
+          <w:sz w:val="22"/>
+          <w:lang w:val="en-GB" w:eastAsia="en-GB"/>
+        </w:rPr>
+        <w:t xml:space="preserve">, </w:t>
+      </w:r>
+      <w:r>
+        <w:rPr>
+          <w:rFonts w:ascii="Arial" w:hAnsi="Arial" w:cs="Arial"/>
+          <w:sz w:val="22"/>
+          <w:lang w:val="en-GB" w:eastAsia="en-GB"/>
+        </w:rPr>
+        <w:t xml:space="preserve">it holds </w:t>
+      </w:r>
+      <w:proofErr w:type="spellStart"/>
+      <w:r>
+        <w:rPr>
+          <w:rFonts w:ascii="Arial" w:hAnsi="Arial" w:cs="Arial"/>
+          <w:sz w:val="22"/>
+          <w:lang w:val="en-GB" w:eastAsia="en-GB"/>
+        </w:rPr>
+        <w:t>const</w:t>
+      </w:r>
+      <w:proofErr w:type="spellEnd"/>
+      <w:r>
+        <w:rPr>
+          <w:rFonts w:ascii="Arial" w:hAnsi="Arial" w:cs="Arial"/>
+          <w:sz w:val="22"/>
+          <w:lang w:val="en-GB" w:eastAsia="en-GB"/>
+        </w:rPr>
+        <w:t xml:space="preserve"> references to stat components and reads their values at render time, decoupling the stat logic entirely from rendering logic.</w:t>
+      </w:r>
+    </w:p>
+    <w:p>
+      <w:pPr>
+        <w:spacing w:after="140" w:line="240" w:lineRule="auto"/>
+        <w:rPr>
+          <w:rFonts w:ascii="Arial" w:hAnsi="Arial" w:cs="Arial"/>
+          <w:sz w:val="22"/>
+          <w:lang w:val="en-GB" w:eastAsia="en-GB"/>
+        </w:rPr>
+      </w:pPr>
+      <w:r>
+        <w:rPr>
+          <w:rFonts w:ascii="Arial" w:hAnsi="Arial" w:cs="Arial"/>
+          <w:sz w:val="22"/>
+          <w:lang w:val="en-GB" w:eastAsia="en-GB"/>
+        </w:rPr>
+        <w:t xml:space="preserve">The </w:t>
+      </w:r>
+      <w:proofErr w:type="spellStart"/>
+      <w:r>
+        <w:rPr>
+          <w:rFonts w:ascii="Arial" w:hAnsi="Arial" w:cs="Arial"/>
+          <w:sz w:val="22"/>
+          <w:lang w:val="en-GB" w:eastAsia="en-GB"/>
+        </w:rPr>
+        <w:t>GameStateManager</w:t>
+      </w:r>
+      <w:proofErr w:type="spellEnd"/>
+      <w:r>
+        <w:rPr>
+          <w:rFonts w:ascii="Arial" w:hAnsi="Arial" w:cs="Arial"/>
+          <w:sz w:val="22"/>
+          <w:lang w:val="en-GB" w:eastAsia="en-GB"/>
+        </w:rPr>
+        <w:t xml:space="preserve"> pushdown automaton correctly handles all required state transitions. The stack model allows the Settings menu to be pushed from both the main menu and the pause menu, and pop returns to the correct prior state in each case. This would not be possible with a simple state variable.</w:t>
+      </w:r>
+    </w:p>
+    <w:p>
+      <w:pPr>
+        <w:spacing w:after="140" w:line="240" w:lineRule="auto"/>
+        <w:rPr>
+          <w:rFonts w:ascii="Arial" w:hAnsi="Arial" w:cs="Arial"/>
+          <w:sz w:val="22"/>
+          <w:lang w:val="en-GB" w:eastAsia="en-GB"/>
+        </w:rPr>
+      </w:pPr>
+      <w:r>
+        <w:rPr>
+          <w:rFonts w:ascii="Arial" w:hAnsi="Arial" w:cs="Arial"/>
+          <w:sz w:val="22"/>
+          <w:lang w:val="en-GB" w:eastAsia="en-GB"/>
+        </w:rPr>
+        <w:t xml:space="preserve">The </w:t>
+      </w:r>
+      <w:proofErr w:type="spellStart"/>
+      <w:r>
+        <w:rPr>
+          <w:rFonts w:ascii="Arial" w:hAnsi="Arial" w:cs="Arial"/>
+          <w:sz w:val="22"/>
+          <w:lang w:val="en-GB" w:eastAsia="en-GB"/>
+        </w:rPr>
+        <w:t>InputController</w:t>
+      </w:r>
+      <w:proofErr w:type="spellEnd"/>
+      <w:r>
+        <w:rPr>
+          <w:rFonts w:ascii="Arial" w:hAnsi="Arial" w:cs="Arial"/>
+          <w:sz w:val="22"/>
+          <w:lang w:val="en-GB" w:eastAsia="en-GB"/>
+        </w:rPr>
+        <w:t xml:space="preserve"> correctly abstracts the difference between keyboard and gamepad at the call site</w:t>
+      </w:r>
+      <w:r>
+        <w:rPr>
+          <w:rFonts w:ascii="Arial" w:hAnsi="Arial" w:cs="Arial"/>
+          <w:sz w:val="22"/>
+          <w:lang w:val="en-GB" w:eastAsia="en-GB"/>
+        </w:rPr>
+        <w:t>,</w:t>
+      </w:r>
+      <w:r>
+        <w:rPr>
+          <w:rFonts w:ascii="Arial" w:hAnsi="Arial" w:cs="Arial"/>
+          <w:sz w:val="22"/>
+          <w:lang w:val="en-GB" w:eastAsia="en-GB"/>
+        </w:rPr>
+        <w:t xml:space="preserve"> game logic queries </w:t>
+      </w:r>
+      <w:proofErr w:type="spellStart"/>
+      <w:proofErr w:type="gramStart"/>
+      <w:r>
+        <w:rPr>
+          <w:rFonts w:ascii="Arial" w:hAnsi="Arial" w:cs="Arial"/>
+          <w:sz w:val="22"/>
+          <w:lang w:val="en-GB" w:eastAsia="en-GB"/>
+        </w:rPr>
+        <w:t>InputAction</w:t>
+      </w:r>
+      <w:proofErr w:type="spellEnd"/>
+      <w:r>
+        <w:rPr>
+          <w:rFonts w:ascii="Arial" w:hAnsi="Arial" w:cs="Arial"/>
+          <w:sz w:val="22"/>
+          <w:lang w:val="en-GB" w:eastAsia="en-GB"/>
+        </w:rPr>
+        <w:t>::</w:t>
+      </w:r>
+      <w:proofErr w:type="gramEnd"/>
+      <w:r>
+        <w:rPr>
+          <w:rFonts w:ascii="Arial" w:hAnsi="Arial" w:cs="Arial"/>
+          <w:sz w:val="22"/>
+          <w:lang w:val="en-GB" w:eastAsia="en-GB"/>
+        </w:rPr>
+        <w:t xml:space="preserve">Sprint, not </w:t>
+      </w:r>
+      <w:proofErr w:type="gramStart"/>
+      <w:r>
+        <w:rPr>
+          <w:rFonts w:ascii="Arial" w:hAnsi="Arial" w:cs="Arial"/>
+          <w:sz w:val="22"/>
+          <w:lang w:val="en-GB" w:eastAsia="en-GB"/>
+        </w:rPr>
+        <w:t>sf::Keyboard::Key::</w:t>
+      </w:r>
+      <w:proofErr w:type="spellStart"/>
+      <w:proofErr w:type="gramEnd"/>
+      <w:r>
+        <w:rPr>
+          <w:rFonts w:ascii="Arial" w:hAnsi="Arial" w:cs="Arial"/>
+          <w:sz w:val="22"/>
+          <w:lang w:val="en-GB" w:eastAsia="en-GB"/>
+        </w:rPr>
+        <w:t>LShift</w:t>
+      </w:r>
+      <w:proofErr w:type="spellEnd"/>
+      <w:r>
+        <w:rPr>
+          <w:rFonts w:ascii="Arial" w:hAnsi="Arial" w:cs="Arial"/>
+          <w:sz w:val="22"/>
+          <w:lang w:val="en-GB" w:eastAsia="en-GB"/>
+        </w:rPr>
+        <w:t xml:space="preserve">. Runtime rebinding is functional via the </w:t>
+      </w:r>
+      <w:proofErr w:type="spellStart"/>
+      <w:r>
+        <w:rPr>
+          <w:rFonts w:ascii="Arial" w:hAnsi="Arial" w:cs="Arial"/>
+          <w:sz w:val="22"/>
+          <w:lang w:val="en-GB" w:eastAsia="en-GB"/>
+        </w:rPr>
+        <w:t>SettingsMenu</w:t>
+      </w:r>
+      <w:proofErr w:type="spellEnd"/>
+      <w:r>
+        <w:rPr>
+          <w:rFonts w:ascii="Arial" w:hAnsi="Arial" w:cs="Arial"/>
+          <w:sz w:val="22"/>
+          <w:lang w:val="en-GB" w:eastAsia="en-GB"/>
+        </w:rPr>
+        <w:t xml:space="preserve">. The </w:t>
+      </w:r>
+      <w:proofErr w:type="spellStart"/>
+      <w:r>
+        <w:rPr>
+          <w:rFonts w:ascii="Arial" w:hAnsi="Arial" w:cs="Arial"/>
+          <w:sz w:val="22"/>
+          <w:lang w:val="en-GB" w:eastAsia="en-GB"/>
+        </w:rPr>
+        <w:t>wasJustPressed</w:t>
+      </w:r>
+      <w:proofErr w:type="spellEnd"/>
+      <w:r>
+        <w:rPr>
+          <w:rFonts w:ascii="Arial" w:hAnsi="Arial" w:cs="Arial"/>
+          <w:sz w:val="22"/>
+          <w:lang w:val="en-GB" w:eastAsia="en-GB"/>
+        </w:rPr>
+        <w:t xml:space="preserve"> / </w:t>
+      </w:r>
+      <w:proofErr w:type="spellStart"/>
+      <w:r>
+        <w:rPr>
+          <w:rFonts w:ascii="Arial" w:hAnsi="Arial" w:cs="Arial"/>
+          <w:sz w:val="22"/>
+          <w:lang w:val="en-GB" w:eastAsia="en-GB"/>
+        </w:rPr>
+        <w:t>wasJustReleased</w:t>
+      </w:r>
+      <w:proofErr w:type="spellEnd"/>
+      <w:r>
+        <w:rPr>
+          <w:rFonts w:ascii="Arial" w:hAnsi="Arial" w:cs="Arial"/>
+          <w:sz w:val="22"/>
+          <w:lang w:val="en-GB" w:eastAsia="en-GB"/>
+        </w:rPr>
+        <w:t xml:space="preserve"> distinction correctly handles single-frame events such as inventory toggle.</w:t>
+      </w:r>
+    </w:p>
+    <w:p>
+      <w:pPr>
+        <w:spacing w:after="140" w:line="240" w:lineRule="auto"/>
+        <w:rPr>
+          <w:rFonts w:ascii="Arial" w:hAnsi="Arial" w:cs="Arial"/>
+          <w:sz w:val="22"/>
+          <w:lang w:val="en-GB" w:eastAsia="en-GB"/>
+        </w:rPr>
+      </w:pPr>
+    </w:p>
+    <w:p>
+      <w:pPr>
+        <w:spacing w:after="140" w:line="240" w:lineRule="auto"/>
+        <w:rPr>
+          <w:rFonts w:ascii="Arial" w:hAnsi="Arial" w:cs="Arial"/>
+          <w:sz w:val="22"/>
+          <w:lang w:val="en-GB" w:eastAsia="en-GB"/>
+        </w:rPr>
+      </w:pPr>
+    </w:p>
+    <w:p>
+      <w:pPr>
+        <w:spacing w:after="140" w:line="240" w:lineRule="auto"/>
+        <w:rPr>
+          <w:rFonts w:ascii="Arial" w:hAnsi="Arial" w:cs="Arial"/>
+          <w:sz w:val="22"/>
+          <w:lang w:val="en-GB" w:eastAsia="en-GB"/>
+        </w:rPr>
+      </w:pPr>
+    </w:p>
+    <w:p>
+      <w:pPr>
+        <w:spacing w:before="240" w:after="120" w:line="240" w:lineRule="auto"/>
+        <w:outlineLvl w:val="1"/>
+        <w:rPr>
+          <w:rFonts w:ascii="Arial" w:hAnsi="Arial" w:cs="Arial"/>
+          <w:b/>
+          <w:bCs/>
+          <w:color w:val="1F4E79"/>
+          <w:sz w:val="28"/>
+          <w:szCs w:val="28"/>
+          <w:lang w:val="en-GB" w:eastAsia="en-GB"/>
+        </w:rPr>
+      </w:pPr>
+      <w:bookmarkStart w:id="10" w:name="_Toc226415494"/>
+      <w:r>
+        <w:rPr>
+          <w:rFonts w:ascii="Arial" w:hAnsi="Arial" w:cs="Arial"/>
+          <w:b/>
+          <w:bCs/>
+          <w:color w:val="1F4E79"/>
+          <w:sz w:val="28"/>
+          <w:szCs w:val="28"/>
+          <w:lang w:val="en-GB" w:eastAsia="en-GB"/>
+        </w:rPr>
+        <w:lastRenderedPageBreak/>
+        <w:t>Procedural Generation Results</w:t>
+      </w:r>
+      <w:bookmarkEnd w:id="10"/>
+    </w:p>
+    <w:p>
+      <w:pPr>
+        <w:spacing w:after="140" w:line="240" w:lineRule="auto"/>
+        <w:rPr>
+          <w:rFonts w:ascii="Arial" w:hAnsi="Arial" w:cs="Arial"/>
+          <w:sz w:val="22"/>
+          <w:lang w:val="en-GB" w:eastAsia="en-GB"/>
+        </w:rPr>
+      </w:pPr>
+      <w:r>
+        <w:rPr>
+          <w:rFonts w:ascii="Arial" w:hAnsi="Arial" w:cs="Arial"/>
+          <w:sz w:val="22"/>
+          <w:lang w:val="en-GB" w:eastAsia="en-GB"/>
+        </w:rPr>
+        <w:t>The Voronoi + Poisson disk implementation produces well-distributed map regions with POIs spaced appropriately across the world. The auto-derived minimum site distance (based on map area / site count) reliably prevents site clustering while allowing the Poisson algorithm to fill the space.</w:t>
+      </w:r>
+    </w:p>
+    <w:p>
+      <w:pPr>
+        <w:spacing w:after="140" w:line="240" w:lineRule="auto"/>
+        <w:rPr>
+          <w:rFonts w:ascii="Arial" w:hAnsi="Arial" w:cs="Arial"/>
+          <w:sz w:val="22"/>
+          <w:lang w:val="en-GB" w:eastAsia="en-GB"/>
+        </w:rPr>
+      </w:pPr>
+      <w:r>
+        <w:rPr>
+          <w:rFonts w:ascii="Arial" w:hAnsi="Arial" w:cs="Arial"/>
+          <w:sz w:val="22"/>
+          <w:lang w:val="en-GB" w:eastAsia="en-GB"/>
+        </w:rPr>
+        <w:t>Benchmark results confirm the impact of the Spatial Partition optimisation:</w:t>
+      </w:r>
+    </w:p>
+    <w:tbl>
+      <w:tblPr>
+        <w:tblW w:w="9026" w:type="dxa"/>
+        <w:tblBorders>
+          <w:top w:val="single" w:sz="4" w:space="0" w:color="auto"/>
+          <w:left w:val="single" w:sz="4" w:space="0" w:color="auto"/>
+          <w:bottom w:val="single" w:sz="4" w:space="0" w:color="auto"/>
+          <w:right w:val="single" w:sz="4" w:space="0" w:color="auto"/>
+          <w:insideH w:val="single" w:sz="4" w:space="0" w:color="auto"/>
+          <w:insideV w:val="single" w:sz="4" w:space="0" w:color="auto"/>
+        </w:tblBorders>
+        <w:tblCellMar>
+          <w:left w:w="10" w:type="dxa"/>
+          <w:right w:w="10" w:type="dxa"/>
+        </w:tblCellMar>
+        <w:tblLook w:val="0000" w:firstRow="0" w:lastRow="0" w:firstColumn="0" w:lastColumn="0" w:noHBand="0" w:noVBand="0"/>
+      </w:tblPr>
+      <w:tblGrid>
+        <w:gridCol w:w="3500"/>
+        <w:gridCol w:w="2000"/>
+        <w:gridCol w:w="2000"/>
+        <w:gridCol w:w="1526"/>
+      </w:tblGrid>
+      <w:tr>
+        <w:tblPrEx>
+          <w:tblCellMar>
+            <w:top w:w="0" w:type="dxa"/>
+            <w:bottom w:w="0" w:type="dxa"/>
+          </w:tblCellMar>
+        </w:tblPrEx>
+        <w:tc>
+          <w:tcPr>
+            <w:tcW w:w="3500" w:type="dxa"/>
+            <w:tcBorders>
+              <w:top w:val="single" w:sz="1" w:space="0" w:color="CCCCCC"/>
+              <w:left w:val="single" w:sz="1" w:space="0" w:color="CCCCCC"/>
+              <w:bottom w:val="single" w:sz="1" w:space="0" w:color="CCCCCC"/>
+              <w:right w:val="single" w:sz="1" w:space="0" w:color="CCCCCC"/>
+            </w:tcBorders>
+            <w:shd w:val="clear" w:color="auto" w:fill="2E75B6"/>
+            <w:tcMar>
+              <w:top w:w="80" w:type="dxa"/>
+              <w:left w:w="120" w:type="dxa"/>
+              <w:bottom w:w="80" w:type="dxa"/>
+              <w:right w:w="120" w:type="dxa"/>
+            </w:tcMar>
+          </w:tcPr>
+          <w:p>
+            <w:pPr>
+              <w:spacing w:after="0" w:line="240" w:lineRule="auto"/>
+              <w:rPr>
+                <w:rFonts w:ascii="Arial" w:hAnsi="Arial" w:cs="Arial"/>
+                <w:sz w:val="22"/>
+                <w:lang w:val="en-GB" w:eastAsia="en-GB"/>
+              </w:rPr>
+            </w:pPr>
+            <w:r>
+              <w:rPr>
+                <w:rFonts w:ascii="Arial" w:hAnsi="Arial" w:cs="Arial"/>
+                <w:b/>
+                <w:bCs/>
+                <w:color w:val="FFFFFF"/>
+                <w:sz w:val="20"/>
+                <w:szCs w:val="20"/>
+                <w:lang w:val="en-GB" w:eastAsia="en-GB"/>
+              </w:rPr>
+              <w:t>Implementation</w:t>
+            </w:r>
+          </w:p>
+        </w:tc>
+        <w:tc>
+          <w:tcPr>
+            <w:tcW w:w="2000" w:type="dxa"/>
+            <w:tcBorders>
+              <w:top w:val="single" w:sz="1" w:space="0" w:color="CCCCCC"/>
+              <w:left w:val="single" w:sz="1" w:space="0" w:color="CCCCCC"/>
+              <w:bottom w:val="single" w:sz="1" w:space="0" w:color="CCCCCC"/>
+              <w:right w:val="single" w:sz="1" w:space="0" w:color="CCCCCC"/>
+            </w:tcBorders>
+            <w:shd w:val="clear" w:color="auto" w:fill="2E75B6"/>
+            <w:tcMar>
+              <w:top w:w="80" w:type="dxa"/>
+              <w:left w:w="120" w:type="dxa"/>
+              <w:bottom w:w="80" w:type="dxa"/>
+              <w:right w:w="120" w:type="dxa"/>
+            </w:tcMar>
+          </w:tcPr>
+          <w:p>
+            <w:pPr>
+              <w:spacing w:after="0" w:line="240" w:lineRule="auto"/>
+              <w:rPr>
+                <w:rFonts w:ascii="Arial" w:hAnsi="Arial" w:cs="Arial"/>
+                <w:sz w:val="22"/>
+                <w:lang w:val="en-GB" w:eastAsia="en-GB"/>
+              </w:rPr>
+            </w:pPr>
+            <w:r>
+              <w:rPr>
+                <w:rFonts w:ascii="Arial" w:hAnsi="Arial" w:cs="Arial"/>
+                <w:b/>
+                <w:bCs/>
+                <w:color w:val="FFFFFF"/>
+                <w:sz w:val="20"/>
+                <w:szCs w:val="20"/>
+                <w:lang w:val="en-GB" w:eastAsia="en-GB"/>
+              </w:rPr>
+              <w:t>Map Size</w:t>
+            </w:r>
+          </w:p>
+        </w:tc>
+        <w:tc>
+          <w:tcPr>
+            <w:tcW w:w="2000" w:type="dxa"/>
+            <w:tcBorders>
+              <w:top w:val="single" w:sz="1" w:space="0" w:color="CCCCCC"/>
+              <w:left w:val="single" w:sz="1" w:space="0" w:color="CCCCCC"/>
+              <w:bottom w:val="single" w:sz="1" w:space="0" w:color="CCCCCC"/>
+              <w:right w:val="single" w:sz="1" w:space="0" w:color="CCCCCC"/>
+            </w:tcBorders>
+            <w:shd w:val="clear" w:color="auto" w:fill="2E75B6"/>
+            <w:tcMar>
+              <w:top w:w="80" w:type="dxa"/>
+              <w:left w:w="120" w:type="dxa"/>
+              <w:bottom w:w="80" w:type="dxa"/>
+              <w:right w:w="120" w:type="dxa"/>
+            </w:tcMar>
+          </w:tcPr>
+          <w:p>
+            <w:pPr>
+              <w:spacing w:after="0" w:line="240" w:lineRule="auto"/>
+              <w:rPr>
+                <w:rFonts w:ascii="Arial" w:hAnsi="Arial" w:cs="Arial"/>
+                <w:sz w:val="22"/>
+                <w:lang w:val="en-GB" w:eastAsia="en-GB"/>
+              </w:rPr>
+            </w:pPr>
+            <w:r>
+              <w:rPr>
+                <w:rFonts w:ascii="Arial" w:hAnsi="Arial" w:cs="Arial"/>
+                <w:b/>
+                <w:bCs/>
+                <w:color w:val="FFFFFF"/>
+                <w:sz w:val="20"/>
+                <w:szCs w:val="20"/>
+                <w:lang w:val="en-GB" w:eastAsia="en-GB"/>
+              </w:rPr>
+              <w:t>Total Generation</w:t>
+            </w:r>
+          </w:p>
+        </w:tc>
+        <w:tc>
+          <w:tcPr>
+            <w:tcW w:w="1526" w:type="dxa"/>
+            <w:tcBorders>
+              <w:top w:val="single" w:sz="1" w:space="0" w:color="CCCCCC"/>
+              <w:left w:val="single" w:sz="1" w:space="0" w:color="CCCCCC"/>
+              <w:bottom w:val="single" w:sz="1" w:space="0" w:color="CCCCCC"/>
+              <w:right w:val="single" w:sz="1" w:space="0" w:color="CCCCCC"/>
+            </w:tcBorders>
+            <w:shd w:val="clear" w:color="auto" w:fill="2E75B6"/>
+            <w:tcMar>
+              <w:top w:w="80" w:type="dxa"/>
+              <w:left w:w="120" w:type="dxa"/>
+              <w:bottom w:w="80" w:type="dxa"/>
+              <w:right w:w="120" w:type="dxa"/>
+            </w:tcMar>
+          </w:tcPr>
+          <w:p>
+            <w:pPr>
+              <w:spacing w:after="0" w:line="240" w:lineRule="auto"/>
+              <w:rPr>
+                <w:rFonts w:ascii="Arial" w:hAnsi="Arial" w:cs="Arial"/>
+                <w:sz w:val="22"/>
+                <w:lang w:val="en-GB" w:eastAsia="en-GB"/>
+              </w:rPr>
+            </w:pPr>
+            <w:r>
+              <w:rPr>
+                <w:rFonts w:ascii="Arial" w:hAnsi="Arial" w:cs="Arial"/>
+                <w:b/>
+                <w:bCs/>
+                <w:color w:val="FFFFFF"/>
+                <w:sz w:val="20"/>
+                <w:szCs w:val="20"/>
+                <w:lang w:val="en-GB" w:eastAsia="en-GB"/>
+              </w:rPr>
+              <w:t>Method</w:t>
+            </w:r>
+          </w:p>
+        </w:tc>
+      </w:tr>
+      <w:tr>
+        <w:tblPrEx>
+          <w:tblCellMar>
+            <w:top w:w="0" w:type="dxa"/>
+            <w:bottom w:w="0" w:type="dxa"/>
+          </w:tblCellMar>
+        </w:tblPrEx>
+        <w:tc>
+          <w:tcPr>
+            <w:tcW w:w="3500" w:type="dxa"/>
+            <w:tcBorders>
+              <w:top w:val="single" w:sz="1" w:space="0" w:color="CCCCCC"/>
+              <w:left w:val="single" w:sz="1" w:space="0" w:color="CCCCCC"/>
+              <w:bottom w:val="single" w:sz="1" w:space="0" w:color="CCCCCC"/>
+              <w:right w:val="single" w:sz="1" w:space="0" w:color="CCCCCC"/>
+            </w:tcBorders>
+            <w:tcMar>
+              <w:top w:w="80" w:type="dxa"/>
+              <w:left w:w="120" w:type="dxa"/>
+              <w:bottom w:w="80" w:type="dxa"/>
+              <w:right w:w="120" w:type="dxa"/>
+            </w:tcMar>
+          </w:tcPr>
+          <w:p>
+            <w:pPr>
+              <w:spacing w:after="0" w:line="240" w:lineRule="auto"/>
+              <w:rPr>
+                <w:rFonts w:ascii="Arial" w:hAnsi="Arial" w:cs="Arial"/>
+                <w:sz w:val="22"/>
+                <w:lang w:val="en-GB" w:eastAsia="en-GB"/>
+              </w:rPr>
+            </w:pPr>
+            <w:r>
+              <w:rPr>
+                <w:rFonts w:ascii="Arial" w:hAnsi="Arial" w:cs="Arial"/>
+                <w:sz w:val="20"/>
+                <w:szCs w:val="20"/>
+                <w:lang w:val="en-GB" w:eastAsia="en-GB"/>
+              </w:rPr>
+              <w:t>Rejection sampling (baseline)</w:t>
+            </w:r>
+          </w:p>
+        </w:tc>
+        <w:tc>
+          <w:tcPr>
+            <w:tcW w:w="2000" w:type="dxa"/>
+            <w:tcBorders>
+              <w:top w:val="single" w:sz="1" w:space="0" w:color="CCCCCC"/>
+              <w:left w:val="single" w:sz="1" w:space="0" w:color="CCCCCC"/>
+              <w:bottom w:val="single" w:sz="1" w:space="0" w:color="CCCCCC"/>
+              <w:right w:val="single" w:sz="1" w:space="0" w:color="CCCCCC"/>
+            </w:tcBorders>
+            <w:tcMar>
+              <w:top w:w="80" w:type="dxa"/>
+              <w:left w:w="120" w:type="dxa"/>
+              <w:bottom w:w="80" w:type="dxa"/>
+              <w:right w:w="120" w:type="dxa"/>
+            </w:tcMar>
+          </w:tcPr>
+          <w:p>
+            <w:pPr>
+              <w:spacing w:after="0" w:line="240" w:lineRule="auto"/>
+              <w:rPr>
+                <w:rFonts w:ascii="Arial" w:hAnsi="Arial" w:cs="Arial"/>
+                <w:sz w:val="22"/>
+                <w:lang w:val="en-GB" w:eastAsia="en-GB"/>
+              </w:rPr>
+            </w:pPr>
+            <w:r>
+              <w:rPr>
+                <w:rFonts w:ascii="Arial" w:hAnsi="Arial" w:cs="Arial"/>
+                <w:sz w:val="20"/>
+                <w:szCs w:val="20"/>
+                <w:lang w:val="en-GB" w:eastAsia="en-GB"/>
+              </w:rPr>
+              <w:t>80x80</w:t>
+            </w:r>
+          </w:p>
+        </w:tc>
+        <w:tc>
+          <w:tcPr>
+            <w:tcW w:w="2000" w:type="dxa"/>
+            <w:tcBorders>
+              <w:top w:val="single" w:sz="1" w:space="0" w:color="CCCCCC"/>
+              <w:left w:val="single" w:sz="1" w:space="0" w:color="CCCCCC"/>
+              <w:bottom w:val="single" w:sz="1" w:space="0" w:color="CCCCCC"/>
+              <w:right w:val="single" w:sz="1" w:space="0" w:color="CCCCCC"/>
+            </w:tcBorders>
+            <w:tcMar>
+              <w:top w:w="80" w:type="dxa"/>
+              <w:left w:w="120" w:type="dxa"/>
+              <w:bottom w:w="80" w:type="dxa"/>
+              <w:right w:w="120" w:type="dxa"/>
+            </w:tcMar>
+          </w:tcPr>
+          <w:p>
+            <w:pPr>
+              <w:spacing w:after="0" w:line="240" w:lineRule="auto"/>
+              <w:rPr>
+                <w:rFonts w:ascii="Arial" w:hAnsi="Arial" w:cs="Arial"/>
+                <w:sz w:val="22"/>
+                <w:lang w:val="en-GB" w:eastAsia="en-GB"/>
+              </w:rPr>
+            </w:pPr>
+            <w:r>
+              <w:rPr>
+                <w:rFonts w:ascii="Arial" w:hAnsi="Arial" w:cs="Arial"/>
+                <w:sz w:val="20"/>
+                <w:szCs w:val="20"/>
+                <w:lang w:val="en-GB" w:eastAsia="en-GB"/>
+              </w:rPr>
+              <w:t>84.2ms</w:t>
+            </w:r>
+          </w:p>
+        </w:tc>
+        <w:tc>
+          <w:tcPr>
+            <w:tcW w:w="1526" w:type="dxa"/>
+            <w:tcBorders>
+              <w:top w:val="single" w:sz="1" w:space="0" w:color="CCCCCC"/>
+              <w:left w:val="single" w:sz="1" w:space="0" w:color="CCCCCC"/>
+              <w:bottom w:val="single" w:sz="1" w:space="0" w:color="CCCCCC"/>
+              <w:right w:val="single" w:sz="1" w:space="0" w:color="CCCCCC"/>
+            </w:tcBorders>
+            <w:tcMar>
+              <w:top w:w="80" w:type="dxa"/>
+              <w:left w:w="120" w:type="dxa"/>
+              <w:bottom w:w="80" w:type="dxa"/>
+              <w:right w:w="120" w:type="dxa"/>
+            </w:tcMar>
+          </w:tcPr>
+          <w:p>
+            <w:pPr>
+              <w:spacing w:after="0" w:line="240" w:lineRule="auto"/>
+              <w:rPr>
+                <w:rFonts w:ascii="Arial" w:hAnsi="Arial" w:cs="Arial"/>
+                <w:sz w:val="22"/>
+                <w:lang w:val="en-GB" w:eastAsia="en-GB"/>
+              </w:rPr>
+            </w:pPr>
+            <w:r>
+              <w:rPr>
+                <w:rFonts w:ascii="Arial" w:hAnsi="Arial" w:cs="Arial"/>
+                <w:sz w:val="20"/>
+                <w:szCs w:val="20"/>
+                <w:lang w:val="en-GB" w:eastAsia="en-GB"/>
+              </w:rPr>
+              <w:t>O(n) per site</w:t>
+            </w:r>
+          </w:p>
+        </w:tc>
+      </w:tr>
+      <w:tr>
+        <w:tblPrEx>
+          <w:tblCellMar>
+            <w:top w:w="0" w:type="dxa"/>
+            <w:bottom w:w="0" w:type="dxa"/>
+          </w:tblCellMar>
+        </w:tblPrEx>
+        <w:tc>
+          <w:tcPr>
+            <w:tcW w:w="3500" w:type="dxa"/>
+            <w:tcBorders>
+              <w:top w:val="single" w:sz="1" w:space="0" w:color="CCCCCC"/>
+              <w:left w:val="single" w:sz="1" w:space="0" w:color="CCCCCC"/>
+              <w:bottom w:val="single" w:sz="1" w:space="0" w:color="CCCCCC"/>
+              <w:right w:val="single" w:sz="1" w:space="0" w:color="CCCCCC"/>
+            </w:tcBorders>
+            <w:shd w:val="clear" w:color="auto" w:fill="EBF3FB"/>
+            <w:tcMar>
+              <w:top w:w="80" w:type="dxa"/>
+              <w:left w:w="120" w:type="dxa"/>
+              <w:bottom w:w="80" w:type="dxa"/>
+              <w:right w:w="120" w:type="dxa"/>
+            </w:tcMar>
+          </w:tcPr>
+          <w:p>
+            <w:pPr>
+              <w:spacing w:after="0" w:line="240" w:lineRule="auto"/>
+              <w:rPr>
+                <w:rFonts w:ascii="Arial" w:hAnsi="Arial" w:cs="Arial"/>
+                <w:sz w:val="22"/>
+                <w:lang w:val="en-GB" w:eastAsia="en-GB"/>
+              </w:rPr>
+            </w:pPr>
+            <w:r>
+              <w:rPr>
+                <w:rFonts w:ascii="Arial" w:hAnsi="Arial" w:cs="Arial"/>
+                <w:sz w:val="20"/>
+                <w:szCs w:val="20"/>
+                <w:lang w:val="en-GB" w:eastAsia="en-GB"/>
+              </w:rPr>
+              <w:t>Poisson + Spatial Grid (optimised)</w:t>
+            </w:r>
+          </w:p>
+        </w:tc>
+        <w:tc>
+          <w:tcPr>
+            <w:tcW w:w="2000" w:type="dxa"/>
+            <w:tcBorders>
+              <w:top w:val="single" w:sz="1" w:space="0" w:color="CCCCCC"/>
+              <w:left w:val="single" w:sz="1" w:space="0" w:color="CCCCCC"/>
+              <w:bottom w:val="single" w:sz="1" w:space="0" w:color="CCCCCC"/>
+              <w:right w:val="single" w:sz="1" w:space="0" w:color="CCCCCC"/>
+            </w:tcBorders>
+            <w:shd w:val="clear" w:color="auto" w:fill="EBF3FB"/>
+            <w:tcMar>
+              <w:top w:w="80" w:type="dxa"/>
+              <w:left w:w="120" w:type="dxa"/>
+              <w:bottom w:w="80" w:type="dxa"/>
+              <w:right w:w="120" w:type="dxa"/>
+            </w:tcMar>
+          </w:tcPr>
+          <w:p>
+            <w:pPr>
+              <w:spacing w:after="0" w:line="240" w:lineRule="auto"/>
+              <w:rPr>
+                <w:rFonts w:ascii="Arial" w:hAnsi="Arial" w:cs="Arial"/>
+                <w:sz w:val="22"/>
+                <w:lang w:val="en-GB" w:eastAsia="en-GB"/>
+              </w:rPr>
+            </w:pPr>
+            <w:r>
+              <w:rPr>
+                <w:rFonts w:ascii="Arial" w:hAnsi="Arial" w:cs="Arial"/>
+                <w:sz w:val="20"/>
+                <w:szCs w:val="20"/>
+                <w:lang w:val="en-GB" w:eastAsia="en-GB"/>
+              </w:rPr>
+              <w:t>80x80</w:t>
+            </w:r>
+          </w:p>
+        </w:tc>
+        <w:tc>
+          <w:tcPr>
+            <w:tcW w:w="2000" w:type="dxa"/>
+            <w:tcBorders>
+              <w:top w:val="single" w:sz="1" w:space="0" w:color="CCCCCC"/>
+              <w:left w:val="single" w:sz="1" w:space="0" w:color="CCCCCC"/>
+              <w:bottom w:val="single" w:sz="1" w:space="0" w:color="CCCCCC"/>
+              <w:right w:val="single" w:sz="1" w:space="0" w:color="CCCCCC"/>
+            </w:tcBorders>
+            <w:shd w:val="clear" w:color="auto" w:fill="EBF3FB"/>
+            <w:tcMar>
+              <w:top w:w="80" w:type="dxa"/>
+              <w:left w:w="120" w:type="dxa"/>
+              <w:bottom w:w="80" w:type="dxa"/>
+              <w:right w:w="120" w:type="dxa"/>
+            </w:tcMar>
+          </w:tcPr>
+          <w:p>
+            <w:pPr>
+              <w:spacing w:after="0" w:line="240" w:lineRule="auto"/>
+              <w:rPr>
+                <w:rFonts w:ascii="Arial" w:hAnsi="Arial" w:cs="Arial"/>
+                <w:sz w:val="22"/>
+                <w:lang w:val="en-GB" w:eastAsia="en-GB"/>
+              </w:rPr>
+            </w:pPr>
+            <w:r>
+              <w:rPr>
+                <w:rFonts w:ascii="Arial" w:hAnsi="Arial" w:cs="Arial"/>
+                <w:b/>
+                <w:bCs/>
+                <w:sz w:val="20"/>
+                <w:szCs w:val="20"/>
+                <w:lang w:val="en-GB" w:eastAsia="en-GB"/>
+              </w:rPr>
+              <w:t>11ms</w:t>
+            </w:r>
+          </w:p>
+        </w:tc>
+        <w:tc>
+          <w:tcPr>
+            <w:tcW w:w="1526" w:type="dxa"/>
+            <w:tcBorders>
+              <w:top w:val="single" w:sz="1" w:space="0" w:color="CCCCCC"/>
+              <w:left w:val="single" w:sz="1" w:space="0" w:color="CCCCCC"/>
+              <w:bottom w:val="single" w:sz="1" w:space="0" w:color="CCCCCC"/>
+              <w:right w:val="single" w:sz="1" w:space="0" w:color="CCCCCC"/>
+            </w:tcBorders>
+            <w:shd w:val="clear" w:color="auto" w:fill="EBF3FB"/>
+            <w:tcMar>
+              <w:top w:w="80" w:type="dxa"/>
+              <w:left w:w="120" w:type="dxa"/>
+              <w:bottom w:w="80" w:type="dxa"/>
+              <w:right w:w="120" w:type="dxa"/>
+            </w:tcMar>
+          </w:tcPr>
+          <w:p>
+            <w:pPr>
+              <w:spacing w:after="0" w:line="240" w:lineRule="auto"/>
+              <w:rPr>
+                <w:rFonts w:ascii="Arial" w:hAnsi="Arial" w:cs="Arial"/>
+                <w:sz w:val="22"/>
+                <w:lang w:val="en-GB" w:eastAsia="en-GB"/>
+              </w:rPr>
+            </w:pPr>
+            <w:proofErr w:type="gramStart"/>
+            <w:r>
+              <w:rPr>
+                <w:rFonts w:ascii="Arial" w:hAnsi="Arial" w:cs="Arial"/>
+                <w:sz w:val="20"/>
+                <w:szCs w:val="20"/>
+                <w:lang w:val="en-GB" w:eastAsia="en-GB"/>
+              </w:rPr>
+              <w:t>O(</w:t>
+            </w:r>
+            <w:proofErr w:type="gramEnd"/>
+            <w:r>
+              <w:rPr>
+                <w:rFonts w:ascii="Arial" w:hAnsi="Arial" w:cs="Arial"/>
+                <w:sz w:val="20"/>
+                <w:szCs w:val="20"/>
+                <w:lang w:val="en-GB" w:eastAsia="en-GB"/>
+              </w:rPr>
+              <w:t>1) per site</w:t>
+            </w:r>
+          </w:p>
+        </w:tc>
+      </w:tr>
+      <w:tr>
+        <w:tblPrEx>
+          <w:tblCellMar>
+            <w:top w:w="0" w:type="dxa"/>
+            <w:bottom w:w="0" w:type="dxa"/>
+          </w:tblCellMar>
+        </w:tblPrEx>
+        <w:tc>
+          <w:tcPr>
+            <w:tcW w:w="3500" w:type="dxa"/>
+            <w:tcBorders>
+              <w:top w:val="single" w:sz="1" w:space="0" w:color="CCCCCC"/>
+              <w:left w:val="single" w:sz="1" w:space="0" w:color="CCCCCC"/>
+              <w:bottom w:val="single" w:sz="1" w:space="0" w:color="CCCCCC"/>
+              <w:right w:val="single" w:sz="1" w:space="0" w:color="CCCCCC"/>
+            </w:tcBorders>
+            <w:tcMar>
+              <w:top w:w="80" w:type="dxa"/>
+              <w:left w:w="120" w:type="dxa"/>
+              <w:bottom w:w="80" w:type="dxa"/>
+              <w:right w:w="120" w:type="dxa"/>
+            </w:tcMar>
+          </w:tcPr>
+          <w:p>
+            <w:pPr>
+              <w:spacing w:after="0" w:line="240" w:lineRule="auto"/>
+              <w:rPr>
+                <w:rFonts w:ascii="Arial" w:hAnsi="Arial" w:cs="Arial"/>
+                <w:sz w:val="22"/>
+                <w:lang w:val="en-GB" w:eastAsia="en-GB"/>
+              </w:rPr>
+            </w:pPr>
+            <w:r>
+              <w:rPr>
+                <w:rFonts w:ascii="Arial" w:hAnsi="Arial" w:cs="Arial"/>
+                <w:sz w:val="20"/>
+                <w:szCs w:val="20"/>
+                <w:lang w:val="en-GB" w:eastAsia="en-GB"/>
+              </w:rPr>
+              <w:t>Runtime regeneration</w:t>
+            </w:r>
+          </w:p>
+        </w:tc>
+        <w:tc>
+          <w:tcPr>
+            <w:tcW w:w="2000" w:type="dxa"/>
+            <w:tcBorders>
+              <w:top w:val="single" w:sz="1" w:space="0" w:color="CCCCCC"/>
+              <w:left w:val="single" w:sz="1" w:space="0" w:color="CCCCCC"/>
+              <w:bottom w:val="single" w:sz="1" w:space="0" w:color="CCCCCC"/>
+              <w:right w:val="single" w:sz="1" w:space="0" w:color="CCCCCC"/>
+            </w:tcBorders>
+            <w:tcMar>
+              <w:top w:w="80" w:type="dxa"/>
+              <w:left w:w="120" w:type="dxa"/>
+              <w:bottom w:w="80" w:type="dxa"/>
+              <w:right w:w="120" w:type="dxa"/>
+            </w:tcMar>
+          </w:tcPr>
+          <w:p>
+            <w:pPr>
+              <w:spacing w:after="0" w:line="240" w:lineRule="auto"/>
+              <w:rPr>
+                <w:rFonts w:ascii="Arial" w:hAnsi="Arial" w:cs="Arial"/>
+                <w:sz w:val="22"/>
+                <w:lang w:val="en-GB" w:eastAsia="en-GB"/>
+              </w:rPr>
+            </w:pPr>
+            <w:r>
+              <w:rPr>
+                <w:rFonts w:ascii="Arial" w:hAnsi="Arial" w:cs="Arial"/>
+                <w:sz w:val="20"/>
+                <w:szCs w:val="20"/>
+                <w:lang w:val="en-GB" w:eastAsia="en-GB"/>
+              </w:rPr>
+              <w:t>80x80</w:t>
+            </w:r>
+          </w:p>
+        </w:tc>
+        <w:tc>
+          <w:tcPr>
+            <w:tcW w:w="2000" w:type="dxa"/>
+            <w:tcBorders>
+              <w:top w:val="single" w:sz="1" w:space="0" w:color="CCCCCC"/>
+              <w:left w:val="single" w:sz="1" w:space="0" w:color="CCCCCC"/>
+              <w:bottom w:val="single" w:sz="1" w:space="0" w:color="CCCCCC"/>
+              <w:right w:val="single" w:sz="1" w:space="0" w:color="CCCCCC"/>
+            </w:tcBorders>
+            <w:tcMar>
+              <w:top w:w="80" w:type="dxa"/>
+              <w:left w:w="120" w:type="dxa"/>
+              <w:bottom w:w="80" w:type="dxa"/>
+              <w:right w:w="120" w:type="dxa"/>
+            </w:tcMar>
+          </w:tcPr>
+          <w:p>
+            <w:pPr>
+              <w:spacing w:after="0" w:line="240" w:lineRule="auto"/>
+              <w:rPr>
+                <w:rFonts w:ascii="Arial" w:hAnsi="Arial" w:cs="Arial"/>
+                <w:sz w:val="22"/>
+                <w:lang w:val="en-GB" w:eastAsia="en-GB"/>
+              </w:rPr>
+            </w:pPr>
+            <w:r>
+              <w:rPr>
+                <w:rFonts w:ascii="Arial" w:hAnsi="Arial" w:cs="Arial"/>
+                <w:sz w:val="20"/>
+                <w:szCs w:val="20"/>
+                <w:lang w:val="en-GB" w:eastAsia="en-GB"/>
+              </w:rPr>
+              <w:t>10ms</w:t>
+            </w:r>
+          </w:p>
+        </w:tc>
+        <w:tc>
+          <w:tcPr>
+            <w:tcW w:w="1526" w:type="dxa"/>
+            <w:tcBorders>
+              <w:top w:val="single" w:sz="1" w:space="0" w:color="CCCCCC"/>
+              <w:left w:val="single" w:sz="1" w:space="0" w:color="CCCCCC"/>
+              <w:bottom w:val="single" w:sz="1" w:space="0" w:color="CCCCCC"/>
+              <w:right w:val="single" w:sz="1" w:space="0" w:color="CCCCCC"/>
+            </w:tcBorders>
+            <w:tcMar>
+              <w:top w:w="80" w:type="dxa"/>
+              <w:left w:w="120" w:type="dxa"/>
+              <w:bottom w:w="80" w:type="dxa"/>
+              <w:right w:w="120" w:type="dxa"/>
+            </w:tcMar>
+          </w:tcPr>
+          <w:p>
+            <w:pPr>
+              <w:spacing w:after="0" w:line="240" w:lineRule="auto"/>
+              <w:rPr>
+                <w:rFonts w:ascii="Arial" w:hAnsi="Arial" w:cs="Arial"/>
+                <w:sz w:val="22"/>
+                <w:lang w:val="en-GB" w:eastAsia="en-GB"/>
+              </w:rPr>
+            </w:pPr>
+            <w:r>
+              <w:rPr>
+                <w:rFonts w:ascii="Arial" w:hAnsi="Arial" w:cs="Arial"/>
+                <w:sz w:val="20"/>
+                <w:szCs w:val="20"/>
+                <w:lang w:val="en-GB" w:eastAsia="en-GB"/>
+              </w:rPr>
+              <w:t>In-place reset</w:t>
+            </w:r>
+          </w:p>
+        </w:tc>
+      </w:tr>
+    </w:tbl>
+    <w:p>
+      <w:pPr>
+        <w:spacing w:after="0" w:line="240" w:lineRule="auto"/>
+        <w:rPr>
+          <w:rFonts w:ascii="Arial" w:hAnsi="Arial" w:cs="Arial"/>
+          <w:sz w:val="22"/>
+          <w:lang w:val="en-GB" w:eastAsia="en-GB"/>
+        </w:rPr>
+      </w:pPr>
+    </w:p>
+    <w:p>
+      <w:pPr>
+        <w:spacing w:after="140" w:line="240" w:lineRule="auto"/>
+        <w:rPr>
+          <w:rFonts w:ascii="Arial" w:hAnsi="Arial" w:cs="Arial"/>
+          <w:sz w:val="22"/>
+          <w:lang w:val="en-GB" w:eastAsia="en-GB"/>
+        </w:rPr>
+      </w:pPr>
+      <w:r>
+        <w:rPr>
+          <w:rFonts w:ascii="Arial" w:hAnsi="Arial" w:cs="Arial"/>
+          <w:sz w:val="22"/>
+          <w:lang w:val="en-GB" w:eastAsia="en-GB"/>
+        </w:rPr>
+        <w:t>CPU profiling over a 27-second session identified the rendering pipeline as the dominant cost (</w:t>
+      </w:r>
+      <w:proofErr w:type="gramStart"/>
+      <w:r>
+        <w:rPr>
+          <w:rFonts w:ascii="Arial" w:hAnsi="Arial" w:cs="Arial"/>
+          <w:sz w:val="22"/>
+          <w:lang w:val="en-GB" w:eastAsia="en-GB"/>
+        </w:rPr>
+        <w:t>Game::</w:t>
+      </w:r>
+      <w:proofErr w:type="gramEnd"/>
+      <w:r>
+        <w:rPr>
+          <w:rFonts w:ascii="Arial" w:hAnsi="Arial" w:cs="Arial"/>
+          <w:sz w:val="22"/>
+          <w:lang w:val="en-GB" w:eastAsia="en-GB"/>
+        </w:rPr>
+        <w:t xml:space="preserve">render 91.34%), with </w:t>
+      </w:r>
+      <w:proofErr w:type="gramStart"/>
+      <w:r>
+        <w:rPr>
+          <w:rFonts w:ascii="Arial" w:hAnsi="Arial" w:cs="Arial"/>
+          <w:sz w:val="22"/>
+          <w:lang w:val="en-GB" w:eastAsia="en-GB"/>
+        </w:rPr>
+        <w:t>Map::</w:t>
+      </w:r>
+      <w:proofErr w:type="gramEnd"/>
+      <w:r>
+        <w:rPr>
+          <w:rFonts w:ascii="Arial" w:hAnsi="Arial" w:cs="Arial"/>
+          <w:sz w:val="22"/>
+          <w:lang w:val="en-GB" w:eastAsia="en-GB"/>
+        </w:rPr>
+        <w:t xml:space="preserve">render at 50.17% and </w:t>
+      </w:r>
+      <w:proofErr w:type="spellStart"/>
+      <w:proofErr w:type="gramStart"/>
+      <w:r>
+        <w:rPr>
+          <w:rFonts w:ascii="Arial" w:hAnsi="Arial" w:cs="Arial"/>
+          <w:sz w:val="22"/>
+          <w:lang w:val="en-GB" w:eastAsia="en-GB"/>
+        </w:rPr>
+        <w:t>VoronoiDiagram</w:t>
+      </w:r>
+      <w:proofErr w:type="spellEnd"/>
+      <w:r>
+        <w:rPr>
+          <w:rFonts w:ascii="Arial" w:hAnsi="Arial" w:cs="Arial"/>
+          <w:sz w:val="22"/>
+          <w:lang w:val="en-GB" w:eastAsia="en-GB"/>
+        </w:rPr>
+        <w:t>::</w:t>
+      </w:r>
+      <w:proofErr w:type="spellStart"/>
+      <w:proofErr w:type="gramEnd"/>
+      <w:r>
+        <w:rPr>
+          <w:rFonts w:ascii="Arial" w:hAnsi="Arial" w:cs="Arial"/>
+          <w:sz w:val="22"/>
+          <w:lang w:val="en-GB" w:eastAsia="en-GB"/>
+        </w:rPr>
+        <w:t>renderDebug</w:t>
+      </w:r>
+      <w:proofErr w:type="spellEnd"/>
+      <w:r>
+        <w:rPr>
+          <w:rFonts w:ascii="Arial" w:hAnsi="Arial" w:cs="Arial"/>
+          <w:sz w:val="22"/>
+          <w:lang w:val="en-GB" w:eastAsia="en-GB"/>
+        </w:rPr>
+        <w:t xml:space="preserve"> at 28.93%. This is expected</w:t>
+      </w:r>
+      <w:r>
+        <w:rPr>
+          <w:rFonts w:ascii="Arial" w:hAnsi="Arial" w:cs="Arial"/>
+          <w:sz w:val="22"/>
+          <w:lang w:val="en-GB" w:eastAsia="en-GB"/>
+        </w:rPr>
+        <w:t xml:space="preserve">, </w:t>
+      </w:r>
+      <w:r>
+        <w:rPr>
+          <w:rFonts w:ascii="Arial" w:hAnsi="Arial" w:cs="Arial"/>
+          <w:sz w:val="22"/>
+          <w:lang w:val="en-GB" w:eastAsia="en-GB"/>
+        </w:rPr>
+        <w:t>the debug renderer is active in development builds and draws boundary lines for every Voronoi region edge. In a release build this would be disabled. Process memory stabilised at 54MB and remained flat, confirming no memory leaks during gameplay.</w:t>
+      </w:r>
+    </w:p>
+    <w:tbl>
+      <w:tblPr>
+        <w:tblStyle w:val="TableGrid"/>
+        <w:tblW w:w="10459" w:type="dxa"/>
+        <w:tblInd w:w="-714" w:type="dxa"/>
+        <w:tblLook w:val="04A0" w:firstRow="1" w:lastRow="0" w:firstColumn="1" w:lastColumn="0" w:noHBand="0" w:noVBand="1"/>
+      </w:tblPr>
+      <w:tblGrid>
+        <w:gridCol w:w="10601"/>
+      </w:tblGrid>
+      <w:tr>
+        <w:tc>
+          <w:tcPr>
+            <w:tcW w:w="10459" w:type="dxa"/>
+          </w:tcPr>
+          <w:p>
+            <w:pPr>
+              <w:spacing w:after="140" w:line="240" w:lineRule="auto"/>
+              <w:jc w:val="center"/>
+              <w:rPr>
+                <w:rFonts w:ascii="Arial" w:hAnsi="Arial" w:cs="Arial"/>
+                <w:sz w:val="22"/>
+                <w:lang w:val="en-GB" w:eastAsia="en-GB"/>
+              </w:rPr>
+            </w:pPr>
+            <w:r>
+              <w:rPr>
+                <w:rFonts w:ascii="Arial" w:hAnsi="Arial" w:cs="Arial"/>
+                <w:noProof/>
+                <w:sz w:val="22"/>
+                <w:lang w:val="en-GB" w:eastAsia="en-GB"/>
+              </w:rPr>
+              <w:drawing>
+                <wp:inline distT="0" distB="0" distL="0" distR="0" wp14:anchorId="656E04DB" wp14:editId="232757DA">
+                  <wp:extent cx="6594953" cy="3120272"/>
+                  <wp:effectExtent l="0" t="0" r="0" b="4445"/>
+                  <wp:docPr id="1464699721" name="Picture 1"/>
+                  <wp:cNvGraphicFramePr>
+                    <a:graphicFrameLocks xmlns:a="http://schemas.openxmlformats.org/drawingml/2006/main" noChangeAspect="1"/>
+                  </wp:cNvGraphicFramePr>
+                  <a:graphic xmlns:a="http://schemas.openxmlformats.org/drawingml/2006/main">
+                    <a:graphicData uri="http://schemas.openxmlformats.org/drawingml/2006/picture">
+                      <pic:pic xmlns:pic="http://schemas.openxmlformats.org/drawingml/2006/picture">
+                        <pic:nvPicPr>
+                          <pic:cNvPr id="0" name="Picture 1"/>
+                          <pic:cNvPicPr>
+                            <a:picLocks noChangeAspect="1" noChangeArrowheads="1"/>
+                          </pic:cNvPicPr>
+                        </pic:nvPicPr>
+                        <pic:blipFill>
+                          <a:blip r:embed="rId12">
+                            <a:extLst>
+                              <a:ext uri="{28A0092B-C50C-407E-A947-70E740481C1C}">
+                                <a14:useLocalDpi xmlns:a14="http://schemas.microsoft.com/office/drawing/2010/main" val="0"/>
+                              </a:ext>
+                            </a:extLst>
+                          </a:blip>
+                          <a:srcRect/>
+                          <a:stretch>
+                            <a:fillRect/>
+                          </a:stretch>
+                        </pic:blipFill>
+                        <pic:spPr bwMode="auto">
+                          <a:xfrm>
+                            <a:off x="0" y="0"/>
+                            <a:ext cx="6611391" cy="3128049"/>
+                          </a:xfrm>
+                          <a:prstGeom prst="rect">
+                            <a:avLst/>
+                          </a:prstGeom>
+                          <a:noFill/>
+                          <a:ln>
+                            <a:noFill/>
+                          </a:ln>
+                        </pic:spPr>
+                      </pic:pic>
+                    </a:graphicData>
+                  </a:graphic>
+                </wp:inline>
+              </w:drawing>
+            </w:r>
+          </w:p>
+        </w:tc>
+      </w:tr>
+      <w:tr>
+        <w:trPr>
+          <w:trHeight w:val="1874"/>
+        </w:trPr>
+        <w:tc>
+          <w:tcPr>
+            <w:tcW w:w="10459" w:type="dxa"/>
+          </w:tcPr>
+          <w:p>
+            <w:pPr>
+              <w:spacing w:after="140" w:line="240" w:lineRule="auto"/>
+              <w:jc w:val="center"/>
+              <w:rPr>
+                <w:rFonts w:ascii="Arial" w:hAnsi="Arial" w:cs="Arial"/>
+                <w:sz w:val="22"/>
+                <w:lang w:val="en-GB" w:eastAsia="en-GB"/>
+              </w:rPr>
+            </w:pPr>
+            <w:r>
+              <w:rPr>
+                <w:rFonts w:ascii="Arial" w:hAnsi="Arial" w:cs="Arial"/>
+                <w:noProof/>
+                <w:sz w:val="22"/>
+                <w:lang w:val="en-GB" w:eastAsia="en-GB"/>
+              </w:rPr>
+              <w:lastRenderedPageBreak/>
+              <w:drawing>
+                <wp:inline distT="0" distB="0" distL="0" distR="0" wp14:anchorId="229E98D9" wp14:editId="6B7FE843">
+                  <wp:extent cx="5920033" cy="2520017"/>
+                  <wp:effectExtent l="0" t="0" r="5080" b="0"/>
+                  <wp:docPr id="1995116617" name="Picture 4"/>
+                  <wp:cNvGraphicFramePr>
+                    <a:graphicFrameLocks xmlns:a="http://schemas.openxmlformats.org/drawingml/2006/main" noChangeAspect="1"/>
+                  </wp:cNvGraphicFramePr>
+                  <a:graphic xmlns:a="http://schemas.openxmlformats.org/drawingml/2006/main">
+                    <a:graphicData uri="http://schemas.openxmlformats.org/drawingml/2006/picture">
+                      <pic:pic xmlns:pic="http://schemas.openxmlformats.org/drawingml/2006/picture">
+                        <pic:nvPicPr>
+                          <pic:cNvPr id="0" name="Picture 4"/>
+                          <pic:cNvPicPr>
+                            <a:picLocks noChangeAspect="1" noChangeArrowheads="1"/>
+                          </pic:cNvPicPr>
+                        </pic:nvPicPr>
+                        <pic:blipFill>
+                          <a:blip r:embed="rId13">
+                            <a:extLst>
+                              <a:ext uri="{28A0092B-C50C-407E-A947-70E740481C1C}">
+                                <a14:useLocalDpi xmlns:a14="http://schemas.microsoft.com/office/drawing/2010/main" val="0"/>
+                              </a:ext>
+                            </a:extLst>
+                          </a:blip>
+                          <a:srcRect/>
+                          <a:stretch>
+                            <a:fillRect/>
+                          </a:stretch>
+                        </pic:blipFill>
+                        <pic:spPr bwMode="auto">
+                          <a:xfrm>
+                            <a:off x="0" y="0"/>
+                            <a:ext cx="5930733" cy="2524572"/>
+                          </a:xfrm>
+                          <a:prstGeom prst="rect">
+                            <a:avLst/>
+                          </a:prstGeom>
+                          <a:noFill/>
+                          <a:ln>
+                            <a:noFill/>
+                          </a:ln>
+                        </pic:spPr>
+                      </pic:pic>
+                    </a:graphicData>
+                  </a:graphic>
+                </wp:inline>
+              </w:drawing>
+            </w:r>
+          </w:p>
+          <w:p>
+            <w:pPr>
+              <w:spacing w:after="140" w:line="240" w:lineRule="auto"/>
+              <w:jc w:val="center"/>
+              <w:rPr>
+                <w:rFonts w:ascii="Arial" w:hAnsi="Arial" w:cs="Arial"/>
+                <w:color w:val="BDBDBD"/>
+                <w:sz w:val="22"/>
+                <w:lang w:val="en-GB" w:eastAsia="en-GB"/>
+              </w:rPr>
+            </w:pPr>
+            <w:r>
+              <w:rPr>
+                <w:rFonts w:ascii="Arial" w:hAnsi="Arial" w:cs="Arial"/>
+                <w:color w:val="BDBDBD"/>
+                <w:sz w:val="22"/>
+                <w:lang w:val="en-GB" w:eastAsia="en-GB"/>
+              </w:rPr>
+              <w:t>Before</w:t>
+            </w:r>
+          </w:p>
+          <w:p>
+            <w:pPr>
+              <w:spacing w:after="140" w:line="240" w:lineRule="auto"/>
+              <w:jc w:val="center"/>
+              <w:rPr>
+                <w:rFonts w:ascii="Arial" w:hAnsi="Arial" w:cs="Arial"/>
+                <w:sz w:val="22"/>
+                <w:lang w:val="en-GB" w:eastAsia="en-GB"/>
+              </w:rPr>
+            </w:pPr>
+            <w:r>
+              <w:rPr>
+                <w:rFonts w:ascii="Arial" w:hAnsi="Arial" w:cs="Arial"/>
+                <w:noProof/>
+                <w:sz w:val="22"/>
+                <w:lang w:val="en-GB" w:eastAsia="en-GB"/>
+              </w:rPr>
+              <w:drawing>
+                <wp:inline distT="0" distB="0" distL="0" distR="0" wp14:anchorId="71A2A8F8" wp14:editId="31852806">
+                  <wp:extent cx="2856230" cy="688340"/>
+                  <wp:effectExtent l="0" t="0" r="1270" b="0"/>
+                  <wp:docPr id="57304972" name="Picture 5"/>
+                  <wp:cNvGraphicFramePr>
+                    <a:graphicFrameLocks xmlns:a="http://schemas.openxmlformats.org/drawingml/2006/main" noChangeAspect="1"/>
+                  </wp:cNvGraphicFramePr>
+                  <a:graphic xmlns:a="http://schemas.openxmlformats.org/drawingml/2006/main">
+                    <a:graphicData uri="http://schemas.openxmlformats.org/drawingml/2006/picture">
+                      <pic:pic xmlns:pic="http://schemas.openxmlformats.org/drawingml/2006/picture">
+                        <pic:nvPicPr>
+                          <pic:cNvPr id="0" name="Picture 5"/>
+                          <pic:cNvPicPr>
+                            <a:picLocks noChangeAspect="1" noChangeArrowheads="1"/>
+                          </pic:cNvPicPr>
+                        </pic:nvPicPr>
+                        <pic:blipFill>
+                          <a:blip r:embed="rId14">
+                            <a:extLst>
+                              <a:ext uri="{28A0092B-C50C-407E-A947-70E740481C1C}">
+                                <a14:useLocalDpi xmlns:a14="http://schemas.microsoft.com/office/drawing/2010/main" val="0"/>
+                              </a:ext>
+                            </a:extLst>
+                          </a:blip>
+                          <a:srcRect/>
+                          <a:stretch>
+                            <a:fillRect/>
+                          </a:stretch>
+                        </pic:blipFill>
+                        <pic:spPr bwMode="auto">
+                          <a:xfrm>
+                            <a:off x="0" y="0"/>
+                            <a:ext cx="2856230" cy="688340"/>
+                          </a:xfrm>
+                          <a:prstGeom prst="rect">
+                            <a:avLst/>
+                          </a:prstGeom>
+                          <a:noFill/>
+                          <a:ln>
+                            <a:noFill/>
+                          </a:ln>
+                        </pic:spPr>
+                      </pic:pic>
+                    </a:graphicData>
+                  </a:graphic>
+                </wp:inline>
+              </w:drawing>
+            </w:r>
+          </w:p>
+          <w:p>
+            <w:pPr>
+              <w:spacing w:after="140" w:line="240" w:lineRule="auto"/>
+              <w:jc w:val="center"/>
+              <w:rPr>
+                <w:rFonts w:ascii="Arial" w:hAnsi="Arial" w:cs="Arial"/>
+                <w:sz w:val="22"/>
+                <w:lang w:val="en-GB" w:eastAsia="en-GB"/>
+              </w:rPr>
+            </w:pPr>
+            <w:r>
+              <w:rPr>
+                <w:rFonts w:ascii="Arial" w:hAnsi="Arial" w:cs="Arial"/>
+                <w:color w:val="BDBDBD"/>
+                <w:sz w:val="22"/>
+                <w:lang w:val="en-GB" w:eastAsia="en-GB"/>
+              </w:rPr>
+              <w:t>After</w:t>
+            </w:r>
+          </w:p>
+        </w:tc>
+      </w:tr>
+    </w:tbl>
+    <w:p>
+      <w:pPr>
+        <w:spacing w:after="140" w:line="240" w:lineRule="auto"/>
+        <w:rPr>
+          <w:rFonts w:ascii="Arial" w:hAnsi="Arial" w:cs="Arial"/>
+          <w:sz w:val="22"/>
+          <w:lang w:val="en-GB" w:eastAsia="en-GB"/>
+        </w:rPr>
+      </w:pPr>
+    </w:p>
+    <w:p>
+      <w:pPr>
+        <w:pBdr>
+          <w:bottom w:val="single" w:sz="6" w:space="1" w:color="2E75B6"/>
+        </w:pBdr>
+        <w:spacing w:before="360" w:after="180" w:line="240" w:lineRule="auto"/>
+        <w:outlineLvl w:val="0"/>
+        <w:rPr>
+          <w:rFonts w:ascii="Arial" w:hAnsi="Arial" w:cs="Arial"/>
+          <w:b/>
+          <w:bCs/>
+          <w:color w:val="2E75B6"/>
+          <w:sz w:val="32"/>
+          <w:szCs w:val="32"/>
+          <w:lang w:val="en-GB" w:eastAsia="en-GB"/>
+        </w:rPr>
+      </w:pPr>
+      <w:bookmarkStart w:id="11" w:name="_Toc226415506"/>
+      <w:r>
+        <w:rPr>
+          <w:rFonts w:ascii="Arial" w:hAnsi="Arial" w:cs="Arial"/>
+          <w:b/>
+          <w:bCs/>
+          <w:color w:val="2E75B6"/>
+          <w:sz w:val="32"/>
+          <w:szCs w:val="32"/>
+          <w:lang w:val="en-GB" w:eastAsia="en-GB"/>
+        </w:rPr>
+        <w:t>References</w:t>
+      </w:r>
+      <w:bookmarkEnd w:id="11"/>
+    </w:p>
+    <w:p>
+      <w:pPr>
+        <w:spacing w:after="140" w:line="240" w:lineRule="auto"/>
+        <w:rPr>
+          <w:rFonts w:ascii="Arial" w:hAnsi="Arial" w:cs="Arial"/>
+          <w:sz w:val="22"/>
+          <w:lang w:val="en-GB" w:eastAsia="en-GB"/>
+        </w:rPr>
+      </w:pPr>
+      <w:r>
+        <w:rPr>
+          <w:rFonts w:ascii="Arial" w:hAnsi="Arial" w:cs="Arial"/>
+          <w:sz w:val="22"/>
+          <w:lang w:val="en-GB" w:eastAsia="en-GB"/>
+        </w:rPr>
+        <w:t>[1] Nystrom, R. (2014). Game Programming Patterns. [Online]. Available at: https://gameprogrammingpatterns.com/ (Accessed: April 2026).</w:t>
+      </w:r>
+    </w:p>
+    <w:p>
+      <w:pPr>
+        <w:spacing w:after="140" w:line="240" w:lineRule="auto"/>
+        <w:rPr>
+          <w:rFonts w:ascii="Arial" w:hAnsi="Arial" w:cs="Arial"/>
+          <w:sz w:val="22"/>
+          <w:lang w:val="en-GB" w:eastAsia="en-GB"/>
+        </w:rPr>
+      </w:pPr>
+      <w:r>
+        <w:rPr>
+          <w:rFonts w:ascii="Arial" w:hAnsi="Arial" w:cs="Arial"/>
+          <w:sz w:val="22"/>
+          <w:lang w:val="en-GB" w:eastAsia="en-GB"/>
+        </w:rPr>
+        <w:t xml:space="preserve">[2] Gamma, E., Helm, R., Johnson, R. and </w:t>
+      </w:r>
+      <w:proofErr w:type="spellStart"/>
+      <w:r>
+        <w:rPr>
+          <w:rFonts w:ascii="Arial" w:hAnsi="Arial" w:cs="Arial"/>
+          <w:sz w:val="22"/>
+          <w:lang w:val="en-GB" w:eastAsia="en-GB"/>
+        </w:rPr>
+        <w:t>Vlissides</w:t>
+      </w:r>
+      <w:proofErr w:type="spellEnd"/>
+      <w:r>
+        <w:rPr>
+          <w:rFonts w:ascii="Arial" w:hAnsi="Arial" w:cs="Arial"/>
+          <w:sz w:val="22"/>
+          <w:lang w:val="en-GB" w:eastAsia="en-GB"/>
+        </w:rPr>
+        <w:t>, J. (1994). Design Patterns: Elements of Reusable Object-Oriented Software. Addison-Wesley.</w:t>
+      </w:r>
+    </w:p>
+    <w:p>
+      <w:pPr>
+        <w:spacing w:after="140" w:line="240" w:lineRule="auto"/>
+        <w:rPr>
+          <w:rFonts w:ascii="Arial" w:hAnsi="Arial" w:cs="Arial"/>
+          <w:sz w:val="22"/>
+          <w:lang w:val="en-GB" w:eastAsia="en-GB"/>
+        </w:rPr>
+      </w:pPr>
+      <w:r>
+        <w:rPr>
+          <w:rFonts w:ascii="Arial" w:hAnsi="Arial" w:cs="Arial"/>
+          <w:sz w:val="22"/>
+          <w:lang w:val="en-GB" w:eastAsia="en-GB"/>
+        </w:rPr>
+        <w:t>[3] Shaker, N., Togelius, J. and Nelson, M.J. (2016). Procedural Content Generation in Games. Springer. Available at: http://pcgbook.com/ (Accessed: April 2026).</w:t>
+      </w:r>
+    </w:p>
+    <w:p>
+      <w:pPr>
+        <w:spacing w:after="140" w:line="240" w:lineRule="auto"/>
+        <w:rPr>
+          <w:rFonts w:ascii="Arial" w:hAnsi="Arial" w:cs="Arial"/>
+          <w:sz w:val="22"/>
+          <w:lang w:val="en-GB" w:eastAsia="en-GB"/>
+        </w:rPr>
+      </w:pPr>
+      <w:r>
+        <w:rPr>
+          <w:rFonts w:ascii="Arial" w:hAnsi="Arial" w:cs="Arial"/>
+          <w:sz w:val="22"/>
+          <w:lang w:val="en-GB" w:eastAsia="en-GB"/>
+        </w:rPr>
+        <w:t>[4] Perlin, K. (1985). An Image Synthesizer. ACM SIGGRAPH Computer Graphics, 19(3), pp.287–296.</w:t>
+      </w:r>
+    </w:p>
+    <w:p>
+      <w:pPr>
+        <w:spacing w:after="140" w:line="240" w:lineRule="auto"/>
+        <w:rPr>
+          <w:rFonts w:ascii="Arial" w:hAnsi="Arial" w:cs="Arial"/>
+          <w:sz w:val="22"/>
+          <w:lang w:val="en-GB" w:eastAsia="en-GB"/>
+        </w:rPr>
+      </w:pPr>
+      <w:r>
+        <w:rPr>
+          <w:rFonts w:ascii="Arial" w:hAnsi="Arial" w:cs="Arial"/>
+          <w:sz w:val="22"/>
+          <w:lang w:val="en-GB" w:eastAsia="en-GB"/>
+        </w:rPr>
+        <w:t>[5] Perlin, K. (2002). Improving Noise. ACM SIGGRAPH 2002. Available at: http://mrl.nyu.edu/~perlin/paper445.pdf (Accessed: April 2026).</w:t>
+      </w:r>
+    </w:p>
+    <w:p>
+      <w:pPr>
+        <w:spacing w:after="140" w:line="240" w:lineRule="auto"/>
+        <w:rPr>
+          <w:rFonts w:ascii="Arial" w:hAnsi="Arial" w:cs="Arial"/>
+          <w:sz w:val="22"/>
+          <w:lang w:val="en-GB" w:eastAsia="en-GB"/>
+        </w:rPr>
+      </w:pPr>
+      <w:r>
+        <w:rPr>
+          <w:rFonts w:ascii="Arial" w:hAnsi="Arial" w:cs="Arial"/>
+          <w:sz w:val="22"/>
+          <w:lang w:val="en-GB" w:eastAsia="en-GB"/>
+        </w:rPr>
+        <w:t>[6] Bridson, R. (2007). Fast Poisson Disk Sampling in Arbitrary Dimensions. ACM SIGGRAPH 2007 Sketches. Available at: https://dl.acm.org/doi/10.1145/1278780.1278807 (Accessed: April 2026).</w:t>
+      </w:r>
+    </w:p>
+    <w:p>
+      <w:pPr>
+        <w:spacing w:after="140" w:line="240" w:lineRule="auto"/>
+        <w:rPr>
+          <w:rFonts w:ascii="Arial" w:hAnsi="Arial" w:cs="Arial"/>
+          <w:sz w:val="22"/>
+          <w:lang w:val="en-GB" w:eastAsia="en-GB"/>
+        </w:rPr>
+      </w:pPr>
+      <w:r>
+        <w:rPr>
+          <w:rFonts w:ascii="Arial" w:hAnsi="Arial" w:cs="Arial"/>
+          <w:sz w:val="22"/>
+          <w:lang w:val="en-GB" w:eastAsia="en-GB"/>
+        </w:rPr>
+        <w:t xml:space="preserve">[7] Fortune, S. (1987). A </w:t>
+      </w:r>
+      <w:proofErr w:type="spellStart"/>
+      <w:r>
+        <w:rPr>
+          <w:rFonts w:ascii="Arial" w:hAnsi="Arial" w:cs="Arial"/>
+          <w:sz w:val="22"/>
+          <w:lang w:val="en-GB" w:eastAsia="en-GB"/>
+        </w:rPr>
+        <w:t>Sweepline</w:t>
+      </w:r>
+      <w:proofErr w:type="spellEnd"/>
+      <w:r>
+        <w:rPr>
+          <w:rFonts w:ascii="Arial" w:hAnsi="Arial" w:cs="Arial"/>
+          <w:sz w:val="22"/>
+          <w:lang w:val="en-GB" w:eastAsia="en-GB"/>
+        </w:rPr>
+        <w:t xml:space="preserve"> Algorithm for Voronoi Diagrams. </w:t>
+      </w:r>
+      <w:proofErr w:type="spellStart"/>
+      <w:r>
+        <w:rPr>
+          <w:rFonts w:ascii="Arial" w:hAnsi="Arial" w:cs="Arial"/>
+          <w:sz w:val="22"/>
+          <w:lang w:val="en-GB" w:eastAsia="en-GB"/>
+        </w:rPr>
+        <w:t>Algorithmica</w:t>
+      </w:r>
+      <w:proofErr w:type="spellEnd"/>
+      <w:r>
+        <w:rPr>
+          <w:rFonts w:ascii="Arial" w:hAnsi="Arial" w:cs="Arial"/>
+          <w:sz w:val="22"/>
+          <w:lang w:val="en-GB" w:eastAsia="en-GB"/>
+        </w:rPr>
+        <w:t>, 2(1–4), pp.153–174.</w:t>
+      </w:r>
+    </w:p>
+    <w:p>
+      <w:pPr>
+        <w:spacing w:after="140" w:line="240" w:lineRule="auto"/>
+        <w:rPr>
+          <w:rFonts w:ascii="Arial" w:hAnsi="Arial" w:cs="Arial"/>
+          <w:sz w:val="22"/>
+          <w:lang w:val="en-GB" w:eastAsia="en-GB"/>
+        </w:rPr>
+      </w:pPr>
     </w:p>
     <w:p/>
+    <w:p/>
     <w:sectPr>
-      <w:headerReference w:type="even" r:id="rId12"/>
-      <w:headerReference w:type="default" r:id="rId13"/>
-      <w:footerReference w:type="even" r:id="rId14"/>
-      <w:footerReference w:type="default" r:id="rId15"/>
-      <w:headerReference w:type="first" r:id="rId16"/>
-      <w:footerReference w:type="first" r:id="rId17"/>
+      <w:headerReference w:type="default" r:id="rId15"/>
+      <w:footerReference w:type="default" r:id="rId16"/>
+      <w:headerReference w:type="first" r:id="rId17"/>
+      <w:footerReference w:type="first" r:id="rId18"/>
       <w:pgSz w:w="11906" w:h="16838"/>
       <w:pgMar w:top="1440" w:right="1440" w:bottom="1440" w:left="1440" w:header="708" w:footer="708" w:gutter="0"/>
-      <w:pgNumType w:start="0"/>
+      <w:pgNumType w:start="1"/>
       <w:cols w:space="708"/>
       <w:titlePg/>
       <w:docGrid w:linePitch="360"/>
@@ -1817,8 +4977,19 @@
 <w:ftr xmlns:wpc="http://schemas.microsoft.com/office/word/2010/wordprocessingCanvas" xmlns:cx="http://schemas.microsoft.com/office/drawing/2014/chartex" xmlns:cx1="http://schemas.microsoft.com/office/drawing/2015/9/8/chartex" xmlns:cx2="http://schemas.microsoft.com/office/drawing/2015/10/21/chartex" xmlns:cx3="http://schemas.microsoft.com/office/drawing/2016/5/9/chartex" xmlns:cx4="http://schemas.microsoft.com/office/drawing/2016/5/10/chartex" xmlns:cx5="http://schemas.microsoft.com/office/drawing/2016/5/11/chartex" xmlns:cx6="http://schemas.microsoft.com/office/drawing/2016/5/12/chartex" xmlns:cx7="http://schemas.microsoft.com/office/drawing/2016/5/13/chartex" xmlns:cx8="http://schemas.microsoft.com/office/drawing/2016/5/14/chartex" xmlns:mc="http://schemas.openxmlformats.org/markup-compatibility/2006" xmlns:aink="http://schemas.microsoft.com/office/drawing/2016/ink" xmlns:am3d="http://schemas.microsoft.com/office/drawing/2017/model3d" xmlns:o="urn:schemas-microsoft-com:office:office" xmlns:oel="http://schemas.microsoft.com/office/2019/extlst" xmlns:r="http://schemas.openxmlformats.org/officeDocument/2006/relationships" xmlns:m="http://schemas.openxmlformats.org/officeDocument/2006/math" xmlns:v="urn:schemas-microsoft-com:vml" xmlns:wp14="http://schemas.microsoft.com/office/word/2010/wordprocessingDrawing" xmlns:wp="http://schemas.openxmlformats.org/drawingml/2006/wordprocessingDrawing" xmlns:w10="urn:schemas-microsoft-com:office:word" xmlns:w="http://schemas.openxmlformats.org/wordprocessingml/2006/main" xmlns:w14="http://schemas.microsoft.com/office/word/2010/wordml" xmlns:w15="http://schemas.microsoft.com/office/word/2012/wordml" xmlns:w16cex="http://schemas.microsoft.com/office/word/2018/wordml/cex" xmlns:w16cid="http://schemas.microsoft.com/office/word/2016/wordml/cid" xmlns:w16="http://schemas.microsoft.com/office/word/2018/wordml" xmlns:w16du="http://schemas.microsoft.com/office/word/2023/wordml/word16du" xmlns:w16sdtdh="http://schemas.microsoft.com/office/word/2020/wordml/sdtdatahash" xmlns:w16sdtfl="http://schemas.microsoft.com/office/word/2024/wordml/sdtformatlock" xmlns:w16se="http://schemas.microsoft.com/office/word/2015/wordml/symex" xmlns:wpg="http://schemas.microsoft.com/office/word/2010/wordprocessingGroup" xmlns:wpi="http://schemas.microsoft.com/office/word/2010/wordprocessingInk" xmlns:wne="http://schemas.microsoft.com/office/word/2006/wordml" xmlns:wps="http://schemas.microsoft.com/office/word/2010/wordprocessingShape" mc:Ignorable="w14 w15 w16se w16cid w16 w16cex w16sdtdh w16sdtfl w16du wp14">
   <w:p>
     <w:pPr>
-      <w:pStyle w:val="Footer"/>
+      <w:pBdr>
+        <w:top w:val="single" w:sz="4" w:space="1" w:color="2E75B6"/>
+      </w:pBdr>
+      <w:jc w:val="center"/>
     </w:pPr>
+    <w:r>
+      <w:rPr>
+        <w:color w:val="555555"/>
+        <w:sz w:val="18"/>
+        <w:szCs w:val="18"/>
+      </w:rPr>
+      <w:t>SETU Carlow | Computer Games Development CW208 | Page 4</w:t>
+    </w:r>
   </w:p>
 </w:ftr>
 </file>
@@ -1830,35 +5001,6 @@
       <w:pBdr>
         <w:top w:val="single" w:sz="4" w:space="1" w:color="2E75B6"/>
       </w:pBdr>
-      <w:jc w:val="center"/>
-    </w:pPr>
-    <w:r>
-      <w:rPr>
-        <w:color w:val="555555"/>
-        <w:sz w:val="18"/>
-        <w:szCs w:val="18"/>
-      </w:rPr>
-      <w:t xml:space="preserve">SETU Carlow | Computer Games Development CW208 | Page </w:t>
-    </w:r>
-    <w:r>
-      <w:rPr>
-        <w:color w:val="555555"/>
-        <w:sz w:val="18"/>
-        <w:szCs w:val="18"/>
-      </w:rPr>
-      <w:t>4</w:t>
-    </w:r>
-  </w:p>
-</w:ftr>
-</file>
-
-<file path=word/footer3.xml><?xml version="1.0" encoding="utf-8"?>
-<w:ftr xmlns:wpc="http://schemas.microsoft.com/office/word/2010/wordprocessingCanvas" xmlns:cx="http://schemas.microsoft.com/office/drawing/2014/chartex" xmlns:cx1="http://schemas.microsoft.com/office/drawing/2015/9/8/chartex" xmlns:cx2="http://schemas.microsoft.com/office/drawing/2015/10/21/chartex" xmlns:cx3="http://schemas.microsoft.com/office/drawing/2016/5/9/chartex" xmlns:cx4="http://schemas.microsoft.com/office/drawing/2016/5/10/chartex" xmlns:cx5="http://schemas.microsoft.com/office/drawing/2016/5/11/chartex" xmlns:cx6="http://schemas.microsoft.com/office/drawing/2016/5/12/chartex" xmlns:cx7="http://schemas.microsoft.com/office/drawing/2016/5/13/chartex" xmlns:cx8="http://schemas.microsoft.com/office/drawing/2016/5/14/chartex" xmlns:mc="http://schemas.openxmlformats.org/markup-compatibility/2006" xmlns:aink="http://schemas.microsoft.com/office/drawing/2016/ink" xmlns:am3d="http://schemas.microsoft.com/office/drawing/2017/model3d" xmlns:o="urn:schemas-microsoft-com:office:office" xmlns:oel="http://schemas.microsoft.com/office/2019/extlst" xmlns:r="http://schemas.openxmlformats.org/officeDocument/2006/relationships" xmlns:m="http://schemas.openxmlformats.org/officeDocument/2006/math" xmlns:v="urn:schemas-microsoft-com:vml" xmlns:wp14="http://schemas.microsoft.com/office/word/2010/wordprocessingDrawing" xmlns:wp="http://schemas.openxmlformats.org/drawingml/2006/wordprocessingDrawing" xmlns:w10="urn:schemas-microsoft-com:office:word" xmlns:w="http://schemas.openxmlformats.org/wordprocessingml/2006/main" xmlns:w14="http://schemas.microsoft.com/office/word/2010/wordml" xmlns:w15="http://schemas.microsoft.com/office/word/2012/wordml" xmlns:w16cex="http://schemas.microsoft.com/office/word/2018/wordml/cex" xmlns:w16cid="http://schemas.microsoft.com/office/word/2016/wordml/cid" xmlns:w16="http://schemas.microsoft.com/office/word/2018/wordml" xmlns:w16du="http://schemas.microsoft.com/office/word/2023/wordml/word16du" xmlns:w16sdtdh="http://schemas.microsoft.com/office/word/2020/wordml/sdtdatahash" xmlns:w16sdtfl="http://schemas.microsoft.com/office/word/2024/wordml/sdtformatlock" xmlns:w16se="http://schemas.microsoft.com/office/word/2015/wordml/symex" xmlns:wpg="http://schemas.microsoft.com/office/word/2010/wordprocessingGroup" xmlns:wpi="http://schemas.microsoft.com/office/word/2010/wordprocessingInk" xmlns:wne="http://schemas.microsoft.com/office/word/2006/wordml" xmlns:wps="http://schemas.microsoft.com/office/word/2010/wordprocessingShape" mc:Ignorable="w14 w15 w16se w16cid w16 w16cex w16sdtdh w16sdtfl w16du wp14">
-  <w:p>
-    <w:pPr>
-      <w:pBdr>
-        <w:top w:val="single" w:sz="4" w:space="1" w:color="2E75B6"/>
-      </w:pBdr>
       <w:spacing w:after="0" w:line="240" w:lineRule="auto"/>
       <w:jc w:val="center"/>
       <w:rPr>
@@ -1917,16 +5059,6 @@
 </file>
 
 <file path=word/header1.xml><?xml version="1.0" encoding="utf-8"?>
-<w:hdr xmlns:wpc="http://schemas.microsoft.com/office/word/2010/wordprocessingCanvas" xmlns:cx="http://schemas.microsoft.com/office/drawing/2014/chartex" xmlns:cx1="http://schemas.microsoft.com/office/drawing/2015/9/8/chartex" xmlns:cx2="http://schemas.microsoft.com/office/drawing/2015/10/21/chartex" xmlns:cx3="http://schemas.microsoft.com/office/drawing/2016/5/9/chartex" xmlns:cx4="http://schemas.microsoft.com/office/drawing/2016/5/10/chartex" xmlns:cx5="http://schemas.microsoft.com/office/drawing/2016/5/11/chartex" xmlns:cx6="http://schemas.microsoft.com/office/drawing/2016/5/12/chartex" xmlns:cx7="http://schemas.microsoft.com/office/drawing/2016/5/13/chartex" xmlns:cx8="http://schemas.microsoft.com/office/drawing/2016/5/14/chartex" xmlns:mc="http://schemas.openxmlformats.org/markup-compatibility/2006" xmlns:aink="http://schemas.microsoft.com/office/drawing/2016/ink" xmlns:am3d="http://schemas.microsoft.com/office/drawing/2017/model3d" xmlns:o="urn:schemas-microsoft-com:office:office" xmlns:oel="http://schemas.microsoft.com/office/2019/extlst" xmlns:r="http://schemas.openxmlformats.org/officeDocument/2006/relationships" xmlns:m="http://schemas.openxmlformats.org/officeDocument/2006/math" xmlns:v="urn:schemas-microsoft-com:vml" xmlns:wp14="http://schemas.microsoft.com/office/word/2010/wordprocessingDrawing" xmlns:wp="http://schemas.openxmlformats.org/drawingml/2006/wordprocessingDrawing" xmlns:w10="urn:schemas-microsoft-com:office:word" xmlns:w="http://schemas.openxmlformats.org/wordprocessingml/2006/main" xmlns:w14="http://schemas.microsoft.com/office/word/2010/wordml" xmlns:w15="http://schemas.microsoft.com/office/word/2012/wordml" xmlns:w16cex="http://schemas.microsoft.com/office/word/2018/wordml/cex" xmlns:w16cid="http://schemas.microsoft.com/office/word/2016/wordml/cid" xmlns:w16="http://schemas.microsoft.com/office/word/2018/wordml" xmlns:w16du="http://schemas.microsoft.com/office/word/2023/wordml/word16du" xmlns:w16sdtdh="http://schemas.microsoft.com/office/word/2020/wordml/sdtdatahash" xmlns:w16sdtfl="http://schemas.microsoft.com/office/word/2024/wordml/sdtformatlock" xmlns:w16se="http://schemas.microsoft.com/office/word/2015/wordml/symex" xmlns:wpg="http://schemas.microsoft.com/office/word/2010/wordprocessingGroup" xmlns:wpi="http://schemas.microsoft.com/office/word/2010/wordprocessingInk" xmlns:wne="http://schemas.microsoft.com/office/word/2006/wordml" xmlns:wps="http://schemas.microsoft.com/office/word/2010/wordprocessingShape" mc:Ignorable="w14 w15 w16se w16cid w16 w16cex w16sdtdh w16sdtfl w16du wp14">
-  <w:p>
-    <w:pPr>
-      <w:pStyle w:val="Header"/>
-    </w:pPr>
-  </w:p>
-</w:hdr>
-</file>
-
-<file path=word/header2.xml><?xml version="1.0" encoding="utf-8"?>
 <w:hdr xmlns:wpc="http://schemas.microsoft.com/office/word/2010/wordprocessingCanvas" xmlns:cx="http://schemas.microsoft.com/office/drawing/2014/chartex" xmlns:cx1="http://schemas.microsoft.com/office/drawing/2015/9/8/chartex" xmlns:cx2="http://schemas.microsoft.com/office/drawing/2015/10/21/chartex" xmlns:cx3="http://schemas.microsoft.com/office/drawing/2016/5/9/chartex" xmlns:cx4="http://schemas.microsoft.com/office/drawing/2016/5/10/chartex" xmlns:cx5="http://schemas.microsoft.com/office/drawing/2016/5/11/chartex" xmlns:cx6="http://schemas.microsoft.com/office/drawing/2016/5/12/chartex" xmlns:cx7="http://schemas.microsoft.com/office/drawing/2016/5/13/chartex" xmlns:cx8="http://schemas.microsoft.com/office/drawing/2016/5/14/chartex" xmlns:mc="http://schemas.openxmlformats.org/markup-compatibility/2006" xmlns:aink="http://schemas.microsoft.com/office/drawing/2016/ink" xmlns:am3d="http://schemas.microsoft.com/office/drawing/2017/model3d" xmlns:o="urn:schemas-microsoft-com:office:office" xmlns:oel="http://schemas.microsoft.com/office/2019/extlst" xmlns:r="http://schemas.openxmlformats.org/officeDocument/2006/relationships" xmlns:m="http://schemas.openxmlformats.org/officeDocument/2006/math" xmlns:v="urn:schemas-microsoft-com:vml" xmlns:wp14="http://schemas.microsoft.com/office/word/2010/wordprocessingDrawing" xmlns:wp="http://schemas.openxmlformats.org/drawingml/2006/wordprocessingDrawing" xmlns:w10="urn:schemas-microsoft-com:office:word" xmlns:w="http://schemas.openxmlformats.org/wordprocessingml/2006/main" xmlns:w14="http://schemas.microsoft.com/office/word/2010/wordml" xmlns:w15="http://schemas.microsoft.com/office/word/2012/wordml" xmlns:w16cex="http://schemas.microsoft.com/office/word/2018/wordml/cex" xmlns:w16cid="http://schemas.microsoft.com/office/word/2016/wordml/cid" xmlns:w16="http://schemas.microsoft.com/office/word/2018/wordml" xmlns:w16du="http://schemas.microsoft.com/office/word/2023/wordml/word16du" xmlns:w16sdtdh="http://schemas.microsoft.com/office/word/2020/wordml/sdtdatahash" xmlns:w16sdtfl="http://schemas.microsoft.com/office/word/2024/wordml/sdtformatlock" xmlns:w16se="http://schemas.microsoft.com/office/word/2015/wordml/symex" xmlns:wpg="http://schemas.microsoft.com/office/word/2010/wordprocessingGroup" xmlns:wpi="http://schemas.microsoft.com/office/word/2010/wordprocessingInk" xmlns:wne="http://schemas.microsoft.com/office/word/2006/wordml" xmlns:wps="http://schemas.microsoft.com/office/word/2010/wordprocessingShape" mc:Ignorable="w14 w15 w16se w16cid w16 w16cex w16sdtdh w16sdtfl w16du wp14">
   <w:p>
     <w:pPr>
@@ -1964,7 +5096,7 @@
 </w:hdr>
 </file>
 
-<file path=word/header3.xml><?xml version="1.0" encoding="utf-8"?>
+<file path=word/header2.xml><?xml version="1.0" encoding="utf-8"?>
 <w:hdr xmlns:wpc="http://schemas.microsoft.com/office/word/2010/wordprocessingCanvas" xmlns:cx="http://schemas.microsoft.com/office/drawing/2014/chartex" xmlns:cx1="http://schemas.microsoft.com/office/drawing/2015/9/8/chartex" xmlns:cx2="http://schemas.microsoft.com/office/drawing/2015/10/21/chartex" xmlns:cx3="http://schemas.microsoft.com/office/drawing/2016/5/9/chartex" xmlns:cx4="http://schemas.microsoft.com/office/drawing/2016/5/10/chartex" xmlns:cx5="http://schemas.microsoft.com/office/drawing/2016/5/11/chartex" xmlns:cx6="http://schemas.microsoft.com/office/drawing/2016/5/12/chartex" xmlns:cx7="http://schemas.microsoft.com/office/drawing/2016/5/13/chartex" xmlns:cx8="http://schemas.microsoft.com/office/drawing/2016/5/14/chartex" xmlns:mc="http://schemas.openxmlformats.org/markup-compatibility/2006" xmlns:aink="http://schemas.microsoft.com/office/drawing/2016/ink" xmlns:am3d="http://schemas.microsoft.com/office/drawing/2017/model3d" xmlns:o="urn:schemas-microsoft-com:office:office" xmlns:oel="http://schemas.microsoft.com/office/2019/extlst" xmlns:r="http://schemas.openxmlformats.org/officeDocument/2006/relationships" xmlns:m="http://schemas.openxmlformats.org/officeDocument/2006/math" xmlns:v="urn:schemas-microsoft-com:vml" xmlns:wp14="http://schemas.microsoft.com/office/word/2010/wordprocessingDrawing" xmlns:wp="http://schemas.openxmlformats.org/drawingml/2006/wordprocessingDrawing" xmlns:w10="urn:schemas-microsoft-com:office:word" xmlns:w="http://schemas.openxmlformats.org/wordprocessingml/2006/main" xmlns:w14="http://schemas.microsoft.com/office/word/2010/wordml" xmlns:w15="http://schemas.microsoft.com/office/word/2012/wordml" xmlns:w16cex="http://schemas.microsoft.com/office/word/2018/wordml/cex" xmlns:w16cid="http://schemas.microsoft.com/office/word/2016/wordml/cid" xmlns:w16="http://schemas.microsoft.com/office/word/2018/wordml" xmlns:w16du="http://schemas.microsoft.com/office/word/2023/wordml/word16du" xmlns:w16sdtdh="http://schemas.microsoft.com/office/word/2020/wordml/sdtdatahash" xmlns:w16sdtfl="http://schemas.microsoft.com/office/word/2024/wordml/sdtformatlock" xmlns:w16se="http://schemas.microsoft.com/office/word/2015/wordml/symex" xmlns:wpg="http://schemas.microsoft.com/office/word/2010/wordprocessingGroup" xmlns:wpi="http://schemas.microsoft.com/office/word/2010/wordprocessingInk" xmlns:wne="http://schemas.microsoft.com/office/word/2006/wordml" xmlns:wps="http://schemas.microsoft.com/office/word/2010/wordprocessingShape" mc:Ignorable="w14 w15 w16se w16cid w16 w16cex w16sdtdh w16sdtfl w16du wp14">
   <w:p>
     <w:pPr>
@@ -4451,7 +7583,6 @@
   <w:style w:type="character" w:default="1" w:styleId="DefaultParagraphFont">
     <w:name w:val="Default Paragraph Font"/>
     <w:uiPriority w:val="1"/>
-    <w:semiHidden/>
     <w:unhideWhenUsed/>
   </w:style>
   <w:style w:type="table" w:default="1" w:styleId="TableNormal">
@@ -5062,16 +8193,15 @@
 </file>
 
 <file path=customXml/item1.xml><?xml version="1.0" encoding="utf-8"?>
-<p:properties xmlns:p="http://schemas.microsoft.com/office/2006/metadata/properties" xmlns:xsi="http://www.w3.org/2001/XMLSchema-instance" xmlns:pc="http://schemas.microsoft.com/office/infopath/2007/PartnerControls">
-  <documentManagement/>
-</p:properties>
+<?mso-contentType ?>
+<FormTemplates xmlns="http://schemas.microsoft.com/sharepoint/v3/contenttype/forms">
+  <Display>DocumentLibraryForm</Display>
+  <Edit>DocumentLibraryForm</Edit>
+  <New>DocumentLibraryForm</New>
+</FormTemplates>
 </file>
 
 <file path=customXml/item2.xml><?xml version="1.0" encoding="utf-8"?>
-<b:Sources xmlns:b="http://schemas.openxmlformats.org/officeDocument/2006/bibliography" xmlns="http://schemas.openxmlformats.org/officeDocument/2006/bibliography" SelectedStyle="\APASixthEditionOfficeOnline.xsl" StyleName="APA" Version="6"/>
-</file>
-
-<file path=customXml/item3.xml><?xml version="1.0" encoding="utf-8"?>
 <ct:contentTypeSchema xmlns:ct="http://schemas.microsoft.com/office/2006/metadata/contentType" xmlns:ma="http://schemas.microsoft.com/office/2006/metadata/properties/metaAttributes" ct:_="" ma:_="" ma:contentTypeName="Document" ma:contentTypeID="0x010100B4B3963D136B89489C303B1F134CDEFE" ma:contentTypeVersion="2" ma:contentTypeDescription="Create a new document." ma:contentTypeScope="" ma:versionID="308c9ae795ee33ed826f6ffffe232275">
   <xsd:schema xmlns:xsd="http://www.w3.org/2001/XMLSchema" xmlns:xs="http://www.w3.org/2001/XMLSchema" xmlns:p="http://schemas.microsoft.com/office/2006/metadata/properties" xmlns:ns2="3d09ae41-e7b8-4678-82ce-f613907bc86b" targetNamespace="http://schemas.microsoft.com/office/2006/metadata/properties" ma:root="true" ma:fieldsID="ae9e1e531943a4b87ea1040b939bb65d" ns2:_="">
     <xsd:import namespace="3d09ae41-e7b8-4678-82ce-f613907bc86b"/>
@@ -5203,33 +8333,25 @@
 </ct:contentTypeSchema>
 </file>
 
+<file path=customXml/item3.xml><?xml version="1.0" encoding="utf-8"?>
+<b:Sources xmlns:b="http://schemas.openxmlformats.org/officeDocument/2006/bibliography" xmlns="http://schemas.openxmlformats.org/officeDocument/2006/bibliography" SelectedStyle="\APASixthEditionOfficeOnline.xsl" StyleName="APA" Version="6"/>
+</file>
+
 <file path=customXml/item4.xml><?xml version="1.0" encoding="utf-8"?>
-<?mso-contentType ?>
-<FormTemplates xmlns="http://schemas.microsoft.com/sharepoint/v3/contenttype/forms">
-  <Display>DocumentLibraryForm</Display>
-  <Edit>DocumentLibraryForm</Edit>
-  <New>DocumentLibraryForm</New>
-</FormTemplates>
+<p:properties xmlns:p="http://schemas.microsoft.com/office/2006/metadata/properties" xmlns:xsi="http://www.w3.org/2001/XMLSchema-instance" xmlns:pc="http://schemas.microsoft.com/office/infopath/2007/PartnerControls">
+  <documentManagement/>
+</p:properties>
 </file>
 
 <file path=customXml/itemProps1.xml><?xml version="1.0" encoding="utf-8"?>
-<ds:datastoreItem xmlns:ds="http://schemas.openxmlformats.org/officeDocument/2006/customXml" ds:itemID="{B81975BD-F3A5-4B76-88D3-92416F194EA7}">
+<ds:datastoreItem xmlns:ds="http://schemas.openxmlformats.org/officeDocument/2006/customXml" ds:itemID="{62938047-4573-473E-BF0E-290566D59595}">
   <ds:schemaRefs>
-    <ds:schemaRef ds:uri="http://schemas.microsoft.com/office/2006/metadata/properties"/>
-    <ds:schemaRef ds:uri="http://schemas.microsoft.com/office/infopath/2007/PartnerControls"/>
+    <ds:schemaRef ds:uri="http://schemas.microsoft.com/sharepoint/v3/contenttype/forms"/>
   </ds:schemaRefs>
 </ds:datastoreItem>
 </file>
 
 <file path=customXml/itemProps2.xml><?xml version="1.0" encoding="utf-8"?>
-<ds:datastoreItem xmlns:ds="http://schemas.openxmlformats.org/officeDocument/2006/customXml" ds:itemID="{2CDFF8FE-BF0C-42DA-AA01-C71B0B153D14}">
-  <ds:schemaRefs>
-    <ds:schemaRef ds:uri="http://schemas.openxmlformats.org/officeDocument/2006/bibliography"/>
-  </ds:schemaRefs>
-</ds:datastoreItem>
-</file>
-
-<file path=customXml/itemProps3.xml><?xml version="1.0" encoding="utf-8"?>
 <ds:datastoreItem xmlns:ds="http://schemas.openxmlformats.org/officeDocument/2006/customXml" ds:itemID="{2565A03E-28DF-494F-BAE7-C32272330B83}">
   <ds:schemaRefs>
     <ds:schemaRef ds:uri="http://schemas.microsoft.com/office/2006/metadata/contentType"/>
@@ -5247,10 +8369,19 @@
 </ds:datastoreItem>
 </file>
 
+<file path=customXml/itemProps3.xml><?xml version="1.0" encoding="utf-8"?>
+<ds:datastoreItem xmlns:ds="http://schemas.openxmlformats.org/officeDocument/2006/customXml" ds:itemID="{2CDFF8FE-BF0C-42DA-AA01-C71B0B153D14}">
+  <ds:schemaRefs>
+    <ds:schemaRef ds:uri="http://schemas.openxmlformats.org/officeDocument/2006/bibliography"/>
+  </ds:schemaRefs>
+</ds:datastoreItem>
+</file>
+
 <file path=customXml/itemProps4.xml><?xml version="1.0" encoding="utf-8"?>
-<ds:datastoreItem xmlns:ds="http://schemas.openxmlformats.org/officeDocument/2006/customXml" ds:itemID="{62938047-4573-473E-BF0E-290566D59595}">
+<ds:datastoreItem xmlns:ds="http://schemas.openxmlformats.org/officeDocument/2006/customXml" ds:itemID="{B81975BD-F3A5-4B76-88D3-92416F194EA7}">
   <ds:schemaRefs>
-    <ds:schemaRef ds:uri="http://schemas.microsoft.com/sharepoint/v3/contenttype/forms"/>
+    <ds:schemaRef ds:uri="http://schemas.microsoft.com/office/2006/metadata/properties"/>
+    <ds:schemaRef ds:uri="http://schemas.microsoft.com/office/infopath/2007/PartnerControls"/>
   </ds:schemaRefs>
 </ds:datastoreItem>
 </file>
</xml_diff>

<commit_message>
Updating docs with the enemy and inventory items
</commit_message>
<xml_diff>
--- a/Documentation/Reports/Project-Report.docx
+++ b/Documentation/Reports/Project-Report.docx
@@ -2647,357 +2647,79 @@
               <w:lang w:val="en-GB" w:eastAsia="en-GB"/>
             </w:rPr>
           </w:pPr>
-          <w:r>
-            <w:rPr>
-              <w:rFonts w:ascii="Arial" w:hAnsi="Arial" w:cs="Arial"/>
-              <w:noProof/>
-              <w:color w:val="0563C1"/>
-              <w:sz w:val="22"/>
-              <w:u w:val="single"/>
-              <w:lang w:val="en-GB" w:eastAsia="en-GB"/>
-            </w:rPr>
-            <w:fldChar w:fldCharType="begin"/>
-          </w:r>
-          <w:r>
-            <w:rPr>
-              <w:rFonts w:ascii="Arial" w:hAnsi="Arial" w:cs="Arial"/>
-              <w:noProof/>
-              <w:color w:val="0563C1"/>
-              <w:sz w:val="22"/>
-              <w:u w:val="single"/>
-              <w:lang w:val="en-GB" w:eastAsia="en-GB"/>
-            </w:rPr>
-            <w:instrText xml:space="preserve"> </w:instrText>
-          </w:r>
-          <w:r>
-            <w:rPr>
-              <w:rFonts w:ascii="Arial" w:hAnsi="Arial" w:cs="Arial"/>
-              <w:noProof/>
-              <w:sz w:val="22"/>
-              <w:lang w:val="en-GB" w:eastAsia="en-GB"/>
-            </w:rPr>
-            <w:instrText>HYPERLINK \l "_Toc226461318"</w:instrText>
-          </w:r>
-          <w:r>
-            <w:rPr>
-              <w:rFonts w:ascii="Arial" w:hAnsi="Arial" w:cs="Arial"/>
-              <w:noProof/>
-              <w:color w:val="0563C1"/>
-              <w:sz w:val="22"/>
-              <w:u w:val="single"/>
-              <w:lang w:val="en-GB" w:eastAsia="en-GB"/>
-            </w:rPr>
-            <w:instrText xml:space="preserve"> </w:instrText>
-          </w:r>
-          <w:r>
-            <w:rPr>
-              <w:rFonts w:ascii="Arial" w:hAnsi="Arial" w:cs="Arial"/>
-              <w:noProof/>
-              <w:color w:val="0563C1"/>
-              <w:sz w:val="22"/>
-              <w:u w:val="single"/>
-              <w:lang w:val="en-GB" w:eastAsia="en-GB"/>
-            </w:rPr>
-          </w:r>
-          <w:r>
-            <w:rPr>
-              <w:rFonts w:ascii="Arial" w:hAnsi="Arial" w:cs="Arial"/>
-              <w:noProof/>
-              <w:color w:val="0563C1"/>
-              <w:sz w:val="22"/>
-              <w:u w:val="single"/>
-              <w:lang w:val="en-GB" w:eastAsia="en-GB"/>
-            </w:rPr>
-            <w:fldChar w:fldCharType="separate"/>
-          </w:r>
-          <w:r>
-            <w:rPr>
-              <w:rFonts w:ascii="Arial" w:hAnsi="Arial" w:cs="Arial"/>
-              <w:noProof/>
-              <w:sz w:val="22"/>
-              <w:lang w:val="en-GB" w:eastAsia="en-GB"/>
-            </w:rPr>
-            <w:t>Re</w:t>
-          </w:r>
-          <w:r>
-            <w:rPr>
-              <w:rFonts w:ascii="Arial" w:hAnsi="Arial" w:cs="Arial"/>
-              <w:noProof/>
-              <w:sz w:val="22"/>
-              <w:lang w:val="en-GB" w:eastAsia="en-GB"/>
-            </w:rPr>
-            <w:t>f</w:t>
-          </w:r>
-          <w:r>
-            <w:rPr>
-              <w:rFonts w:ascii="Arial" w:hAnsi="Arial" w:cs="Arial"/>
-              <w:noProof/>
-              <w:sz w:val="22"/>
-              <w:lang w:val="en-GB" w:eastAsia="en-GB"/>
-            </w:rPr>
-            <w:t>eren</w:t>
-          </w:r>
-          <w:r>
-            <w:rPr>
-              <w:rFonts w:ascii="Arial" w:hAnsi="Arial" w:cs="Arial"/>
-              <w:noProof/>
-              <w:sz w:val="22"/>
-              <w:lang w:val="en-GB" w:eastAsia="en-GB"/>
-            </w:rPr>
-            <w:t>c</w:t>
-          </w:r>
-          <w:r>
-            <w:rPr>
-              <w:rFonts w:ascii="Arial" w:hAnsi="Arial" w:cs="Arial"/>
-              <w:noProof/>
-              <w:sz w:val="22"/>
-              <w:lang w:val="en-GB" w:eastAsia="en-GB"/>
-            </w:rPr>
-            <w:t>es</w:t>
-          </w:r>
-          <w:r>
-            <w:rPr>
-              <w:rFonts w:ascii="Arial" w:hAnsi="Arial" w:cs="Arial"/>
-              <w:noProof/>
-              <w:sz w:val="22"/>
-              <w:lang w:val="en-GB" w:eastAsia="en-GB"/>
-            </w:rPr>
-            <w:tab/>
-          </w:r>
-          <w:r>
-            <w:rPr>
-              <w:rFonts w:ascii="Arial" w:hAnsi="Arial" w:cs="Arial"/>
-              <w:noProof/>
-              <w:sz w:val="22"/>
-              <w:lang w:val="en-GB" w:eastAsia="en-GB"/>
-            </w:rPr>
-            <w:fldChar w:fldCharType="begin"/>
-          </w:r>
-          <w:r>
-            <w:rPr>
-              <w:rFonts w:ascii="Arial" w:hAnsi="Arial" w:cs="Arial"/>
-              <w:noProof/>
-              <w:sz w:val="22"/>
-              <w:lang w:val="en-GB" w:eastAsia="en-GB"/>
-            </w:rPr>
-            <w:instrText xml:space="preserve"> PAGEREF _Toc226461318 \h </w:instrText>
-          </w:r>
-          <w:r>
-            <w:rPr>
-              <w:rFonts w:ascii="Arial" w:hAnsi="Arial" w:cs="Arial"/>
-              <w:noProof/>
-              <w:sz w:val="22"/>
-              <w:lang w:val="en-GB" w:eastAsia="en-GB"/>
-            </w:rPr>
-          </w:r>
-          <w:r>
-            <w:rPr>
-              <w:rFonts w:ascii="Arial" w:hAnsi="Arial" w:cs="Arial"/>
-              <w:noProof/>
-              <w:sz w:val="22"/>
-              <w:lang w:val="en-GB" w:eastAsia="en-GB"/>
-            </w:rPr>
-            <w:fldChar w:fldCharType="separate"/>
-          </w:r>
-          <w:r>
-            <w:rPr>
-              <w:rFonts w:ascii="Arial" w:hAnsi="Arial" w:cs="Arial"/>
-              <w:noProof/>
-              <w:sz w:val="22"/>
-              <w:lang w:val="en-GB" w:eastAsia="en-GB"/>
-            </w:rPr>
-            <w:t>11</w:t>
-          </w:r>
-          <w:r>
-            <w:rPr>
-              <w:rFonts w:ascii="Arial" w:hAnsi="Arial" w:cs="Arial"/>
-              <w:noProof/>
-              <w:sz w:val="22"/>
-              <w:lang w:val="en-GB" w:eastAsia="en-GB"/>
-            </w:rPr>
-            <w:fldChar w:fldCharType="end"/>
-          </w:r>
-          <w:r>
-            <w:rPr>
-              <w:rFonts w:ascii="Arial" w:hAnsi="Arial" w:cs="Arial"/>
-              <w:noProof/>
-              <w:color w:val="0563C1"/>
-              <w:sz w:val="22"/>
-              <w:u w:val="single"/>
-              <w:lang w:val="en-GB" w:eastAsia="en-GB"/>
-            </w:rPr>
-            <w:fldChar w:fldCharType="end"/>
-          </w:r>
-        </w:p>
-        <w:p>
-          <w:pPr>
-            <w:tabs>
-              <w:tab w:val="right" w:leader="dot" w:pos="9016"/>
-            </w:tabs>
-            <w:spacing w:after="100" w:line="240" w:lineRule="auto"/>
-            <w:rPr>
-              <w:rFonts w:ascii="Arial" w:hAnsi="Arial" w:cs="Arial"/>
-              <w:noProof/>
-              <w:sz w:val="22"/>
-              <w:lang w:val="en-GB" w:eastAsia="en-GB"/>
-            </w:rPr>
-          </w:pPr>
-          <w:r>
-            <w:rPr>
-              <w:rFonts w:ascii="Arial" w:hAnsi="Arial" w:cs="Arial"/>
-              <w:noProof/>
-              <w:sz w:val="22"/>
-              <w:lang w:val="en-GB" w:eastAsia="en-GB"/>
-            </w:rPr>
-            <w:fldChar w:fldCharType="begin"/>
-          </w:r>
-          <w:r>
-            <w:rPr>
-              <w:rFonts w:ascii="Arial" w:hAnsi="Arial" w:cs="Arial"/>
-              <w:noProof/>
-              <w:sz w:val="22"/>
-              <w:lang w:val="en-GB" w:eastAsia="en-GB"/>
-            </w:rPr>
-            <w:instrText xml:space="preserve"> HYPERLINK \l "_Toc226461319" </w:instrText>
-          </w:r>
-          <w:r>
-            <w:rPr>
-              <w:rFonts w:ascii="Arial" w:hAnsi="Arial" w:cs="Arial"/>
-              <w:noProof/>
-              <w:sz w:val="22"/>
-              <w:lang w:val="en-GB" w:eastAsia="en-GB"/>
-            </w:rPr>
-          </w:r>
-          <w:r>
-            <w:rPr>
-              <w:rFonts w:ascii="Arial" w:hAnsi="Arial" w:cs="Arial"/>
-              <w:noProof/>
-              <w:sz w:val="22"/>
-              <w:lang w:val="en-GB" w:eastAsia="en-GB"/>
-            </w:rPr>
-            <w:fldChar w:fldCharType="separate"/>
-          </w:r>
-          <w:r>
-            <w:rPr>
-              <w:rFonts w:ascii="Arial" w:hAnsi="Arial" w:cs="Arial"/>
-              <w:noProof/>
-              <w:sz w:val="22"/>
-              <w:lang w:val="en-GB" w:eastAsia="en-GB"/>
-            </w:rPr>
-            <w:t>Append</w:t>
-          </w:r>
-          <w:r>
-            <w:rPr>
-              <w:rFonts w:ascii="Arial" w:hAnsi="Arial" w:cs="Arial"/>
-              <w:noProof/>
-              <w:sz w:val="22"/>
-              <w:lang w:val="en-GB" w:eastAsia="en-GB"/>
-            </w:rPr>
-            <w:t>i</w:t>
-          </w:r>
-          <w:r>
-            <w:rPr>
-              <w:rFonts w:ascii="Arial" w:hAnsi="Arial" w:cs="Arial"/>
-              <w:noProof/>
-              <w:sz w:val="22"/>
-              <w:lang w:val="en-GB" w:eastAsia="en-GB"/>
-            </w:rPr>
-            <w:t>c</w:t>
-          </w:r>
-          <w:r>
-            <w:rPr>
-              <w:rFonts w:ascii="Arial" w:hAnsi="Arial" w:cs="Arial"/>
-              <w:noProof/>
-              <w:sz w:val="22"/>
-              <w:lang w:val="en-GB" w:eastAsia="en-GB"/>
-            </w:rPr>
-            <w:t>es</w:t>
-          </w:r>
-          <w:r>
-            <w:rPr>
-              <w:rFonts w:ascii="Arial" w:hAnsi="Arial" w:cs="Arial"/>
-              <w:noProof/>
-              <w:sz w:val="22"/>
-              <w:lang w:val="en-GB" w:eastAsia="en-GB"/>
-            </w:rPr>
-            <w:tab/>
-          </w:r>
-          <w:r>
-            <w:rPr>
-              <w:rFonts w:ascii="Arial" w:hAnsi="Arial" w:cs="Arial"/>
-              <w:noProof/>
-              <w:sz w:val="22"/>
-              <w:lang w:val="en-GB" w:eastAsia="en-GB"/>
-            </w:rPr>
-            <w:fldChar w:fldCharType="begin"/>
-          </w:r>
-          <w:r>
-            <w:rPr>
-              <w:rFonts w:ascii="Arial" w:hAnsi="Arial" w:cs="Arial"/>
-              <w:noProof/>
-              <w:sz w:val="22"/>
-              <w:lang w:val="en-GB" w:eastAsia="en-GB"/>
-            </w:rPr>
-            <w:instrText xml:space="preserve"> PAGEREF _Toc226461319 \h </w:instrText>
-          </w:r>
-          <w:r>
-            <w:rPr>
-              <w:rFonts w:ascii="Arial" w:hAnsi="Arial" w:cs="Arial"/>
-              <w:noProof/>
-              <w:sz w:val="22"/>
-              <w:lang w:val="en-GB" w:eastAsia="en-GB"/>
-            </w:rPr>
-          </w:r>
-          <w:r>
-            <w:rPr>
-              <w:rFonts w:ascii="Arial" w:hAnsi="Arial" w:cs="Arial"/>
-              <w:noProof/>
-              <w:sz w:val="22"/>
-              <w:lang w:val="en-GB" w:eastAsia="en-GB"/>
-            </w:rPr>
-            <w:fldChar w:fldCharType="separate"/>
-          </w:r>
-          <w:r>
-            <w:rPr>
-              <w:rFonts w:ascii="Arial" w:hAnsi="Arial" w:cs="Arial"/>
-              <w:noProof/>
-              <w:sz w:val="22"/>
-              <w:lang w:val="en-GB" w:eastAsia="en-GB"/>
-            </w:rPr>
-            <w:t>12</w:t>
-          </w:r>
-          <w:r>
-            <w:rPr>
-              <w:rFonts w:ascii="Arial" w:hAnsi="Arial" w:cs="Arial"/>
-              <w:noProof/>
-              <w:sz w:val="22"/>
-              <w:lang w:val="en-GB" w:eastAsia="en-GB"/>
-            </w:rPr>
-            <w:fldChar w:fldCharType="end"/>
-          </w:r>
-          <w:r>
-            <w:rPr>
-              <w:rFonts w:ascii="Arial" w:hAnsi="Arial" w:cs="Arial"/>
-              <w:noProof/>
-              <w:sz w:val="22"/>
-              <w:lang w:val="en-GB" w:eastAsia="en-GB"/>
-            </w:rPr>
-            <w:fldChar w:fldCharType="end"/>
-          </w:r>
-        </w:p>
-        <w:p>
-          <w:pPr>
-            <w:tabs>
-              <w:tab w:val="right" w:leader="dot" w:pos="9016"/>
-            </w:tabs>
-            <w:spacing w:after="100" w:line="240" w:lineRule="auto"/>
-            <w:rPr>
-              <w:rFonts w:ascii="Arial" w:hAnsi="Arial" w:cs="Arial"/>
-              <w:noProof/>
-              <w:sz w:val="22"/>
-              <w:lang w:val="en-GB" w:eastAsia="en-GB"/>
-            </w:rPr>
-          </w:pPr>
+          <w:hyperlink w:anchor="_Toc226461318" w:history="1">
+            <w:r>
+              <w:rPr>
+                <w:rFonts w:ascii="Arial" w:hAnsi="Arial" w:cs="Arial"/>
+                <w:noProof/>
+                <w:sz w:val="22"/>
+                <w:lang w:val="en-GB" w:eastAsia="en-GB"/>
+              </w:rPr>
+              <w:t>References</w:t>
+            </w:r>
+            <w:r>
+              <w:rPr>
+                <w:rFonts w:ascii="Arial" w:hAnsi="Arial" w:cs="Arial"/>
+                <w:noProof/>
+                <w:sz w:val="22"/>
+                <w:lang w:val="en-GB" w:eastAsia="en-GB"/>
+              </w:rPr>
+              <w:tab/>
+            </w:r>
+            <w:r>
+              <w:rPr>
+                <w:rFonts w:ascii="Arial" w:hAnsi="Arial" w:cs="Arial"/>
+                <w:noProof/>
+                <w:sz w:val="22"/>
+                <w:lang w:val="en-GB" w:eastAsia="en-GB"/>
+              </w:rPr>
+              <w:fldChar w:fldCharType="begin"/>
+            </w:r>
+            <w:r>
+              <w:rPr>
+                <w:rFonts w:ascii="Arial" w:hAnsi="Arial" w:cs="Arial"/>
+                <w:noProof/>
+                <w:sz w:val="22"/>
+                <w:lang w:val="en-GB" w:eastAsia="en-GB"/>
+              </w:rPr>
+              <w:instrText xml:space="preserve"> PAGEREF _Toc226461318 \h </w:instrText>
+            </w:r>
+            <w:r>
+              <w:rPr>
+                <w:rFonts w:ascii="Arial" w:hAnsi="Arial" w:cs="Arial"/>
+                <w:noProof/>
+                <w:sz w:val="22"/>
+                <w:lang w:val="en-GB" w:eastAsia="en-GB"/>
+              </w:rPr>
+            </w:r>
+            <w:r>
+              <w:rPr>
+                <w:rFonts w:ascii="Arial" w:hAnsi="Arial" w:cs="Arial"/>
+                <w:noProof/>
+                <w:sz w:val="22"/>
+                <w:lang w:val="en-GB" w:eastAsia="en-GB"/>
+              </w:rPr>
+              <w:fldChar w:fldCharType="separate"/>
+            </w:r>
+            <w:r>
+              <w:rPr>
+                <w:rFonts w:ascii="Arial" w:hAnsi="Arial" w:cs="Arial"/>
+                <w:noProof/>
+                <w:sz w:val="22"/>
+                <w:lang w:val="en-GB" w:eastAsia="en-GB"/>
+              </w:rPr>
+              <w:t>11</w:t>
+            </w:r>
+            <w:r>
+              <w:rPr>
+                <w:rFonts w:ascii="Arial" w:hAnsi="Arial" w:cs="Arial"/>
+                <w:noProof/>
+                <w:sz w:val="22"/>
+                <w:lang w:val="en-GB" w:eastAsia="en-GB"/>
+              </w:rPr>
+              <w:fldChar w:fldCharType="end"/>
+            </w:r>
+          </w:hyperlink>
         </w:p>
         <w:p>
           <w:pPr>
@@ -5772,8 +5494,8 @@
           <w:lang w:val="en-GB" w:eastAsia="en-GB"/>
         </w:rPr>
       </w:pPr>
-      <w:bookmarkStart w:id="11" w:name="_Toc226415506"/>
-      <w:bookmarkStart w:id="12" w:name="_Toc226461307"/>
+      <w:bookmarkStart w:id="11" w:name="_Toc226461307"/>
+      <w:bookmarkStart w:id="12" w:name="_Toc226415506"/>
       <w:r>
         <w:rPr>
           <w:rFonts w:ascii="Arial" w:hAnsi="Arial" w:cs="Arial"/>
@@ -5786,7 +5508,7 @@
         </w:rPr>
         <w:t>Collision System</w:t>
       </w:r>
-      <w:bookmarkEnd w:id="12"/>
+      <w:bookmarkEnd w:id="11"/>
     </w:p>
     <w:p>
       <w:pPr>
@@ -6174,12 +5896,6 @@
         <w:gridCol w:w="2026"/>
       </w:tblGrid>
       <w:tr>
-        <w:tblPrEx>
-          <w:tblCellMar>
-            <w:top w:w="0" w:type="dxa"/>
-            <w:bottom w:w="0" w:type="dxa"/>
-          </w:tblCellMar>
-        </w:tblPrEx>
         <w:tc>
           <w:tcPr>
             <w:tcW w:w="3000" w:type="dxa"/>
@@ -6342,12 +6058,6 @@
         </w:tc>
       </w:tr>
       <w:tr>
-        <w:tblPrEx>
-          <w:tblCellMar>
-            <w:top w:w="0" w:type="dxa"/>
-            <w:bottom w:w="0" w:type="dxa"/>
-          </w:tblCellMar>
-        </w:tblPrEx>
         <w:tc>
           <w:tcPr>
             <w:tcW w:w="3000" w:type="dxa"/>
@@ -6500,12 +6210,6 @@
         </w:tc>
       </w:tr>
       <w:tr>
-        <w:tblPrEx>
-          <w:tblCellMar>
-            <w:top w:w="0" w:type="dxa"/>
-            <w:bottom w:w="0" w:type="dxa"/>
-          </w:tblCellMar>
-        </w:tblPrEx>
         <w:tc>
           <w:tcPr>
             <w:tcW w:w="3000" w:type="dxa"/>
@@ -6658,12 +6362,6 @@
         </w:tc>
       </w:tr>
       <w:tr>
-        <w:tblPrEx>
-          <w:tblCellMar>
-            <w:top w:w="0" w:type="dxa"/>
-            <w:bottom w:w="0" w:type="dxa"/>
-          </w:tblCellMar>
-        </w:tblPrEx>
         <w:tc>
           <w:tcPr>
             <w:tcW w:w="3000" w:type="dxa"/>
@@ -6828,12 +6526,6 @@
         </w:tc>
       </w:tr>
       <w:tr>
-        <w:tblPrEx>
-          <w:tblCellMar>
-            <w:top w:w="0" w:type="dxa"/>
-            <w:bottom w:w="0" w:type="dxa"/>
-          </w:tblCellMar>
-        </w:tblPrEx>
         <w:tc>
           <w:tcPr>
             <w:tcW w:w="3000" w:type="dxa"/>
@@ -6996,12 +6688,6 @@
         </w:tc>
       </w:tr>
       <w:tr>
-        <w:tblPrEx>
-          <w:tblCellMar>
-            <w:top w:w="0" w:type="dxa"/>
-            <w:bottom w:w="0" w:type="dxa"/>
-          </w:tblCellMar>
-        </w:tblPrEx>
         <w:tc>
           <w:tcPr>
             <w:tcW w:w="3000" w:type="dxa"/>
@@ -7154,12 +6840,6 @@
         </w:tc>
       </w:tr>
       <w:tr>
-        <w:tblPrEx>
-          <w:tblCellMar>
-            <w:top w:w="0" w:type="dxa"/>
-            <w:bottom w:w="0" w:type="dxa"/>
-          </w:tblCellMar>
-        </w:tblPrEx>
         <w:tc>
           <w:tcPr>
             <w:tcW w:w="3000" w:type="dxa"/>
@@ -7312,12 +6992,6 @@
         </w:tc>
       </w:tr>
       <w:tr>
-        <w:tblPrEx>
-          <w:tblCellMar>
-            <w:top w:w="0" w:type="dxa"/>
-            <w:bottom w:w="0" w:type="dxa"/>
-          </w:tblCellMar>
-        </w:tblPrEx>
         <w:tc>
           <w:tcPr>
             <w:tcW w:w="3000" w:type="dxa"/>
@@ -7480,12 +7154,6 @@
         </w:tc>
       </w:tr>
       <w:tr>
-        <w:tblPrEx>
-          <w:tblCellMar>
-            <w:top w:w="0" w:type="dxa"/>
-            <w:bottom w:w="0" w:type="dxa"/>
-          </w:tblCellMar>
-        </w:tblPrEx>
         <w:tc>
           <w:tcPr>
             <w:tcW w:w="3000" w:type="dxa"/>
@@ -7638,12 +7306,6 @@
         </w:tc>
       </w:tr>
       <w:tr>
-        <w:tblPrEx>
-          <w:tblCellMar>
-            <w:top w:w="0" w:type="dxa"/>
-            <w:bottom w:w="0" w:type="dxa"/>
-          </w:tblCellMar>
-        </w:tblPrEx>
         <w:tc>
           <w:tcPr>
             <w:tcW w:w="3000" w:type="dxa"/>
@@ -7796,12 +7458,6 @@
         </w:tc>
       </w:tr>
       <w:tr>
-        <w:tblPrEx>
-          <w:tblCellMar>
-            <w:top w:w="0" w:type="dxa"/>
-            <w:bottom w:w="0" w:type="dxa"/>
-          </w:tblCellMar>
-        </w:tblPrEx>
         <w:tc>
           <w:tcPr>
             <w:tcW w:w="3000" w:type="dxa"/>
@@ -7954,12 +7610,6 @@
         </w:tc>
       </w:tr>
       <w:tr>
-        <w:tblPrEx>
-          <w:tblCellMar>
-            <w:top w:w="0" w:type="dxa"/>
-            <w:bottom w:w="0" w:type="dxa"/>
-          </w:tblCellMar>
-        </w:tblPrEx>
         <w:tc>
           <w:tcPr>
             <w:tcW w:w="3000" w:type="dxa"/>
@@ -8112,12 +7762,6 @@
         </w:tc>
       </w:tr>
       <w:tr>
-        <w:tblPrEx>
-          <w:tblCellMar>
-            <w:top w:w="0" w:type="dxa"/>
-            <w:bottom w:w="0" w:type="dxa"/>
-          </w:tblCellMar>
-        </w:tblPrEx>
         <w:tc>
           <w:tcPr>
             <w:tcW w:w="3000" w:type="dxa"/>
@@ -8270,12 +7914,6 @@
         </w:tc>
       </w:tr>
       <w:tr>
-        <w:tblPrEx>
-          <w:tblCellMar>
-            <w:top w:w="0" w:type="dxa"/>
-            <w:bottom w:w="0" w:type="dxa"/>
-          </w:tblCellMar>
-        </w:tblPrEx>
         <w:tc>
           <w:tcPr>
             <w:tcW w:w="3000" w:type="dxa"/>
@@ -9748,7 +9386,7 @@
         </w:rPr>
       </w:pPr>
       <w:bookmarkStart w:id="23" w:name="_Toc226461318"/>
-      <w:bookmarkEnd w:id="11"/>
+      <w:bookmarkEnd w:id="12"/>
       <w:r>
         <w:rPr>
           <w:rFonts w:ascii="Arial" w:hAnsi="Arial" w:cs="Arial"/>
@@ -9988,7 +9626,21 @@
           <w:rFonts w:ascii="Arial" w:hAnsi="Arial" w:cs="Arial"/>
           <w:sz w:val="22"/>
         </w:rPr>
-        <w:t>[11] leatherbee.org. (2018). Terrain Generation 3 — Voronoi Diagrams. [Online]. Available at: https://leatherbee.org/index.php/2018/10/06/terrain-generation-3-voronoi-diagrams/ (Accessed: April 2026).</w:t>
+        <w:t>[11] leatherbee.org. (2018). Terrain Generation 3</w:t>
+      </w:r>
+      <w:r>
+        <w:rPr>
+          <w:rFonts w:ascii="Arial" w:hAnsi="Arial" w:cs="Arial"/>
+          <w:sz w:val="22"/>
+        </w:rPr>
+        <w:t>:</w:t>
+      </w:r>
+      <w:r>
+        <w:rPr>
+          <w:rFonts w:ascii="Arial" w:hAnsi="Arial" w:cs="Arial"/>
+          <w:sz w:val="22"/>
+        </w:rPr>
+        <w:t xml:space="preserve"> Voronoi Diagrams. [Online]. Available at: https://leatherbee.org/index.php/2018/10/06/terrain-generation-3-voronoi-diagrams/ (Accessed: April 2026).</w:t>
       </w:r>
     </w:p>
     <w:p>
@@ -10148,59 +9800,6 @@
           <w:lang w:val="en-GB" w:eastAsia="en-GB"/>
         </w:rPr>
       </w:pPr>
-    </w:p>
-    <w:p>
-      <w:pPr>
-        <w:spacing w:after="140" w:line="240" w:lineRule="auto"/>
-        <w:rPr>
-          <w:rFonts w:ascii="Arial" w:hAnsi="Arial" w:cs="Arial"/>
-          <w:sz w:val="22"/>
-          <w:lang w:val="en-GB" w:eastAsia="en-GB"/>
-        </w:rPr>
-      </w:pPr>
-    </w:p>
-    <w:p>
-      <w:pPr>
-        <w:spacing w:after="140" w:line="240" w:lineRule="auto"/>
-        <w:rPr>
-          <w:rFonts w:ascii="Arial" w:hAnsi="Arial" w:cs="Arial"/>
-          <w:sz w:val="22"/>
-          <w:lang w:val="en-GB" w:eastAsia="en-GB"/>
-        </w:rPr>
-      </w:pPr>
-    </w:p>
-    <w:p>
-      <w:pPr>
-        <w:pBdr>
-          <w:bottom w:val="single" w:sz="6" w:space="1" w:color="2E75B6"/>
-        </w:pBdr>
-        <w:spacing w:before="360" w:after="180" w:line="240" w:lineRule="auto"/>
-        <w:outlineLvl w:val="0"/>
-        <w:rPr>
-          <w:rFonts w:ascii="Arial" w:hAnsi="Arial" w:cs="Arial"/>
-          <w:b/>
-          <w:bCs/>
-          <w:color w:val="2E75B6"/>
-          <w:sz w:val="32"/>
-          <w:szCs w:val="32"/>
-          <w:lang w:val="en-GB" w:eastAsia="en-GB"/>
-        </w:rPr>
-      </w:pPr>
-      <w:bookmarkStart w:id="24" w:name="_Toc226461319"/>
-      <w:r>
-        <w:rPr>
-          <w:rFonts w:ascii="Arial" w:hAnsi="Arial" w:cs="Arial"/>
-          <w:b/>
-          <w:bCs/>
-          <w:color w:val="2E75B6"/>
-          <w:sz w:val="32"/>
-          <w:szCs w:val="32"/>
-          <w:lang w:val="en-GB" w:eastAsia="en-GB"/>
-        </w:rPr>
-        <w:lastRenderedPageBreak/>
-        <w:t>Appendices</w:t>
-      </w:r>
-      <w:bookmarkEnd w:id="24"/>
     </w:p>
     <w:p>
       <w:pPr>
@@ -13595,16 +13194,6 @@
 </file>
 
 <file path=customXml/item1.xml><?xml version="1.0" encoding="utf-8"?>
-<p:properties xmlns:p="http://schemas.microsoft.com/office/2006/metadata/properties" xmlns:xsi="http://www.w3.org/2001/XMLSchema-instance" xmlns:pc="http://schemas.microsoft.com/office/infopath/2007/PartnerControls">
-  <documentManagement/>
-</p:properties>
-</file>
-
-<file path=customXml/item2.xml><?xml version="1.0" encoding="utf-8"?>
-<b:Sources xmlns:b="http://schemas.openxmlformats.org/officeDocument/2006/bibliography" xmlns="http://schemas.openxmlformats.org/officeDocument/2006/bibliography" SelectedStyle="\APASixthEditionOfficeOnline.xsl" StyleName="APA" Version="6"/>
-</file>
-
-<file path=customXml/item3.xml><?xml version="1.0" encoding="utf-8"?>
 <ct:contentTypeSchema xmlns:ct="http://schemas.microsoft.com/office/2006/metadata/contentType" xmlns:ma="http://schemas.microsoft.com/office/2006/metadata/properties/metaAttributes" ct:_="" ma:_="" ma:contentTypeName="Document" ma:contentTypeID="0x010100B4B3963D136B89489C303B1F134CDEFE" ma:contentTypeVersion="2" ma:contentTypeDescription="Create a new document." ma:contentTypeScope="" ma:versionID="308c9ae795ee33ed826f6ffffe232275">
   <xsd:schema xmlns:xsd="http://www.w3.org/2001/XMLSchema" xmlns:xs="http://www.w3.org/2001/XMLSchema" xmlns:p="http://schemas.microsoft.com/office/2006/metadata/properties" xmlns:ns2="3d09ae41-e7b8-4678-82ce-f613907bc86b" targetNamespace="http://schemas.microsoft.com/office/2006/metadata/properties" ma:root="true" ma:fieldsID="ae9e1e531943a4b87ea1040b939bb65d" ns2:_="">
     <xsd:import namespace="3d09ae41-e7b8-4678-82ce-f613907bc86b"/>
@@ -13736,7 +13325,7 @@
 </ct:contentTypeSchema>
 </file>
 
-<file path=customXml/item4.xml><?xml version="1.0" encoding="utf-8"?>
+<file path=customXml/item2.xml><?xml version="1.0" encoding="utf-8"?>
 <?mso-contentType ?>
 <FormTemplates xmlns="http://schemas.microsoft.com/sharepoint/v3/contenttype/forms">
   <Display>DocumentLibraryForm</Display>
@@ -13745,24 +13334,17 @@
 </FormTemplates>
 </file>
 
-<file path=customXml/itemProps1.xml><?xml version="1.0" encoding="utf-8"?>
-<ds:datastoreItem xmlns:ds="http://schemas.openxmlformats.org/officeDocument/2006/customXml" ds:itemID="{B81975BD-F3A5-4B76-88D3-92416F194EA7}">
-  <ds:schemaRefs>
-    <ds:schemaRef ds:uri="http://schemas.microsoft.com/office/2006/metadata/properties"/>
-    <ds:schemaRef ds:uri="http://schemas.microsoft.com/office/infopath/2007/PartnerControls"/>
-  </ds:schemaRefs>
-</ds:datastoreItem>
+<file path=customXml/item3.xml><?xml version="1.0" encoding="utf-8"?>
+<p:properties xmlns:p="http://schemas.microsoft.com/office/2006/metadata/properties" xmlns:xsi="http://www.w3.org/2001/XMLSchema-instance" xmlns:pc="http://schemas.microsoft.com/office/infopath/2007/PartnerControls">
+  <documentManagement/>
+</p:properties>
 </file>
 
-<file path=customXml/itemProps2.xml><?xml version="1.0" encoding="utf-8"?>
-<ds:datastoreItem xmlns:ds="http://schemas.openxmlformats.org/officeDocument/2006/customXml" ds:itemID="{2CDFF8FE-BF0C-42DA-AA01-C71B0B153D14}">
-  <ds:schemaRefs>
-    <ds:schemaRef ds:uri="http://schemas.openxmlformats.org/officeDocument/2006/bibliography"/>
-  </ds:schemaRefs>
-</ds:datastoreItem>
+<file path=customXml/item4.xml><?xml version="1.0" encoding="utf-8"?>
+<b:Sources xmlns:b="http://schemas.openxmlformats.org/officeDocument/2006/bibliography" xmlns="http://schemas.openxmlformats.org/officeDocument/2006/bibliography" SelectedStyle="\APASixthEditionOfficeOnline.xsl" StyleName="APA" Version="6"/>
 </file>
 
-<file path=customXml/itemProps3.xml><?xml version="1.0" encoding="utf-8"?>
+<file path=customXml/itemProps1.xml><?xml version="1.0" encoding="utf-8"?>
 <ds:datastoreItem xmlns:ds="http://schemas.openxmlformats.org/officeDocument/2006/customXml" ds:itemID="{2565A03E-28DF-494F-BAE7-C32272330B83}">
   <ds:schemaRefs>
     <ds:schemaRef ds:uri="http://schemas.microsoft.com/office/2006/metadata/contentType"/>
@@ -13780,10 +13362,27 @@
 </ds:datastoreItem>
 </file>
 
-<file path=customXml/itemProps4.xml><?xml version="1.0" encoding="utf-8"?>
+<file path=customXml/itemProps2.xml><?xml version="1.0" encoding="utf-8"?>
 <ds:datastoreItem xmlns:ds="http://schemas.openxmlformats.org/officeDocument/2006/customXml" ds:itemID="{62938047-4573-473E-BF0E-290566D59595}">
   <ds:schemaRefs>
     <ds:schemaRef ds:uri="http://schemas.microsoft.com/sharepoint/v3/contenttype/forms"/>
   </ds:schemaRefs>
 </ds:datastoreItem>
+</file>
+
+<file path=customXml/itemProps3.xml><?xml version="1.0" encoding="utf-8"?>
+<ds:datastoreItem xmlns:ds="http://schemas.openxmlformats.org/officeDocument/2006/customXml" ds:itemID="{B81975BD-F3A5-4B76-88D3-92416F194EA7}">
+  <ds:schemaRefs>
+    <ds:schemaRef ds:uri="http://schemas.microsoft.com/office/2006/metadata/properties"/>
+    <ds:schemaRef ds:uri="http://schemas.microsoft.com/office/infopath/2007/PartnerControls"/>
+  </ds:schemaRefs>
+</ds:datastoreItem>
+</file>
+
+<file path=customXml/itemProps4.xml><?xml version="1.0" encoding="utf-8"?>
+<ds:datastoreItem xmlns:ds="http://schemas.openxmlformats.org/officeDocument/2006/customXml" ds:itemID="{2CDFF8FE-BF0C-42DA-AA01-C71B0B153D14}">
+  <ds:schemaRefs>
+    <ds:schemaRef ds:uri="http://schemas.openxmlformats.org/officeDocument/2006/bibliography"/>
+  </ds:schemaRefs>
+</ds:datastoreItem>
 </file>
</xml_diff>

<commit_message>
Should be final document update and pdfs upload
</commit_message>
<xml_diff>
--- a/Documentation/Reports/Project-Report.docx
+++ b/Documentation/Reports/Project-Report.docx
@@ -1,6 +1,6 @@
 
 <file path=word/document.xml><?xml version="1.0" encoding="utf-8"?>
-<w:document xmlns:wpc="http://schemas.microsoft.com/office/word/2010/wordprocessingCanvas" xmlns:cx="http://schemas.microsoft.com/office/drawing/2014/chartex" xmlns:cx1="http://schemas.microsoft.com/office/drawing/2015/9/8/chartex" xmlns:cx2="http://schemas.microsoft.com/office/drawing/2015/10/21/chartex" xmlns:cx3="http://schemas.microsoft.com/office/drawing/2016/5/9/chartex" xmlns:cx4="http://schemas.microsoft.com/office/drawing/2016/5/10/chartex" xmlns:cx5="http://schemas.microsoft.com/office/drawing/2016/5/11/chartex" xmlns:cx6="http://schemas.microsoft.com/office/drawing/2016/5/12/chartex" xmlns:cx7="http://schemas.microsoft.com/office/drawing/2016/5/13/chartex" xmlns:cx8="http://schemas.microsoft.com/office/drawing/2016/5/14/chartex" xmlns:mc="http://schemas.openxmlformats.org/markup-compatibility/2006" xmlns:aink="http://schemas.microsoft.com/office/drawing/2016/ink" xmlns:am3d="http://schemas.microsoft.com/office/drawing/2017/model3d" xmlns:o="urn:schemas-microsoft-com:office:office" xmlns:oel="http://schemas.microsoft.com/office/2019/extlst" xmlns:r="http://schemas.openxmlformats.org/officeDocument/2006/relationships" xmlns:m="http://schemas.openxmlformats.org/officeDocument/2006/math" xmlns:v="urn:schemas-microsoft-com:vml" xmlns:wp14="http://schemas.microsoft.com/office/word/2010/wordprocessingDrawing" xmlns:wp="http://schemas.openxmlformats.org/drawingml/2006/wordprocessingDrawing" xmlns:w10="urn:schemas-microsoft-com:office:word" xmlns:w="http://schemas.openxmlformats.org/wordprocessingml/2006/main" xmlns:w14="http://schemas.microsoft.com/office/word/2010/wordml" xmlns:w15="http://schemas.microsoft.com/office/word/2012/wordml" xmlns:w16cex="http://schemas.microsoft.com/office/word/2018/wordml/cex" xmlns:w16cid="http://schemas.microsoft.com/office/word/2016/wordml/cid" xmlns:w16="http://schemas.microsoft.com/office/word/2018/wordml" xmlns:w16du="http://schemas.microsoft.com/office/word/2023/wordml/word16du" xmlns:w16sdtdh="http://schemas.microsoft.com/office/word/2020/wordml/sdtdatahash" xmlns:w16sdtfl="http://schemas.microsoft.com/office/word/2024/wordml/sdtformatlock" xmlns:w16se="http://schemas.microsoft.com/office/word/2015/wordml/symex" xmlns:wpg="http://schemas.microsoft.com/office/word/2010/wordprocessingGroup" xmlns:wpi="http://schemas.microsoft.com/office/word/2010/wordprocessingInk" xmlns:wne="http://schemas.microsoft.com/office/word/2006/wordml" xmlns:wps="http://schemas.microsoft.com/office/word/2010/wordprocessingShape" mc:Ignorable="w14 w15 w16se w16cid w16 w16cex w16sdtdh w16sdtfl w16du wp14">
+<w:document xmlns:wpc="http://schemas.microsoft.com/office/word/2010/wordprocessingCanvas" xmlns:cx="http://schemas.microsoft.com/office/drawing/2014/chartex" xmlns:cx1="http://schemas.microsoft.com/office/drawing/2015/9/8/chartex" xmlns:cx2="http://schemas.microsoft.com/office/drawing/2015/10/21/chartex" xmlns:cx3="http://schemas.microsoft.com/office/drawing/2016/5/9/chartex" xmlns:cx4="http://schemas.microsoft.com/office/drawing/2016/5/10/chartex" xmlns:cx5="http://schemas.microsoft.com/office/drawing/2016/5/11/chartex" xmlns:cx6="http://schemas.microsoft.com/office/drawing/2016/5/12/chartex" xmlns:cx7="http://schemas.microsoft.com/office/drawing/2016/5/13/chartex" xmlns:cx8="http://schemas.microsoft.com/office/drawing/2016/5/14/chartex" xmlns:mc="http://schemas.openxmlformats.org/markup-compatibility/2006" xmlns:aink="http://schemas.microsoft.com/office/drawing/2016/ink" xmlns:am3d="http://schemas.microsoft.com/office/drawing/2017/model3d" xmlns:o="urn:schemas-microsoft-com:office:office" xmlns:r="http://schemas.openxmlformats.org/officeDocument/2006/relationships" xmlns:m="http://schemas.openxmlformats.org/officeDocument/2006/math" xmlns:v="urn:schemas-microsoft-com:vml" xmlns:wp14="http://schemas.microsoft.com/office/word/2010/wordprocessingDrawing" xmlns:wp="http://schemas.openxmlformats.org/drawingml/2006/wordprocessingDrawing" xmlns:w10="urn:schemas-microsoft-com:office:word" xmlns:w="http://schemas.openxmlformats.org/wordprocessingml/2006/main" xmlns:w14="http://schemas.microsoft.com/office/word/2010/wordml" xmlns:w15="http://schemas.microsoft.com/office/word/2012/wordml" xmlns:w16cex="http://schemas.microsoft.com/office/word/2018/wordml/cex" xmlns:w16cid="http://schemas.microsoft.com/office/word/2016/wordml/cid" xmlns:w16="http://schemas.microsoft.com/office/word/2018/wordml" xmlns:w16sdtdh="http://schemas.microsoft.com/office/word/2020/wordml/sdtdatahash" xmlns:w16se="http://schemas.microsoft.com/office/word/2015/wordml/symex" xmlns:wpg="http://schemas.microsoft.com/office/word/2010/wordprocessingGroup" xmlns:wpi="http://schemas.microsoft.com/office/word/2010/wordprocessingInk" xmlns:wne="http://schemas.microsoft.com/office/word/2006/wordml" xmlns:wps="http://schemas.microsoft.com/office/word/2010/wordprocessingShape" mc:Ignorable="w14 w15 w16se w16cid w16 w16cex w16sdtdh wp14">
   <w:body>
     <w:p>
       <w:pPr>
@@ -693,39 +693,6 @@
           <w:lang w:val="en-GB" w:eastAsia="en-GB"/>
         </w:rPr>
       </w:pPr>
-    </w:p>
-    <w:p>
-      <w:pPr>
-        <w:spacing w:before="400" w:after="0" w:line="240" w:lineRule="auto"/>
-        <w:jc w:val="center"/>
-        <w:rPr>
-          <w:rFonts w:ascii="Arial" w:hAnsi="Arial" w:cs="Arial"/>
-          <w:sz w:val="22"/>
-          <w:lang w:val="en-GB" w:eastAsia="en-GB"/>
-        </w:rPr>
-      </w:pPr>
-      <w:r>
-        <w:rPr>
-          <w:rFonts w:ascii="Arial" w:hAnsi="Arial" w:cs="Arial"/>
-          <w:i/>
-          <w:iCs/>
-          <w:color w:val="888888"/>
-          <w:sz w:val="20"/>
-          <w:szCs w:val="20"/>
-          <w:lang w:val="en-GB" w:eastAsia="en-GB"/>
-        </w:rPr>
-        <w:t>[Declaration form to be attached]</w:t>
-      </w:r>
-    </w:p>
-    <w:p>
-      <w:pPr>
-        <w:spacing w:after="0" w:line="240" w:lineRule="auto"/>
-        <w:rPr>
-          <w:rFonts w:ascii="Arial" w:hAnsi="Arial" w:cs="Arial"/>
-          <w:sz w:val="22"/>
-          <w:lang w:val="en-GB" w:eastAsia="en-GB"/>
-        </w:rPr>
-      </w:pPr>
       <w:r>
         <w:rPr>
           <w:rFonts w:ascii="Arial" w:hAnsi="Arial" w:cs="Arial"/>
@@ -745,6 +712,7 @@
         <w:alias w:val="Table of Contents"/>
         <w:id w:val="234353902"/>
       </w:sdtPr>
+      <w:sdtEndPr/>
       <w:sdtContent>
         <w:p>
           <w:pPr>
@@ -2814,7 +2782,25 @@
           <w:sz w:val="22"/>
           <w:lang w:val="en-GB" w:eastAsia="en-GB"/>
         </w:rPr>
-        <w:t xml:space="preserve">I would like to thank my supervisor Omer Ali for his feedback and guidance throughout this project, and Martin Harrigan for overseeing the module. I would also like to thank the other supervisors, Amr Abdelhafez, Ben O'Shaughnessy, Libor </w:t>
+        <w:t xml:space="preserve">I would like to thank my supervisor Omer Ali for his feedback and guidance throughout this project, and Martin Harrigan for overseeing the module. I would also like to thank the other supervisors, Amr </w:t>
+      </w:r>
+      <w:proofErr w:type="spellStart"/>
+      <w:r>
+        <w:rPr>
+          <w:rFonts w:ascii="Arial" w:hAnsi="Arial" w:cs="Arial"/>
+          <w:sz w:val="22"/>
+          <w:lang w:val="en-GB" w:eastAsia="en-GB"/>
+        </w:rPr>
+        <w:t>Abdelhafez</w:t>
+      </w:r>
+      <w:proofErr w:type="spellEnd"/>
+      <w:r>
+        <w:rPr>
+          <w:rFonts w:ascii="Arial" w:hAnsi="Arial" w:cs="Arial"/>
+          <w:sz w:val="22"/>
+          <w:lang w:val="en-GB" w:eastAsia="en-GB"/>
+        </w:rPr>
+        <w:t xml:space="preserve">, Ben O'Shaughnessy, Libor </w:t>
       </w:r>
       <w:proofErr w:type="spellStart"/>
       <w:r>
@@ -2850,7 +2836,25 @@
           <w:sz w:val="22"/>
           <w:lang w:val="en-GB" w:eastAsia="en-GB"/>
         </w:rPr>
-        <w:t xml:space="preserve">The following external resources were central to this project. Robert Nystrom's Game Programming Patterns (gameprogrammingpatterns.com) served as the primary architectural reference throughout development. Ken Perlin's improved noise algorithm and Robert Bridson's Poisson disk sampling paper provided the mathematical basis for the procedural generation systems. The SFML development team and the </w:t>
+        <w:t xml:space="preserve">The following external resources were central to this project. Robert Nystrom's Game Programming Patterns (gameprogrammingpatterns.com) served as the primary architectural reference throughout development. Ken Perlin's improved noise algorithm and Robert </w:t>
+      </w:r>
+      <w:proofErr w:type="spellStart"/>
+      <w:r>
+        <w:rPr>
+          <w:rFonts w:ascii="Arial" w:hAnsi="Arial" w:cs="Arial"/>
+          <w:sz w:val="22"/>
+          <w:lang w:val="en-GB" w:eastAsia="en-GB"/>
+        </w:rPr>
+        <w:t>Bridson's</w:t>
+      </w:r>
+      <w:proofErr w:type="spellEnd"/>
+      <w:r>
+        <w:rPr>
+          <w:rFonts w:ascii="Arial" w:hAnsi="Arial" w:cs="Arial"/>
+          <w:sz w:val="22"/>
+          <w:lang w:val="en-GB" w:eastAsia="en-GB"/>
+        </w:rPr>
+        <w:t xml:space="preserve"> Poisson disk sampling paper provided the mathematical basis for the procedural generation systems. The SFML development team and the </w:t>
       </w:r>
       <w:proofErr w:type="spellStart"/>
       <w:r>
@@ -3595,7 +3599,50 @@
           <w:sz w:val="22"/>
           <w:lang w:val="en-GB" w:eastAsia="en-GB"/>
         </w:rPr>
-        <w:t>looking region boundaries. The naive O(n²) implementation used initially in this project was replaced by combining Poisson disk sampling (Bridson, 2007) for site placement with a spatial hash grid for proximity queries, reducing generation time from 84ms to 11ms at the 80×80 tile test size.</w:t>
+        <w:t xml:space="preserve">looking region boundaries. The naive O(n²) implementation used initially in this project was replaced by combining </w:t>
+      </w:r>
+      <w:r>
+        <w:rPr>
+          <w:rFonts w:ascii="Arial" w:hAnsi="Arial" w:cs="Arial"/>
+          <w:sz w:val="22"/>
+          <w:lang w:val="en-GB" w:eastAsia="en-GB"/>
+        </w:rPr>
+        <w:lastRenderedPageBreak/>
+        <w:t>Poisson disk sampling (</w:t>
+      </w:r>
+      <w:proofErr w:type="spellStart"/>
+      <w:r>
+        <w:rPr>
+          <w:rFonts w:ascii="Arial" w:hAnsi="Arial" w:cs="Arial"/>
+          <w:sz w:val="22"/>
+          <w:lang w:val="en-GB" w:eastAsia="en-GB"/>
+        </w:rPr>
+        <w:t>Bridson</w:t>
+      </w:r>
+      <w:proofErr w:type="spellEnd"/>
+      <w:r>
+        <w:rPr>
+          <w:rFonts w:ascii="Arial" w:hAnsi="Arial" w:cs="Arial"/>
+          <w:sz w:val="22"/>
+          <w:lang w:val="en-GB" w:eastAsia="en-GB"/>
+        </w:rPr>
+        <w:t>, 2007) for site placement with a spatial hash grid for proximity queries, reducing generation time from 84ms to 11ms at the 80</w:t>
+      </w:r>
+      <w:r>
+        <w:rPr>
+          <w:rFonts w:ascii="Arial" w:hAnsi="Arial" w:cs="Arial"/>
+          <w:sz w:val="22"/>
+          <w:lang w:val="en-GB" w:eastAsia="en-GB"/>
+        </w:rPr>
+        <w:t>x</w:t>
+      </w:r>
+      <w:r>
+        <w:rPr>
+          <w:rFonts w:ascii="Arial" w:hAnsi="Arial" w:cs="Arial"/>
+          <w:sz w:val="22"/>
+          <w:lang w:val="en-GB" w:eastAsia="en-GB"/>
+        </w:rPr>
+        <w:t>80 tile test size.</w:t>
       </w:r>
     </w:p>
     <w:p>
@@ -3613,7 +3660,6 @@
           <w:sz w:val="22"/>
           <w:lang w:val="en-GB" w:eastAsia="en-GB"/>
         </w:rPr>
-        <w:lastRenderedPageBreak/>
         <w:t>Perlin noise (Perlin, 1985; improved in 2002) is the standard algorithm for continuous, smooth pseudo-random value fields in games. Its application for object density control in Thorns follows the standard approach of sampling octave noise at each tile position and applying a threshold to determine object placement</w:t>
       </w:r>
       <w:r>
@@ -3687,7 +3733,23 @@
           <w:sz w:val="22"/>
           <w:lang w:val="en-GB" w:eastAsia="en-GB"/>
         </w:rPr>
-        <w:t xml:space="preserve">The Flyweight pattern for shared collision data addresses a specific performance concern: a 128×128 map with thousands of world objects each holding full copies of their polygon data would impose unnecessary memory overhead. By storing one shape list per object type in the </w:t>
+        <w:t>The Flyweight pattern for shared collision data addresses a specific performance concern: a 128</w:t>
+      </w:r>
+      <w:r>
+        <w:rPr>
+          <w:rFonts w:ascii="Arial" w:hAnsi="Arial" w:cs="Arial"/>
+          <w:sz w:val="22"/>
+          <w:lang w:val="en-GB" w:eastAsia="en-GB"/>
+        </w:rPr>
+        <w:t>x</w:t>
+      </w:r>
+      <w:r>
+        <w:rPr>
+          <w:rFonts w:ascii="Arial" w:hAnsi="Arial" w:cs="Arial"/>
+          <w:sz w:val="22"/>
+          <w:lang w:val="en-GB" w:eastAsia="en-GB"/>
+        </w:rPr>
+        <w:t xml:space="preserve">128 map with thousands of world objects each holding full copies of their polygon data would impose unnecessary memory overhead. By storing one shape list per object type in the </w:t>
       </w:r>
       <w:proofErr w:type="spellStart"/>
       <w:r>
@@ -3770,18 +3832,8 @@
           <w:sz w:val="22"/>
           <w:lang w:val="en-GB" w:eastAsia="en-GB"/>
         </w:rPr>
-        <w:t xml:space="preserve">variant provides a </w:t>
-      </w:r>
-      <w:proofErr w:type="gramStart"/>
-      <w:r>
-        <w:rPr>
-          <w:rFonts w:ascii="Arial" w:hAnsi="Arial" w:cs="Arial"/>
-          <w:sz w:val="22"/>
-          <w:lang w:val="en-GB" w:eastAsia="en-GB"/>
-        </w:rPr>
-        <w:t>type</w:t>
-      </w:r>
-      <w:proofErr w:type="gramEnd"/>
+        <w:t>variant provides a type</w:t>
+      </w:r>
       <w:r>
         <w:rPr>
           <w:rFonts w:ascii="Arial" w:hAnsi="Arial" w:cs="Arial"/>
@@ -3814,19 +3866,9 @@
           <w:sz w:val="22"/>
           <w:lang w:val="en-GB" w:eastAsia="en-GB"/>
         </w:rPr>
-        <w:t xml:space="preserve"> type (holding either </w:t>
-      </w:r>
-      <w:proofErr w:type="gramStart"/>
-      <w:r>
-        <w:rPr>
-          <w:rFonts w:ascii="Arial" w:hAnsi="Arial" w:cs="Arial"/>
-          <w:sz w:val="22"/>
-          <w:lang w:val="en-GB" w:eastAsia="en-GB"/>
-        </w:rPr>
-        <w:t>sf::</w:t>
+        <w:t xml:space="preserve"> type (holding either sf::</w:t>
       </w:r>
       <w:proofErr w:type="spellStart"/>
-      <w:proofErr w:type="gramEnd"/>
       <w:r>
         <w:rPr>
           <w:rFonts w:ascii="Arial" w:hAnsi="Arial" w:cs="Arial"/>
@@ -4269,19 +4311,9 @@
           <w:sz w:val="22"/>
           <w:lang w:val="en-GB" w:eastAsia="en-GB"/>
         </w:rPr>
-        <w:t xml:space="preserve">Sprint, not </w:t>
-      </w:r>
-      <w:proofErr w:type="gramStart"/>
-      <w:r>
-        <w:rPr>
-          <w:rFonts w:ascii="Arial" w:hAnsi="Arial" w:cs="Arial"/>
-          <w:sz w:val="22"/>
-          <w:lang w:val="en-GB" w:eastAsia="en-GB"/>
-        </w:rPr>
-        <w:t>sf::Keyboard::Key::</w:t>
+        <w:t>Sprint, not sf::Keyboard::Key::</w:t>
       </w:r>
       <w:proofErr w:type="spellStart"/>
-      <w:proofErr w:type="gramEnd"/>
       <w:r>
         <w:rPr>
           <w:rFonts w:ascii="Arial" w:hAnsi="Arial" w:cs="Arial"/>
@@ -4409,7 +4441,6 @@
           <w:szCs w:val="28"/>
           <w:lang w:val="en-GB" w:eastAsia="en-GB"/>
         </w:rPr>
-        <w:lastRenderedPageBreak/>
         <w:t>Procedural Generation Results</w:t>
       </w:r>
       <w:bookmarkEnd w:id="10"/>
@@ -5116,7 +5147,23 @@
           <w:sz w:val="22"/>
           <w:lang w:val="en-GB" w:eastAsia="en-GB"/>
         </w:rPr>
-        <w:t>CPU profiling over a 27-second session identified the rendering pipeline as the dominant cost (</w:t>
+        <w:t>CPU profiling over a 27</w:t>
+      </w:r>
+      <w:r>
+        <w:rPr>
+          <w:rFonts w:ascii="Arial" w:hAnsi="Arial" w:cs="Arial"/>
+          <w:sz w:val="22"/>
+          <w:lang w:val="en-GB" w:eastAsia="en-GB"/>
+        </w:rPr>
+        <w:t xml:space="preserve"> </w:t>
+      </w:r>
+      <w:r>
+        <w:rPr>
+          <w:rFonts w:ascii="Arial" w:hAnsi="Arial" w:cs="Arial"/>
+          <w:sz w:val="22"/>
+          <w:lang w:val="en-GB" w:eastAsia="en-GB"/>
+        </w:rPr>
+        <w:t>second session identified the rendering pipeline as the dominant cost (</w:t>
       </w:r>
       <w:proofErr w:type="gramStart"/>
       <w:r>
@@ -5134,28 +5181,9 @@
           <w:sz w:val="22"/>
           <w:lang w:val="en-GB" w:eastAsia="en-GB"/>
         </w:rPr>
-        <w:t xml:space="preserve">render 91.34%), with </w:t>
-      </w:r>
-      <w:proofErr w:type="gramStart"/>
-      <w:r>
-        <w:rPr>
-          <w:rFonts w:ascii="Arial" w:hAnsi="Arial" w:cs="Arial"/>
-          <w:sz w:val="22"/>
-          <w:lang w:val="en-GB" w:eastAsia="en-GB"/>
-        </w:rPr>
-        <w:t>Map::</w:t>
-      </w:r>
-      <w:proofErr w:type="gramEnd"/>
-      <w:r>
-        <w:rPr>
-          <w:rFonts w:ascii="Arial" w:hAnsi="Arial" w:cs="Arial"/>
-          <w:sz w:val="22"/>
-          <w:lang w:val="en-GB" w:eastAsia="en-GB"/>
-        </w:rPr>
-        <w:t xml:space="preserve">render at 50.17% and </w:t>
+        <w:t xml:space="preserve">render 91.34%), with Map::render at 50.17% and </w:t>
       </w:r>
       <w:proofErr w:type="spellStart"/>
-      <w:proofErr w:type="gramStart"/>
       <w:r>
         <w:rPr>
           <w:rFonts w:ascii="Arial" w:hAnsi="Arial" w:cs="Arial"/>
@@ -5174,7 +5202,6 @@
         <w:t>::</w:t>
       </w:r>
       <w:proofErr w:type="spellStart"/>
-      <w:proofErr w:type="gramEnd"/>
       <w:r>
         <w:rPr>
           <w:rFonts w:ascii="Arial" w:hAnsi="Arial" w:cs="Arial"/>
@@ -5525,7 +5552,23 @@
           <w:sz w:val="22"/>
           <w:lang w:val="en-GB" w:eastAsia="en-GB"/>
         </w:rPr>
-        <w:t xml:space="preserve">The SAT polygon collision system correctly resolves player-world object collisions. The Flyweight implementation verified: a 128×128 map with several thousand placed world objects uses one </w:t>
+        <w:t>The SAT polygon collision system correctly resolves player-world object collisions. The Flyweight implementation verified: a 128</w:t>
+      </w:r>
+      <w:r>
+        <w:rPr>
+          <w:rFonts w:ascii="Arial" w:hAnsi="Arial" w:cs="Arial"/>
+          <w:sz w:val="22"/>
+          <w:lang w:val="en-GB" w:eastAsia="en-GB"/>
+        </w:rPr>
+        <w:t>x</w:t>
+      </w:r>
+      <w:r>
+        <w:rPr>
+          <w:rFonts w:ascii="Arial" w:hAnsi="Arial" w:cs="Arial"/>
+          <w:sz w:val="22"/>
+          <w:lang w:val="en-GB" w:eastAsia="en-GB"/>
+        </w:rPr>
+        <w:t xml:space="preserve">128 map with several thousand placed world objects uses one </w:t>
       </w:r>
       <w:proofErr w:type="spellStart"/>
       <w:r>
@@ -8123,7 +8166,25 @@
           <w:sz w:val="22"/>
           <w:lang w:val="en-GB" w:eastAsia="en-GB"/>
         </w:rPr>
-        <w:t>The most significant technical achievement is the procedural generation pipeline. Implementing Bridson's Poisson disk sampling algorithm correctly</w:t>
+        <w:t xml:space="preserve">The most significant technical achievement is the procedural generation pipeline. Implementing </w:t>
+      </w:r>
+      <w:proofErr w:type="spellStart"/>
+      <w:r>
+        <w:rPr>
+          <w:rFonts w:ascii="Arial" w:hAnsi="Arial" w:cs="Arial"/>
+          <w:sz w:val="22"/>
+          <w:lang w:val="en-GB" w:eastAsia="en-GB"/>
+        </w:rPr>
+        <w:t>Bridson's</w:t>
+      </w:r>
+      <w:proofErr w:type="spellEnd"/>
+      <w:r>
+        <w:rPr>
+          <w:rFonts w:ascii="Arial" w:hAnsi="Arial" w:cs="Arial"/>
+          <w:sz w:val="22"/>
+          <w:lang w:val="en-GB" w:eastAsia="en-GB"/>
+        </w:rPr>
+        <w:t xml:space="preserve"> Poisson disk sampling algorithm correctly</w:t>
       </w:r>
       <w:r>
         <w:rPr>
@@ -8155,7 +8216,23 @@
           <w:sz w:val="22"/>
           <w:lang w:val="en-GB" w:eastAsia="en-GB"/>
         </w:rPr>
-        <w:t xml:space="preserve"> required careful study of the original paper and iterative debugging. The resulting 7.7x performance improvement over rejection sampling is a concrete, measurable outcome.</w:t>
+        <w:t xml:space="preserve"> required careful study of the original paper and iterative debugging. The resulting 7.7</w:t>
+      </w:r>
+      <w:r>
+        <w:rPr>
+          <w:rFonts w:ascii="Arial" w:hAnsi="Arial" w:cs="Arial"/>
+          <w:sz w:val="22"/>
+          <w:lang w:val="en-GB" w:eastAsia="en-GB"/>
+        </w:rPr>
+        <w:t>x</w:t>
+      </w:r>
+      <w:r>
+        <w:rPr>
+          <w:rFonts w:ascii="Arial" w:hAnsi="Arial" w:cs="Arial"/>
+          <w:sz w:val="22"/>
+          <w:lang w:val="en-GB" w:eastAsia="en-GB"/>
+        </w:rPr>
+        <w:t xml:space="preserve"> performance improvement over rejection sampling is a concrete, measurable outcome.</w:t>
       </w:r>
     </w:p>
     <w:p>
@@ -8626,7 +8703,25 @@
           <w:sz w:val="22"/>
           <w:lang w:val="en-GB" w:eastAsia="en-GB"/>
         </w:rPr>
-        <w:t xml:space="preserve">Time allocation for the enemy system was underestimated. Enemy AI and damage integration were deprioritised in favour of ensuring the architecture and generation systems were complete and demonstrable. In hindsight, a simpler enemy (e.g. basic directional movement with contact damage) should have been completed earlier as a proof of the </w:t>
+        <w:t>Time allocation for the enemy system was underestimated. Enemy AI and damage integration were deprioritised in favour of ensuring the architecture and generation systems were complete and demonstrable. In hindsight, a simpler enemy (</w:t>
+      </w:r>
+      <w:proofErr w:type="gramStart"/>
+      <w:r>
+        <w:rPr>
+          <w:rFonts w:ascii="Arial" w:hAnsi="Arial" w:cs="Arial"/>
+          <w:sz w:val="22"/>
+          <w:lang w:val="en-GB" w:eastAsia="en-GB"/>
+        </w:rPr>
+        <w:t>e.g.</w:t>
+      </w:r>
+      <w:proofErr w:type="gramEnd"/>
+      <w:r>
+        <w:rPr>
+          <w:rFonts w:ascii="Arial" w:hAnsi="Arial" w:cs="Arial"/>
+          <w:sz w:val="22"/>
+          <w:lang w:val="en-GB" w:eastAsia="en-GB"/>
+        </w:rPr>
+        <w:t xml:space="preserve"> basic directional movement with contact damage) should have been completed earlier as a proof of the </w:t>
       </w:r>
       <w:proofErr w:type="spellStart"/>
       <w:r>
@@ -8698,7 +8793,23 @@
           <w:sz w:val="22"/>
           <w:lang w:val="en-GB" w:eastAsia="en-GB"/>
         </w:rPr>
-        <w:t>The initial sprite building approach (creating 16,384 individual sprites for a 128×128 map) was not profiled before implementation. The resulting 25,472ms generation time was only discovered on running the code. A brief performance estimate before implementation would have flagged this approach as unviable.</w:t>
+        <w:t>The initial sprite building approach (creating 16,384 individual sprites for a 128</w:t>
+      </w:r>
+      <w:r>
+        <w:rPr>
+          <w:rFonts w:ascii="Arial" w:hAnsi="Arial" w:cs="Arial"/>
+          <w:sz w:val="22"/>
+          <w:lang w:val="en-GB" w:eastAsia="en-GB"/>
+        </w:rPr>
+        <w:t>x</w:t>
+      </w:r>
+      <w:r>
+        <w:rPr>
+          <w:rFonts w:ascii="Arial" w:hAnsi="Arial" w:cs="Arial"/>
+          <w:sz w:val="22"/>
+          <w:lang w:val="en-GB" w:eastAsia="en-GB"/>
+        </w:rPr>
+        <w:t>128 map) was not profiled before implementation. The resulting 25,472ms generation time was only discovered on running the code. A brief performance estimate before implementation would have flagged this approach as unviable.</w:t>
       </w:r>
     </w:p>
     <w:p>
@@ -8889,25 +9000,7 @@
           <w:sz w:val="22"/>
           <w:lang w:val="en-GB" w:eastAsia="en-GB"/>
         </w:rPr>
-        <w:t xml:space="preserve">variant and </w:t>
-      </w:r>
-      <w:proofErr w:type="gramStart"/>
-      <w:r>
-        <w:rPr>
-          <w:rFonts w:ascii="Arial" w:hAnsi="Arial" w:cs="Arial"/>
-          <w:sz w:val="22"/>
-          <w:lang w:val="en-GB" w:eastAsia="en-GB"/>
-        </w:rPr>
-        <w:t>std::</w:t>
-      </w:r>
-      <w:proofErr w:type="gramEnd"/>
-      <w:r>
-        <w:rPr>
-          <w:rFonts w:ascii="Arial" w:hAnsi="Arial" w:cs="Arial"/>
-          <w:sz w:val="22"/>
-          <w:lang w:val="en-GB" w:eastAsia="en-GB"/>
-        </w:rPr>
-        <w:t xml:space="preserve">visit </w:t>
+        <w:t xml:space="preserve">variant and std::visit </w:t>
       </w:r>
       <w:r>
         <w:rPr>
@@ -9029,7 +9122,25 @@
           <w:sz w:val="22"/>
           <w:lang w:val="en-GB" w:eastAsia="en-GB"/>
         </w:rPr>
-        <w:t>Thorns demonstrates that the Game Programming Patterns catalogue can be applied systematically and effectively to a C++17 game project, producing a codebase that is structurally sound, extensible, and measurably performant. Seven patterns were implemented, each addressing a distinct architectural concern: the Component pattern for entity composition, the Pushdown Automaton for stateful game flow, the Command pattern for input abstraction, the Flyweight for shared collision data, the Spatial Partition for O(1) nearest-site queries, the Update Method for per-frame component independence, and the Observer (pull) pattern for HUD data access.</w:t>
+        <w:t xml:space="preserve">Thorns demonstrates that the Game Programming Patterns catalogue can be applied systematically and effectively to a C++17 game project, producing a codebase that is structurally sound, extensible, and measurably performant. Seven patterns were implemented, each addressing a distinct architectural concern: the Component pattern for entity composition, the Pushdown Automaton for stateful game flow, the Command pattern for input abstraction, the Flyweight for shared collision data, the Spatial Partition for </w:t>
+      </w:r>
+      <w:proofErr w:type="gramStart"/>
+      <w:r>
+        <w:rPr>
+          <w:rFonts w:ascii="Arial" w:hAnsi="Arial" w:cs="Arial"/>
+          <w:sz w:val="22"/>
+          <w:lang w:val="en-GB" w:eastAsia="en-GB"/>
+        </w:rPr>
+        <w:t>O(</w:t>
+      </w:r>
+      <w:proofErr w:type="gramEnd"/>
+      <w:r>
+        <w:rPr>
+          <w:rFonts w:ascii="Arial" w:hAnsi="Arial" w:cs="Arial"/>
+          <w:sz w:val="22"/>
+          <w:lang w:val="en-GB" w:eastAsia="en-GB"/>
+        </w:rPr>
+        <w:t>1) nearest-site queries, the Update Method for per-frame component independence, and the Observer (pull) pattern for HUD data access.</w:t>
       </w:r>
     </w:p>
     <w:p>
@@ -9097,25 +9208,7 @@
           <w:sz w:val="22"/>
           <w:lang w:val="en-GB" w:eastAsia="en-GB"/>
         </w:rPr>
-        <w:t xml:space="preserve"> the enemy system is </w:t>
-      </w:r>
-      <w:proofErr w:type="gramStart"/>
-      <w:r>
-        <w:rPr>
-          <w:rFonts w:ascii="Arial" w:hAnsi="Arial" w:cs="Arial"/>
-          <w:sz w:val="22"/>
-          <w:lang w:val="en-GB" w:eastAsia="en-GB"/>
-        </w:rPr>
-        <w:t>incomplete</w:t>
-      </w:r>
-      <w:proofErr w:type="gramEnd"/>
-      <w:r>
-        <w:rPr>
-          <w:rFonts w:ascii="Arial" w:hAnsi="Arial" w:cs="Arial"/>
-          <w:sz w:val="22"/>
-          <w:lang w:val="en-GB" w:eastAsia="en-GB"/>
-        </w:rPr>
-        <w:t xml:space="preserve"> and the win/lose condition is not implemented. This is acknowledged and attributed to scope management rather than architectural limitation. The architecture itself is designed to accommodate these features: the </w:t>
+        <w:t xml:space="preserve"> the enemy system is incomplete and the win/lose condition is not implemented. This is acknowledged and attributed to scope management rather than architectural limitation. The architecture itself is designed to accommodate these features: the </w:t>
       </w:r>
       <w:proofErr w:type="spellStart"/>
       <w:r>
@@ -9403,7 +9496,7 @@
     </w:p>
     <w:p>
       <w:pPr>
-        <w:spacing w:after="140" w:line="240" w:lineRule="auto"/>
+        <w:spacing w:after="120" w:line="240" w:lineRule="auto"/>
         <w:rPr>
           <w:rFonts w:ascii="Arial" w:hAnsi="Arial" w:cs="Arial"/>
           <w:sz w:val="22"/>
@@ -9421,128 +9514,146 @@
     </w:p>
     <w:p>
       <w:pPr>
-        <w:spacing w:after="140" w:line="240" w:lineRule="auto"/>
-        <w:rPr>
-          <w:rFonts w:ascii="Arial" w:hAnsi="Arial" w:cs="Arial"/>
-          <w:sz w:val="22"/>
-          <w:lang w:val="en-GB" w:eastAsia="en-GB"/>
-        </w:rPr>
-      </w:pPr>
-      <w:r>
-        <w:rPr>
-          <w:rFonts w:ascii="Arial" w:hAnsi="Arial" w:cs="Arial"/>
-          <w:sz w:val="22"/>
-          <w:lang w:val="en-GB" w:eastAsia="en-GB"/>
-        </w:rPr>
-        <w:t xml:space="preserve">[2] Gamma, E., Helm, R., Johnson, R. and </w:t>
-      </w:r>
-      <w:proofErr w:type="spellStart"/>
-      <w:r>
-        <w:rPr>
-          <w:rFonts w:ascii="Arial" w:hAnsi="Arial" w:cs="Arial"/>
-          <w:sz w:val="22"/>
-          <w:lang w:val="en-GB" w:eastAsia="en-GB"/>
-        </w:rPr>
-        <w:t>Vlissides</w:t>
-      </w:r>
-      <w:proofErr w:type="spellEnd"/>
-      <w:r>
-        <w:rPr>
-          <w:rFonts w:ascii="Arial" w:hAnsi="Arial" w:cs="Arial"/>
-          <w:sz w:val="22"/>
-          <w:lang w:val="en-GB" w:eastAsia="en-GB"/>
-        </w:rPr>
-        <w:t>, J. (1994). Design Patterns: Elements of Reusable Object-Oriented Software. Addison-Wesley.</w:t>
+        <w:spacing w:after="120" w:line="240" w:lineRule="auto"/>
+        <w:rPr>
+          <w:rFonts w:ascii="Arial" w:hAnsi="Arial" w:cs="Arial"/>
+          <w:sz w:val="22"/>
+          <w:lang w:val="en-GB" w:eastAsia="en-GB"/>
+        </w:rPr>
+      </w:pPr>
+      <w:r>
+        <w:rPr>
+          <w:rFonts w:ascii="Arial" w:hAnsi="Arial" w:cs="Arial"/>
+          <w:sz w:val="22"/>
+          <w:lang w:val="en-GB" w:eastAsia="en-GB"/>
+        </w:rPr>
+        <w:t>[2] Perlin, K. (2002). Improving Noise. In Proceedings of SIGGRAPH 2002. ACM Press. Available at: http://mrl.nyu.edu/~perlin/paper445.pdf (Accessed: April 2026).</w:t>
       </w:r>
     </w:p>
     <w:p>
       <w:pPr>
-        <w:spacing w:after="140" w:line="240" w:lineRule="auto"/>
-        <w:rPr>
-          <w:rFonts w:ascii="Arial" w:hAnsi="Arial" w:cs="Arial"/>
-          <w:sz w:val="22"/>
-          <w:lang w:val="en-GB" w:eastAsia="en-GB"/>
-        </w:rPr>
-      </w:pPr>
-      <w:r>
-        <w:rPr>
-          <w:rFonts w:ascii="Arial" w:hAnsi="Arial" w:cs="Arial"/>
-          <w:sz w:val="22"/>
-          <w:lang w:val="en-GB" w:eastAsia="en-GB"/>
-        </w:rPr>
-        <w:t>[3] Shaker, N., Togelius, J. and Nelson, M.J. (2016). Procedural Content Generation in Games. Springer. Available at: http://pcgbook.com/ (Accessed: April 2026).</w:t>
+        <w:spacing w:after="120" w:line="240" w:lineRule="auto"/>
+        <w:rPr>
+          <w:rFonts w:ascii="Arial" w:hAnsi="Arial" w:cs="Arial"/>
+          <w:sz w:val="22"/>
+          <w:lang w:val="en-GB" w:eastAsia="en-GB"/>
+        </w:rPr>
+      </w:pPr>
+      <w:r>
+        <w:rPr>
+          <w:rFonts w:ascii="Arial" w:hAnsi="Arial" w:cs="Arial"/>
+          <w:sz w:val="22"/>
+          <w:lang w:val="en-GB" w:eastAsia="en-GB"/>
+        </w:rPr>
+        <w:t xml:space="preserve">[3] </w:t>
+      </w:r>
+      <w:proofErr w:type="spellStart"/>
+      <w:r>
+        <w:rPr>
+          <w:rFonts w:ascii="Arial" w:hAnsi="Arial" w:cs="Arial"/>
+          <w:sz w:val="22"/>
+          <w:lang w:val="en-GB" w:eastAsia="en-GB"/>
+        </w:rPr>
+        <w:t>Bridson</w:t>
+      </w:r>
+      <w:proofErr w:type="spellEnd"/>
+      <w:r>
+        <w:rPr>
+          <w:rFonts w:ascii="Arial" w:hAnsi="Arial" w:cs="Arial"/>
+          <w:sz w:val="22"/>
+          <w:lang w:val="en-GB" w:eastAsia="en-GB"/>
+        </w:rPr>
+        <w:t xml:space="preserve">, R. (2007). Fast Poisson Disk Sampling in Arbitrary Dimensions. ACM SIGGRAPH 2007 Sketches. Available at: https://dl.acm.org/doi/10.1145/1278780.1278807 </w:t>
       </w:r>
     </w:p>
     <w:p>
       <w:pPr>
-        <w:spacing w:after="140" w:line="240" w:lineRule="auto"/>
-        <w:rPr>
-          <w:rFonts w:ascii="Arial" w:hAnsi="Arial" w:cs="Arial"/>
-          <w:sz w:val="22"/>
-          <w:lang w:val="en-GB" w:eastAsia="en-GB"/>
-        </w:rPr>
-      </w:pPr>
-      <w:r>
-        <w:rPr>
-          <w:rFonts w:ascii="Arial" w:hAnsi="Arial" w:cs="Arial"/>
-          <w:sz w:val="22"/>
-          <w:lang w:val="en-GB" w:eastAsia="en-GB"/>
-        </w:rPr>
-        <w:t>[4] Perlin, K. (1985). An Image Synthesizer. ACM SIGGRAPH Computer Graphics, 19(3), pp.287–296.</w:t>
+        <w:spacing w:after="120" w:line="240" w:lineRule="auto"/>
+        <w:rPr>
+          <w:rFonts w:ascii="Arial" w:hAnsi="Arial" w:cs="Arial"/>
+          <w:sz w:val="22"/>
+          <w:lang w:val="en-GB" w:eastAsia="en-GB"/>
+        </w:rPr>
+      </w:pPr>
+      <w:r>
+        <w:rPr>
+          <w:rFonts w:ascii="Arial" w:hAnsi="Arial" w:cs="Arial"/>
+          <w:sz w:val="22"/>
+          <w:lang w:val="en-GB" w:eastAsia="en-GB"/>
+        </w:rPr>
+        <w:t xml:space="preserve">[4] Solarian Programmer. (2012). Perlin Noise in C++11. [Online]. Available at: https://solarianprogrammer.com/2012/07/18/perlin-noise-cpp-11/ </w:t>
       </w:r>
     </w:p>
     <w:p>
       <w:pPr>
-        <w:spacing w:after="140" w:line="240" w:lineRule="auto"/>
-        <w:rPr>
-          <w:rFonts w:ascii="Arial" w:hAnsi="Arial" w:cs="Arial"/>
-          <w:sz w:val="22"/>
-          <w:lang w:val="en-GB" w:eastAsia="en-GB"/>
-        </w:rPr>
-      </w:pPr>
-      <w:r>
-        <w:rPr>
-          <w:rFonts w:ascii="Arial" w:hAnsi="Arial" w:cs="Arial"/>
-          <w:sz w:val="22"/>
-          <w:lang w:val="en-GB" w:eastAsia="en-GB"/>
-        </w:rPr>
-        <w:t>[5] Perlin, K. (2002). Improving Noise. ACM SIGGRAPH 2002. Available at: http://mrl.nyu.edu/~perlin/paper445.pdf (Accessed: April 2026).</w:t>
+        <w:spacing w:after="120" w:line="240" w:lineRule="auto"/>
+        <w:rPr>
+          <w:rFonts w:ascii="Arial" w:hAnsi="Arial" w:cs="Arial"/>
+          <w:sz w:val="22"/>
+          <w:lang w:val="en-GB" w:eastAsia="en-GB"/>
+        </w:rPr>
+      </w:pPr>
+      <w:r>
+        <w:rPr>
+          <w:rFonts w:ascii="Arial" w:hAnsi="Arial" w:cs="Arial"/>
+          <w:sz w:val="22"/>
+          <w:lang w:val="en-GB" w:eastAsia="en-GB"/>
+        </w:rPr>
+        <w:t xml:space="preserve">[5] leatherbee.org. (2018). Terrain Generation 3 Voronoi Diagrams. [Online]. Available at: https://leatherbee.org/index.php/2018/10/06/terrain-generation-3-voronoi-diagrams/ </w:t>
       </w:r>
     </w:p>
     <w:p>
       <w:pPr>
-        <w:spacing w:after="140" w:line="240" w:lineRule="auto"/>
-        <w:rPr>
-          <w:rFonts w:ascii="Arial" w:hAnsi="Arial" w:cs="Arial"/>
-          <w:sz w:val="22"/>
-          <w:lang w:val="en-GB" w:eastAsia="en-GB"/>
-        </w:rPr>
-      </w:pPr>
-      <w:r>
-        <w:rPr>
-          <w:rFonts w:ascii="Arial" w:hAnsi="Arial" w:cs="Arial"/>
-          <w:sz w:val="22"/>
-          <w:lang w:val="en-GB" w:eastAsia="en-GB"/>
-        </w:rPr>
-        <w:t>[6] Bridson, R. (2007). Fast Poisson Disk Sampling in Arbitrary Dimensions. ACM SIGGRAPH 2007 Sketches. Available at: https://dl.acm.org/doi/10.1145/1278780.1278807 (Accessed: April 2026).</w:t>
+        <w:spacing w:after="120" w:line="240" w:lineRule="auto"/>
+        <w:rPr>
+          <w:rFonts w:ascii="Arial" w:hAnsi="Arial" w:cs="Arial"/>
+          <w:sz w:val="22"/>
+          <w:lang w:val="en-GB" w:eastAsia="en-GB"/>
+        </w:rPr>
+      </w:pPr>
+      <w:r>
+        <w:rPr>
+          <w:rFonts w:ascii="Arial" w:hAnsi="Arial" w:cs="Arial"/>
+          <w:sz w:val="22"/>
+          <w:lang w:val="en-GB" w:eastAsia="en-GB"/>
+        </w:rPr>
+        <w:t xml:space="preserve">[6] </w:t>
+      </w:r>
+      <w:proofErr w:type="spellStart"/>
+      <w:r>
+        <w:rPr>
+          <w:rFonts w:ascii="Arial" w:hAnsi="Arial" w:cs="Arial"/>
+          <w:sz w:val="22"/>
+          <w:lang w:val="en-GB" w:eastAsia="en-GB"/>
+        </w:rPr>
+        <w:t>GeeksforGeeks</w:t>
+      </w:r>
+      <w:proofErr w:type="spellEnd"/>
+      <w:r>
+        <w:rPr>
+          <w:rFonts w:ascii="Arial" w:hAnsi="Arial" w:cs="Arial"/>
+          <w:sz w:val="22"/>
+          <w:lang w:val="en-GB" w:eastAsia="en-GB"/>
+        </w:rPr>
+        <w:t xml:space="preserve">. Voronoi Diagram. [Online]. Available at: https://www.geeksforgeeks.org/dsa/voronoi-diagram/ </w:t>
       </w:r>
     </w:p>
     <w:p>
       <w:pPr>
-        <w:spacing w:after="140" w:line="240" w:lineRule="auto"/>
-        <w:rPr>
-          <w:rFonts w:ascii="Arial" w:hAnsi="Arial" w:cs="Arial"/>
-          <w:sz w:val="22"/>
-          <w:lang w:val="en-GB" w:eastAsia="en-GB"/>
-        </w:rPr>
-      </w:pPr>
-      <w:r>
-        <w:rPr>
-          <w:rFonts w:ascii="Arial" w:hAnsi="Arial" w:cs="Arial"/>
-          <w:sz w:val="22"/>
-          <w:lang w:val="en-GB" w:eastAsia="en-GB"/>
-        </w:rPr>
-        <w:t xml:space="preserve">[7] Fortune, S. (1987). A </w:t>
+        <w:spacing w:after="120" w:line="240" w:lineRule="auto"/>
+        <w:rPr>
+          <w:rFonts w:ascii="Arial" w:hAnsi="Arial" w:cs="Arial"/>
+          <w:sz w:val="22"/>
+          <w:lang w:val="en-GB" w:eastAsia="en-GB"/>
+        </w:rPr>
+      </w:pPr>
+      <w:r>
+        <w:rPr>
+          <w:rFonts w:ascii="Arial" w:hAnsi="Arial" w:cs="Arial"/>
+          <w:sz w:val="22"/>
+          <w:lang w:val="en-GB" w:eastAsia="en-GB"/>
+        </w:rPr>
+        <w:t xml:space="preserve">[7] </w:t>
       </w:r>
       <w:proofErr w:type="spellStart"/>
       <w:r>
@@ -9551,7 +9662,7 @@
           <w:sz w:val="22"/>
           <w:lang w:val="en-GB" w:eastAsia="en-GB"/>
         </w:rPr>
-        <w:t>Sweepline</w:t>
+        <w:t>Cherno</w:t>
       </w:r>
       <w:proofErr w:type="spellEnd"/>
       <w:r>
@@ -9560,16 +9671,26 @@
           <w:sz w:val="22"/>
           <w:lang w:val="en-GB" w:eastAsia="en-GB"/>
         </w:rPr>
-        <w:t xml:space="preserve"> Algorithm for Voronoi Diagrams. </w:t>
+        <w:t xml:space="preserve">. (2022). </w:t>
+      </w:r>
+      <w:proofErr w:type="gramStart"/>
+      <w:r>
+        <w:rPr>
+          <w:rFonts w:ascii="Arial" w:hAnsi="Arial" w:cs="Arial"/>
+          <w:sz w:val="22"/>
+          <w:lang w:val="en-GB" w:eastAsia="en-GB"/>
+        </w:rPr>
+        <w:t>std::</w:t>
       </w:r>
       <w:proofErr w:type="spellStart"/>
-      <w:r>
-        <w:rPr>
-          <w:rFonts w:ascii="Arial" w:hAnsi="Arial" w:cs="Arial"/>
-          <w:sz w:val="22"/>
-          <w:lang w:val="en-GB" w:eastAsia="en-GB"/>
-        </w:rPr>
-        <w:t>Algorithmica</w:t>
+      <w:proofErr w:type="gramEnd"/>
+      <w:r>
+        <w:rPr>
+          <w:rFonts w:ascii="Arial" w:hAnsi="Arial" w:cs="Arial"/>
+          <w:sz w:val="22"/>
+          <w:lang w:val="en-GB" w:eastAsia="en-GB"/>
+        </w:rPr>
+        <w:t>unordered_map</w:t>
       </w:r>
       <w:proofErr w:type="spellEnd"/>
       <w:r>
@@ -9578,241 +9699,127 @@
           <w:sz w:val="22"/>
           <w:lang w:val="en-GB" w:eastAsia="en-GB"/>
         </w:rPr>
-        <w:t>, 2(1–4), pp.153–174.</w:t>
+        <w:t xml:space="preserve"> in C++. [Online]. Available at: https://youtu.be/KiB0vRi2wlc?si=c__NeniIIIjXwTsD </w:t>
       </w:r>
     </w:p>
     <w:p>
       <w:pPr>
-        <w:spacing w:after="140"/>
-      </w:pPr>
-      <w:r>
-        <w:rPr>
-          <w:rFonts w:ascii="Arial" w:hAnsi="Arial" w:cs="Arial"/>
-          <w:sz w:val="22"/>
-        </w:rPr>
-        <w:t>[8] Ericson, C. (2005). Real-Time Collision Detection. Morgan Kaufmann.</w:t>
+        <w:spacing w:after="120" w:line="240" w:lineRule="auto"/>
+        <w:rPr>
+          <w:rFonts w:ascii="Arial" w:hAnsi="Arial" w:cs="Arial"/>
+          <w:sz w:val="22"/>
+          <w:lang w:val="en-GB" w:eastAsia="en-GB"/>
+        </w:rPr>
+      </w:pPr>
+      <w:r>
+        <w:rPr>
+          <w:rFonts w:ascii="Arial" w:hAnsi="Arial" w:cs="Arial"/>
+          <w:sz w:val="22"/>
+          <w:lang w:val="en-GB" w:eastAsia="en-GB"/>
+        </w:rPr>
+        <w:t xml:space="preserve">[8] </w:t>
+      </w:r>
+      <w:proofErr w:type="spellStart"/>
+      <w:r>
+        <w:rPr>
+          <w:rFonts w:ascii="Arial" w:hAnsi="Arial" w:cs="Arial"/>
+          <w:sz w:val="22"/>
+          <w:lang w:val="en-GB" w:eastAsia="en-GB"/>
+        </w:rPr>
+        <w:t>Pezzotti</w:t>
+      </w:r>
+      <w:proofErr w:type="spellEnd"/>
+      <w:r>
+        <w:rPr>
+          <w:rFonts w:ascii="Arial" w:hAnsi="Arial" w:cs="Arial"/>
+          <w:sz w:val="22"/>
+          <w:lang w:val="en-GB" w:eastAsia="en-GB"/>
+        </w:rPr>
+        <w:t>, J. (2020). Poisson Disk Sampling. [Online Video]. Available at: https://youtu.be/jofUe3Kjag4?si=HnIRv3t2Yv7CT_Gq</w:t>
       </w:r>
     </w:p>
     <w:p>
       <w:pPr>
-        <w:spacing w:after="140"/>
-      </w:pPr>
-      <w:r>
-        <w:rPr>
-          <w:rFonts w:ascii="Arial" w:hAnsi="Arial" w:cs="Arial"/>
-          <w:sz w:val="22"/>
-        </w:rPr>
-        <w:t>[9] Gregory, J. (2018). Game Engine Architecture. 3rd ed. CRC Press.</w:t>
+        <w:spacing w:after="120" w:line="240" w:lineRule="auto"/>
+        <w:rPr>
+          <w:rFonts w:ascii="Arial" w:hAnsi="Arial" w:cs="Arial"/>
+          <w:sz w:val="22"/>
+          <w:lang w:val="en-GB" w:eastAsia="en-GB"/>
+        </w:rPr>
+      </w:pPr>
+      <w:r>
+        <w:rPr>
+          <w:rFonts w:ascii="Arial" w:hAnsi="Arial" w:cs="Arial"/>
+          <w:sz w:val="22"/>
+          <w:lang w:val="en-GB" w:eastAsia="en-GB"/>
+        </w:rPr>
+        <w:t xml:space="preserve">[9] SFML Development Team. (2024). SFML 3.0 Documentation. [Online]. Available at: https://www.sfml-dev.org/ </w:t>
       </w:r>
     </w:p>
     <w:p>
       <w:pPr>
-        <w:spacing w:after="140"/>
-      </w:pPr>
-      <w:r>
-        <w:rPr>
-          <w:rFonts w:ascii="Arial" w:hAnsi="Arial" w:cs="Arial"/>
-          <w:sz w:val="22"/>
-        </w:rPr>
-        <w:t>[10] Solarian Programmer. (2012). Perlin Noise in C++11. [Online]. Available at: https://solarianprogrammer.com/2012/07/18/perlin-noise-cpp-11/ (Accessed: April 2026).</w:t>
+        <w:spacing w:after="120" w:line="240" w:lineRule="auto"/>
+        <w:rPr>
+          <w:rFonts w:ascii="Arial" w:hAnsi="Arial" w:cs="Arial"/>
+          <w:sz w:val="22"/>
+          <w:lang w:val="en-GB" w:eastAsia="en-GB"/>
+        </w:rPr>
+      </w:pPr>
+      <w:r>
+        <w:rPr>
+          <w:rFonts w:ascii="Arial" w:hAnsi="Arial" w:cs="Arial"/>
+          <w:sz w:val="22"/>
+          <w:lang w:val="en-GB" w:eastAsia="en-GB"/>
+        </w:rPr>
+        <w:t xml:space="preserve">[10] </w:t>
+      </w:r>
+      <w:proofErr w:type="spellStart"/>
+      <w:r>
+        <w:rPr>
+          <w:rFonts w:ascii="Arial" w:hAnsi="Arial" w:cs="Arial"/>
+          <w:sz w:val="22"/>
+          <w:lang w:val="en-GB" w:eastAsia="en-GB"/>
+        </w:rPr>
+        <w:t>tmxlite</w:t>
+      </w:r>
+      <w:proofErr w:type="spellEnd"/>
+      <w:r>
+        <w:rPr>
+          <w:rFonts w:ascii="Arial" w:hAnsi="Arial" w:cs="Arial"/>
+          <w:sz w:val="22"/>
+          <w:lang w:val="en-GB" w:eastAsia="en-GB"/>
+        </w:rPr>
+        <w:t xml:space="preserve"> Contributors. </w:t>
+      </w:r>
+      <w:proofErr w:type="spellStart"/>
+      <w:r>
+        <w:rPr>
+          <w:rFonts w:ascii="Arial" w:hAnsi="Arial" w:cs="Arial"/>
+          <w:sz w:val="22"/>
+          <w:lang w:val="en-GB" w:eastAsia="en-GB"/>
+        </w:rPr>
+        <w:t>tmxlite</w:t>
+      </w:r>
+      <w:proofErr w:type="spellEnd"/>
+      <w:r>
+        <w:rPr>
+          <w:rFonts w:ascii="Arial" w:hAnsi="Arial" w:cs="Arial"/>
+          <w:sz w:val="22"/>
+          <w:lang w:val="en-GB" w:eastAsia="en-GB"/>
+        </w:rPr>
+        <w:t xml:space="preserve"> Library. [Online]. Available at: https://github.com/fallahn/tmxlite </w:t>
       </w:r>
     </w:p>
     <w:p>
       <w:pPr>
-        <w:spacing w:after="140"/>
-      </w:pPr>
-      <w:r>
-        <w:rPr>
-          <w:rFonts w:ascii="Arial" w:hAnsi="Arial" w:cs="Arial"/>
-          <w:sz w:val="22"/>
-        </w:rPr>
-        <w:t>[11] leatherbee.org. (2018). Terrain Generation 3</w:t>
-      </w:r>
-      <w:r>
-        <w:rPr>
-          <w:rFonts w:ascii="Arial" w:hAnsi="Arial" w:cs="Arial"/>
-          <w:sz w:val="22"/>
-        </w:rPr>
-        <w:t>:</w:t>
-      </w:r>
-      <w:r>
-        <w:rPr>
-          <w:rFonts w:ascii="Arial" w:hAnsi="Arial" w:cs="Arial"/>
-          <w:sz w:val="22"/>
-        </w:rPr>
-        <w:t xml:space="preserve"> Voronoi Diagrams. [Online]. Available at: https://leatherbee.org/index.php/2018/10/06/terrain-generation-3-voronoi-diagrams/ (Accessed: April 2026).</w:t>
-      </w:r>
+        <w:spacing w:after="140" w:line="240" w:lineRule="auto"/>
+        <w:rPr>
+          <w:rFonts w:ascii="Arial" w:hAnsi="Arial" w:cs="Arial"/>
+          <w:sz w:val="22"/>
+          <w:lang w:val="en-GB" w:eastAsia="en-GB"/>
+        </w:rPr>
+      </w:pPr>
     </w:p>
-    <w:p>
-      <w:pPr>
-        <w:spacing w:after="140"/>
-      </w:pPr>
-      <w:r>
-        <w:rPr>
-          <w:rFonts w:ascii="Arial" w:hAnsi="Arial" w:cs="Arial"/>
-          <w:sz w:val="22"/>
-        </w:rPr>
-        <w:t xml:space="preserve">[12] </w:t>
-      </w:r>
-      <w:proofErr w:type="spellStart"/>
-      <w:r>
-        <w:rPr>
-          <w:rFonts w:ascii="Arial" w:hAnsi="Arial" w:cs="Arial"/>
-          <w:sz w:val="22"/>
-        </w:rPr>
-        <w:t>GeeksforGeeks</w:t>
-      </w:r>
-      <w:proofErr w:type="spellEnd"/>
-      <w:r>
-        <w:rPr>
-          <w:rFonts w:ascii="Arial" w:hAnsi="Arial" w:cs="Arial"/>
-          <w:sz w:val="22"/>
-        </w:rPr>
-        <w:t>. Voronoi Diagram. [Online]. Available at: https://www.geeksforgeeks.org/dsa/voronoi-diagram/ (Accessed: April 2026).</w:t>
-      </w:r>
-    </w:p>
-    <w:p>
-      <w:pPr>
-        <w:spacing w:after="140"/>
-      </w:pPr>
-      <w:r>
-        <w:rPr>
-          <w:rFonts w:ascii="Arial" w:hAnsi="Arial" w:cs="Arial"/>
-          <w:sz w:val="22"/>
-        </w:rPr>
-        <w:t>[13] Pezzotti, J. (2020). Poisson Disk Sampling Visualisation. YouTube. Available at: https://youtu.be/jofUe3Kjag4 (Accessed: April 2026).</w:t>
-      </w:r>
-    </w:p>
-    <w:p>
-      <w:pPr>
-        <w:spacing w:after="140"/>
-      </w:pPr>
-      <w:r>
-        <w:rPr>
-          <w:rFonts w:ascii="Arial" w:hAnsi="Arial" w:cs="Arial"/>
-          <w:sz w:val="22"/>
-        </w:rPr>
-        <w:t xml:space="preserve">[14] Cherno. (2022). </w:t>
-      </w:r>
-      <w:proofErr w:type="gramStart"/>
-      <w:r>
-        <w:rPr>
-          <w:rFonts w:ascii="Arial" w:hAnsi="Arial" w:cs="Arial"/>
-          <w:sz w:val="22"/>
-        </w:rPr>
-        <w:t>std::</w:t>
-      </w:r>
-      <w:proofErr w:type="spellStart"/>
-      <w:proofErr w:type="gramEnd"/>
-      <w:r>
-        <w:rPr>
-          <w:rFonts w:ascii="Arial" w:hAnsi="Arial" w:cs="Arial"/>
-          <w:sz w:val="22"/>
-        </w:rPr>
-        <w:t>unordered_map</w:t>
-      </w:r>
-      <w:proofErr w:type="spellEnd"/>
-      <w:r>
-        <w:rPr>
-          <w:rFonts w:ascii="Arial" w:hAnsi="Arial" w:cs="Arial"/>
-          <w:sz w:val="22"/>
-        </w:rPr>
-        <w:t xml:space="preserve"> in C++. YouTube. Available at: https://youtu.be/KiB0vRi2wlc (Accessed: April 2026).</w:t>
-      </w:r>
-    </w:p>
-    <w:p>
-      <w:pPr>
-        <w:spacing w:after="140"/>
-      </w:pPr>
-      <w:r>
-        <w:rPr>
-          <w:rFonts w:ascii="Arial" w:hAnsi="Arial" w:cs="Arial"/>
-          <w:sz w:val="22"/>
-        </w:rPr>
-        <w:t>[15] SFML Development Team. (2024). SFML 3.0 Documentation. [Online]. Available at: https://www.sfml-dev.org/ (Accessed: April 2026).</w:t>
-      </w:r>
-    </w:p>
-    <w:p>
-      <w:pPr>
-        <w:spacing w:after="140" w:line="240" w:lineRule="auto"/>
-        <w:rPr>
-          <w:rFonts w:ascii="Arial" w:hAnsi="Arial" w:cs="Arial"/>
-          <w:sz w:val="22"/>
-          <w:lang w:val="en-GB" w:eastAsia="en-GB"/>
-        </w:rPr>
-      </w:pPr>
-      <w:r>
-        <w:rPr>
-          <w:rFonts w:ascii="Arial" w:hAnsi="Arial" w:cs="Arial"/>
-          <w:sz w:val="22"/>
-        </w:rPr>
-        <w:t xml:space="preserve">[16] </w:t>
-      </w:r>
-      <w:proofErr w:type="spellStart"/>
-      <w:r>
-        <w:rPr>
-          <w:rFonts w:ascii="Arial" w:hAnsi="Arial" w:cs="Arial"/>
-          <w:sz w:val="22"/>
-        </w:rPr>
-        <w:t>tmxlite</w:t>
-      </w:r>
-      <w:proofErr w:type="spellEnd"/>
-      <w:r>
-        <w:rPr>
-          <w:rFonts w:ascii="Arial" w:hAnsi="Arial" w:cs="Arial"/>
-          <w:sz w:val="22"/>
-        </w:rPr>
-        <w:t xml:space="preserve"> Contributors. </w:t>
-      </w:r>
-      <w:proofErr w:type="spellStart"/>
-      <w:r>
-        <w:rPr>
-          <w:rFonts w:ascii="Arial" w:hAnsi="Arial" w:cs="Arial"/>
-          <w:sz w:val="22"/>
-        </w:rPr>
-        <w:t>tmxlite</w:t>
-      </w:r>
-      <w:proofErr w:type="spellEnd"/>
-      <w:r>
-        <w:rPr>
-          <w:rFonts w:ascii="Arial" w:hAnsi="Arial" w:cs="Arial"/>
-          <w:sz w:val="22"/>
-        </w:rPr>
-        <w:t xml:space="preserve"> Library. [Online]. Available at: https://github.com/fallahn/tmxlite (Accessed: April 2026).</w:t>
-      </w:r>
-    </w:p>
-    <w:p>
-      <w:pPr>
-        <w:spacing w:after="140" w:line="240" w:lineRule="auto"/>
-        <w:rPr>
-          <w:rFonts w:ascii="Arial" w:hAnsi="Arial" w:cs="Arial"/>
-          <w:sz w:val="22"/>
-          <w:lang w:val="en-GB" w:eastAsia="en-GB"/>
-        </w:rPr>
-      </w:pPr>
-    </w:p>
-    <w:p>
-      <w:pPr>
-        <w:spacing w:after="140" w:line="240" w:lineRule="auto"/>
-        <w:rPr>
-          <w:rFonts w:ascii="Arial" w:hAnsi="Arial" w:cs="Arial"/>
-          <w:sz w:val="22"/>
-          <w:lang w:val="en-GB" w:eastAsia="en-GB"/>
-        </w:rPr>
-      </w:pPr>
-    </w:p>
-    <w:p>
-      <w:pPr>
-        <w:spacing w:after="140" w:line="240" w:lineRule="auto"/>
-        <w:rPr>
-          <w:rFonts w:ascii="Arial" w:hAnsi="Arial" w:cs="Arial"/>
-          <w:sz w:val="22"/>
-          <w:lang w:val="en-GB" w:eastAsia="en-GB"/>
-        </w:rPr>
-      </w:pPr>
-    </w:p>
-    <w:p/>
-    <w:p/>
     <w:sectPr>
       <w:headerReference w:type="default" r:id="rId15"/>
       <w:footerReference w:type="default" r:id="rId16"/>
@@ -9830,7 +9837,7 @@
 </file>
 
 <file path=word/endnotes.xml><?xml version="1.0" encoding="utf-8"?>
-<w:endnotes xmlns:wpc="http://schemas.microsoft.com/office/word/2010/wordprocessingCanvas" xmlns:cx="http://schemas.microsoft.com/office/drawing/2014/chartex" xmlns:cx1="http://schemas.microsoft.com/office/drawing/2015/9/8/chartex" xmlns:cx2="http://schemas.microsoft.com/office/drawing/2015/10/21/chartex" xmlns:cx3="http://schemas.microsoft.com/office/drawing/2016/5/9/chartex" xmlns:cx4="http://schemas.microsoft.com/office/drawing/2016/5/10/chartex" xmlns:cx5="http://schemas.microsoft.com/office/drawing/2016/5/11/chartex" xmlns:cx6="http://schemas.microsoft.com/office/drawing/2016/5/12/chartex" xmlns:cx7="http://schemas.microsoft.com/office/drawing/2016/5/13/chartex" xmlns:cx8="http://schemas.microsoft.com/office/drawing/2016/5/14/chartex" xmlns:mc="http://schemas.openxmlformats.org/markup-compatibility/2006" xmlns:aink="http://schemas.microsoft.com/office/drawing/2016/ink" xmlns:am3d="http://schemas.microsoft.com/office/drawing/2017/model3d" xmlns:o="urn:schemas-microsoft-com:office:office" xmlns:oel="http://schemas.microsoft.com/office/2019/extlst" xmlns:r="http://schemas.openxmlformats.org/officeDocument/2006/relationships" xmlns:m="http://schemas.openxmlformats.org/officeDocument/2006/math" xmlns:v="urn:schemas-microsoft-com:vml" xmlns:wp14="http://schemas.microsoft.com/office/word/2010/wordprocessingDrawing" xmlns:wp="http://schemas.openxmlformats.org/drawingml/2006/wordprocessingDrawing" xmlns:w10="urn:schemas-microsoft-com:office:word" xmlns:w="http://schemas.openxmlformats.org/wordprocessingml/2006/main" xmlns:w14="http://schemas.microsoft.com/office/word/2010/wordml" xmlns:w15="http://schemas.microsoft.com/office/word/2012/wordml" xmlns:w16cex="http://schemas.microsoft.com/office/word/2018/wordml/cex" xmlns:w16cid="http://schemas.microsoft.com/office/word/2016/wordml/cid" xmlns:w16="http://schemas.microsoft.com/office/word/2018/wordml" xmlns:w16du="http://schemas.microsoft.com/office/word/2023/wordml/word16du" xmlns:w16sdtdh="http://schemas.microsoft.com/office/word/2020/wordml/sdtdatahash" xmlns:w16sdtfl="http://schemas.microsoft.com/office/word/2024/wordml/sdtformatlock" xmlns:w16se="http://schemas.microsoft.com/office/word/2015/wordml/symex" xmlns:wpg="http://schemas.microsoft.com/office/word/2010/wordprocessingGroup" xmlns:wpi="http://schemas.microsoft.com/office/word/2010/wordprocessingInk" xmlns:wne="http://schemas.microsoft.com/office/word/2006/wordml" xmlns:wps="http://schemas.microsoft.com/office/word/2010/wordprocessingShape" mc:Ignorable="w14 w15 w16se w16cid w16 w16cex w16sdtdh w16sdtfl w16du wp14">
+<w:endnotes xmlns:wpc="http://schemas.microsoft.com/office/word/2010/wordprocessingCanvas" xmlns:cx="http://schemas.microsoft.com/office/drawing/2014/chartex" xmlns:cx1="http://schemas.microsoft.com/office/drawing/2015/9/8/chartex" xmlns:cx2="http://schemas.microsoft.com/office/drawing/2015/10/21/chartex" xmlns:cx3="http://schemas.microsoft.com/office/drawing/2016/5/9/chartex" xmlns:cx4="http://schemas.microsoft.com/office/drawing/2016/5/10/chartex" xmlns:cx5="http://schemas.microsoft.com/office/drawing/2016/5/11/chartex" xmlns:cx6="http://schemas.microsoft.com/office/drawing/2016/5/12/chartex" xmlns:cx7="http://schemas.microsoft.com/office/drawing/2016/5/13/chartex" xmlns:cx8="http://schemas.microsoft.com/office/drawing/2016/5/14/chartex" xmlns:mc="http://schemas.openxmlformats.org/markup-compatibility/2006" xmlns:aink="http://schemas.microsoft.com/office/drawing/2016/ink" xmlns:am3d="http://schemas.microsoft.com/office/drawing/2017/model3d" xmlns:o="urn:schemas-microsoft-com:office:office" xmlns:r="http://schemas.openxmlformats.org/officeDocument/2006/relationships" xmlns:m="http://schemas.openxmlformats.org/officeDocument/2006/math" xmlns:v="urn:schemas-microsoft-com:vml" xmlns:wp14="http://schemas.microsoft.com/office/word/2010/wordprocessingDrawing" xmlns:wp="http://schemas.openxmlformats.org/drawingml/2006/wordprocessingDrawing" xmlns:w10="urn:schemas-microsoft-com:office:word" xmlns:w="http://schemas.openxmlformats.org/wordprocessingml/2006/main" xmlns:w14="http://schemas.microsoft.com/office/word/2010/wordml" xmlns:w15="http://schemas.microsoft.com/office/word/2012/wordml" xmlns:w16cex="http://schemas.microsoft.com/office/word/2018/wordml/cex" xmlns:w16cid="http://schemas.microsoft.com/office/word/2016/wordml/cid" xmlns:w16="http://schemas.microsoft.com/office/word/2018/wordml" xmlns:w16sdtdh="http://schemas.microsoft.com/office/word/2020/wordml/sdtdatahash" xmlns:w16se="http://schemas.microsoft.com/office/word/2015/wordml/symex" xmlns:wpg="http://schemas.microsoft.com/office/word/2010/wordprocessingGroup" xmlns:wpi="http://schemas.microsoft.com/office/word/2010/wordprocessingInk" xmlns:wne="http://schemas.microsoft.com/office/word/2006/wordml" xmlns:wps="http://schemas.microsoft.com/office/word/2010/wordprocessingShape" mc:Ignorable="w14 w15 w16se w16cid w16 w16cex w16sdtdh wp14">
   <w:endnote w:type="separator" w:id="-1">
     <w:p>
       <w:pPr>
@@ -9855,78 +9862,245 @@
 </file>
 
 <file path=word/footer1.xml><?xml version="1.0" encoding="utf-8"?>
-<w:ftr xmlns:wpc="http://schemas.microsoft.com/office/word/2010/wordprocessingCanvas" xmlns:cx="http://schemas.microsoft.com/office/drawing/2014/chartex" xmlns:cx1="http://schemas.microsoft.com/office/drawing/2015/9/8/chartex" xmlns:cx2="http://schemas.microsoft.com/office/drawing/2015/10/21/chartex" xmlns:cx3="http://schemas.microsoft.com/office/drawing/2016/5/9/chartex" xmlns:cx4="http://schemas.microsoft.com/office/drawing/2016/5/10/chartex" xmlns:cx5="http://schemas.microsoft.com/office/drawing/2016/5/11/chartex" xmlns:cx6="http://schemas.microsoft.com/office/drawing/2016/5/12/chartex" xmlns:cx7="http://schemas.microsoft.com/office/drawing/2016/5/13/chartex" xmlns:cx8="http://schemas.microsoft.com/office/drawing/2016/5/14/chartex" xmlns:mc="http://schemas.openxmlformats.org/markup-compatibility/2006" xmlns:aink="http://schemas.microsoft.com/office/drawing/2016/ink" xmlns:am3d="http://schemas.microsoft.com/office/drawing/2017/model3d" xmlns:o="urn:schemas-microsoft-com:office:office" xmlns:oel="http://schemas.microsoft.com/office/2019/extlst" xmlns:r="http://schemas.openxmlformats.org/officeDocument/2006/relationships" xmlns:m="http://schemas.openxmlformats.org/officeDocument/2006/math" xmlns:v="urn:schemas-microsoft-com:vml" xmlns:wp14="http://schemas.microsoft.com/office/word/2010/wordprocessingDrawing" xmlns:wp="http://schemas.openxmlformats.org/drawingml/2006/wordprocessingDrawing" xmlns:w10="urn:schemas-microsoft-com:office:word" xmlns:w="http://schemas.openxmlformats.org/wordprocessingml/2006/main" xmlns:w14="http://schemas.microsoft.com/office/word/2010/wordml" xmlns:w15="http://schemas.microsoft.com/office/word/2012/wordml" xmlns:w16cex="http://schemas.microsoft.com/office/word/2018/wordml/cex" xmlns:w16cid="http://schemas.microsoft.com/office/word/2016/wordml/cid" xmlns:w16="http://schemas.microsoft.com/office/word/2018/wordml" xmlns:w16du="http://schemas.microsoft.com/office/word/2023/wordml/word16du" xmlns:w16sdtdh="http://schemas.microsoft.com/office/word/2020/wordml/sdtdatahash" xmlns:w16sdtfl="http://schemas.microsoft.com/office/word/2024/wordml/sdtformatlock" xmlns:w16se="http://schemas.microsoft.com/office/word/2015/wordml/symex" xmlns:wpg="http://schemas.microsoft.com/office/word/2010/wordprocessingGroup" xmlns:wpi="http://schemas.microsoft.com/office/word/2010/wordprocessingInk" xmlns:wne="http://schemas.microsoft.com/office/word/2006/wordml" xmlns:wps="http://schemas.microsoft.com/office/word/2010/wordprocessingShape" mc:Ignorable="w14 w15 w16se w16cid w16 w16cex w16sdtdh w16sdtfl w16du wp14">
+<w:ftr xmlns:wpc="http://schemas.microsoft.com/office/word/2010/wordprocessingCanvas" xmlns:cx="http://schemas.microsoft.com/office/drawing/2014/chartex" xmlns:cx1="http://schemas.microsoft.com/office/drawing/2015/9/8/chartex" xmlns:cx2="http://schemas.microsoft.com/office/drawing/2015/10/21/chartex" xmlns:cx3="http://schemas.microsoft.com/office/drawing/2016/5/9/chartex" xmlns:cx4="http://schemas.microsoft.com/office/drawing/2016/5/10/chartex" xmlns:cx5="http://schemas.microsoft.com/office/drawing/2016/5/11/chartex" xmlns:cx6="http://schemas.microsoft.com/office/drawing/2016/5/12/chartex" xmlns:cx7="http://schemas.microsoft.com/office/drawing/2016/5/13/chartex" xmlns:cx8="http://schemas.microsoft.com/office/drawing/2016/5/14/chartex" xmlns:mc="http://schemas.openxmlformats.org/markup-compatibility/2006" xmlns:aink="http://schemas.microsoft.com/office/drawing/2016/ink" xmlns:am3d="http://schemas.microsoft.com/office/drawing/2017/model3d" xmlns:o="urn:schemas-microsoft-com:office:office" xmlns:r="http://schemas.openxmlformats.org/officeDocument/2006/relationships" xmlns:m="http://schemas.openxmlformats.org/officeDocument/2006/math" xmlns:v="urn:schemas-microsoft-com:vml" xmlns:wp14="http://schemas.microsoft.com/office/word/2010/wordprocessingDrawing" xmlns:wp="http://schemas.openxmlformats.org/drawingml/2006/wordprocessingDrawing" xmlns:w10="urn:schemas-microsoft-com:office:word" xmlns:w="http://schemas.openxmlformats.org/wordprocessingml/2006/main" xmlns:w14="http://schemas.microsoft.com/office/word/2010/wordml" xmlns:w15="http://schemas.microsoft.com/office/word/2012/wordml" xmlns:w16cex="http://schemas.microsoft.com/office/word/2018/wordml/cex" xmlns:w16cid="http://schemas.microsoft.com/office/word/2016/wordml/cid" xmlns:w16="http://schemas.microsoft.com/office/word/2018/wordml" xmlns:w16sdtdh="http://schemas.microsoft.com/office/word/2020/wordml/sdtdatahash" xmlns:w16se="http://schemas.microsoft.com/office/word/2015/wordml/symex" xmlns:wpg="http://schemas.microsoft.com/office/word/2010/wordprocessingGroup" xmlns:wpi="http://schemas.microsoft.com/office/word/2010/wordprocessingInk" xmlns:wne="http://schemas.microsoft.com/office/word/2006/wordml" xmlns:wps="http://schemas.microsoft.com/office/word/2010/wordprocessingShape" mc:Ignorable="w14 w15 w16se w16cid w16 w16cex w16sdtdh wp14">
+  <w:sdt>
+    <w:sdtPr>
+      <w:id w:val="-1605719399"/>
+      <w:docPartObj>
+        <w:docPartGallery w:val="Page Numbers (Bottom of Page)"/>
+        <w:docPartUnique/>
+      </w:docPartObj>
+    </w:sdtPr>
+    <w:sdtEndPr/>
+    <w:sdtContent>
+      <w:sdt>
+        <w:sdtPr>
+          <w:id w:val="-1769616900"/>
+          <w:docPartObj>
+            <w:docPartGallery w:val="Page Numbers (Top of Page)"/>
+            <w:docPartUnique/>
+          </w:docPartObj>
+        </w:sdtPr>
+        <w:sdtEndPr/>
+        <w:sdtContent>
+          <w:p>
+            <w:pPr>
+              <w:pStyle w:val="Footer"/>
+              <w:jc w:val="right"/>
+            </w:pPr>
+            <w:r>
+              <w:t xml:space="preserve">Page </w:t>
+            </w:r>
+            <w:r>
+              <w:rPr>
+                <w:b/>
+                <w:bCs/>
+                <w:szCs w:val="24"/>
+              </w:rPr>
+              <w:fldChar w:fldCharType="begin"/>
+            </w:r>
+            <w:r>
+              <w:rPr>
+                <w:b/>
+                <w:bCs/>
+              </w:rPr>
+              <w:instrText xml:space="preserve"> PAGE </w:instrText>
+            </w:r>
+            <w:r>
+              <w:rPr>
+                <w:b/>
+                <w:bCs/>
+                <w:szCs w:val="24"/>
+              </w:rPr>
+              <w:fldChar w:fldCharType="separate"/>
+            </w:r>
+            <w:r>
+              <w:rPr>
+                <w:b/>
+                <w:bCs/>
+                <w:noProof/>
+              </w:rPr>
+              <w:t>2</w:t>
+            </w:r>
+            <w:r>
+              <w:rPr>
+                <w:b/>
+                <w:bCs/>
+                <w:szCs w:val="24"/>
+              </w:rPr>
+              <w:fldChar w:fldCharType="end"/>
+            </w:r>
+            <w:r>
+              <w:t xml:space="preserve"> of </w:t>
+            </w:r>
+            <w:r>
+              <w:rPr>
+                <w:b/>
+                <w:bCs/>
+                <w:szCs w:val="24"/>
+              </w:rPr>
+              <w:fldChar w:fldCharType="begin"/>
+            </w:r>
+            <w:r>
+              <w:rPr>
+                <w:b/>
+                <w:bCs/>
+              </w:rPr>
+              <w:instrText xml:space="preserve"> NUMPAGES  </w:instrText>
+            </w:r>
+            <w:r>
+              <w:rPr>
+                <w:b/>
+                <w:bCs/>
+                <w:szCs w:val="24"/>
+              </w:rPr>
+              <w:fldChar w:fldCharType="separate"/>
+            </w:r>
+            <w:r>
+              <w:rPr>
+                <w:b/>
+                <w:bCs/>
+                <w:noProof/>
+              </w:rPr>
+              <w:t>2</w:t>
+            </w:r>
+            <w:r>
+              <w:rPr>
+                <w:b/>
+                <w:bCs/>
+                <w:szCs w:val="24"/>
+              </w:rPr>
+              <w:fldChar w:fldCharType="end"/>
+            </w:r>
+          </w:p>
+        </w:sdtContent>
+      </w:sdt>
+    </w:sdtContent>
+  </w:sdt>
   <w:p>
     <w:pPr>
-      <w:pBdr>
-        <w:top w:val="single" w:sz="4" w:space="1" w:color="2E75B6"/>
-      </w:pBdr>
-      <w:jc w:val="center"/>
+      <w:pStyle w:val="Footer"/>
     </w:pPr>
-    <w:r>
-      <w:rPr>
-        <w:color w:val="555555"/>
-        <w:sz w:val="18"/>
-        <w:szCs w:val="18"/>
-      </w:rPr>
-      <w:t xml:space="preserve">SETU Carlow | Computer Games Development CW208 | </w:t>
-    </w:r>
-    <w:r>
-      <w:rPr>
-        <w:color w:val="555555"/>
-        <w:sz w:val="18"/>
-        <w:szCs w:val="18"/>
-      </w:rPr>
-      <w:t xml:space="preserve">Page </w:t>
-    </w:r>
-    <w:r>
-      <w:rPr>
-        <w:color w:val="555555"/>
-        <w:sz w:val="18"/>
-        <w:szCs w:val="18"/>
-      </w:rPr>
-      <w:fldChar w:fldCharType="begin"/>
-    </w:r>
-    <w:r>
-      <w:rPr>
-        <w:color w:val="555555"/>
-        <w:sz w:val="18"/>
-        <w:szCs w:val="18"/>
-      </w:rPr>
-      <w:instrText xml:space="preserve"> PAGE   \* MERGEFORMAT </w:instrText>
-    </w:r>
-    <w:r>
-      <w:rPr>
-        <w:color w:val="555555"/>
-        <w:sz w:val="18"/>
-        <w:szCs w:val="18"/>
-      </w:rPr>
-      <w:fldChar w:fldCharType="separate"/>
-    </w:r>
-    <w:r>
-      <w:rPr>
-        <w:noProof/>
-        <w:color w:val="555555"/>
-        <w:sz w:val="18"/>
-        <w:szCs w:val="18"/>
-      </w:rPr>
-      <w:t>1</w:t>
-    </w:r>
-    <w:r>
-      <w:rPr>
-        <w:noProof/>
-        <w:color w:val="555555"/>
-        <w:sz w:val="18"/>
-        <w:szCs w:val="18"/>
-      </w:rPr>
-      <w:fldChar w:fldCharType="end"/>
-    </w:r>
   </w:p>
 </w:ftr>
 </file>
 
 <file path=word/footer2.xml><?xml version="1.0" encoding="utf-8"?>
-<w:ftr xmlns:wpc="http://schemas.microsoft.com/office/word/2010/wordprocessingCanvas" xmlns:cx="http://schemas.microsoft.com/office/drawing/2014/chartex" xmlns:cx1="http://schemas.microsoft.com/office/drawing/2015/9/8/chartex" xmlns:cx2="http://schemas.microsoft.com/office/drawing/2015/10/21/chartex" xmlns:cx3="http://schemas.microsoft.com/office/drawing/2016/5/9/chartex" xmlns:cx4="http://schemas.microsoft.com/office/drawing/2016/5/10/chartex" xmlns:cx5="http://schemas.microsoft.com/office/drawing/2016/5/11/chartex" xmlns:cx6="http://schemas.microsoft.com/office/drawing/2016/5/12/chartex" xmlns:cx7="http://schemas.microsoft.com/office/drawing/2016/5/13/chartex" xmlns:cx8="http://schemas.microsoft.com/office/drawing/2016/5/14/chartex" xmlns:mc="http://schemas.openxmlformats.org/markup-compatibility/2006" xmlns:aink="http://schemas.microsoft.com/office/drawing/2016/ink" xmlns:am3d="http://schemas.microsoft.com/office/drawing/2017/model3d" xmlns:o="urn:schemas-microsoft-com:office:office" xmlns:oel="http://schemas.microsoft.com/office/2019/extlst" xmlns:r="http://schemas.openxmlformats.org/officeDocument/2006/relationships" xmlns:m="http://schemas.openxmlformats.org/officeDocument/2006/math" xmlns:v="urn:schemas-microsoft-com:vml" xmlns:wp14="http://schemas.microsoft.com/office/word/2010/wordprocessingDrawing" xmlns:wp="http://schemas.openxmlformats.org/drawingml/2006/wordprocessingDrawing" xmlns:w10="urn:schemas-microsoft-com:office:word" xmlns:w="http://schemas.openxmlformats.org/wordprocessingml/2006/main" xmlns:w14="http://schemas.microsoft.com/office/word/2010/wordml" xmlns:w15="http://schemas.microsoft.com/office/word/2012/wordml" xmlns:w16cex="http://schemas.microsoft.com/office/word/2018/wordml/cex" xmlns:w16cid="http://schemas.microsoft.com/office/word/2016/wordml/cid" xmlns:w16="http://schemas.microsoft.com/office/word/2018/wordml" xmlns:w16du="http://schemas.microsoft.com/office/word/2023/wordml/word16du" xmlns:w16sdtdh="http://schemas.microsoft.com/office/word/2020/wordml/sdtdatahash" xmlns:w16sdtfl="http://schemas.microsoft.com/office/word/2024/wordml/sdtformatlock" xmlns:w16se="http://schemas.microsoft.com/office/word/2015/wordml/symex" xmlns:wpg="http://schemas.microsoft.com/office/word/2010/wordprocessingGroup" xmlns:wpi="http://schemas.microsoft.com/office/word/2010/wordprocessingInk" xmlns:wne="http://schemas.microsoft.com/office/word/2006/wordml" xmlns:wps="http://schemas.microsoft.com/office/word/2010/wordprocessingShape" mc:Ignorable="w14 w15 w16se w16cid w16 w16cex w16sdtdh w16sdtfl w16du wp14">
+<w:ftr xmlns:wpc="http://schemas.microsoft.com/office/word/2010/wordprocessingCanvas" xmlns:cx="http://schemas.microsoft.com/office/drawing/2014/chartex" xmlns:cx1="http://schemas.microsoft.com/office/drawing/2015/9/8/chartex" xmlns:cx2="http://schemas.microsoft.com/office/drawing/2015/10/21/chartex" xmlns:cx3="http://schemas.microsoft.com/office/drawing/2016/5/9/chartex" xmlns:cx4="http://schemas.microsoft.com/office/drawing/2016/5/10/chartex" xmlns:cx5="http://schemas.microsoft.com/office/drawing/2016/5/11/chartex" xmlns:cx6="http://schemas.microsoft.com/office/drawing/2016/5/12/chartex" xmlns:cx7="http://schemas.microsoft.com/office/drawing/2016/5/13/chartex" xmlns:cx8="http://schemas.microsoft.com/office/drawing/2016/5/14/chartex" xmlns:mc="http://schemas.openxmlformats.org/markup-compatibility/2006" xmlns:aink="http://schemas.microsoft.com/office/drawing/2016/ink" xmlns:am3d="http://schemas.microsoft.com/office/drawing/2017/model3d" xmlns:o="urn:schemas-microsoft-com:office:office" xmlns:r="http://schemas.openxmlformats.org/officeDocument/2006/relationships" xmlns:m="http://schemas.openxmlformats.org/officeDocument/2006/math" xmlns:v="urn:schemas-microsoft-com:vml" xmlns:wp14="http://schemas.microsoft.com/office/word/2010/wordprocessingDrawing" xmlns:wp="http://schemas.openxmlformats.org/drawingml/2006/wordprocessingDrawing" xmlns:w10="urn:schemas-microsoft-com:office:word" xmlns:w="http://schemas.openxmlformats.org/wordprocessingml/2006/main" xmlns:w14="http://schemas.microsoft.com/office/word/2010/wordml" xmlns:w15="http://schemas.microsoft.com/office/word/2012/wordml" xmlns:w16cex="http://schemas.microsoft.com/office/word/2018/wordml/cex" xmlns:w16cid="http://schemas.microsoft.com/office/word/2016/wordml/cid" xmlns:w16="http://schemas.microsoft.com/office/word/2018/wordml" xmlns:w16sdtdh="http://schemas.microsoft.com/office/word/2020/wordml/sdtdatahash" xmlns:w16se="http://schemas.microsoft.com/office/word/2015/wordml/symex" xmlns:wpg="http://schemas.microsoft.com/office/word/2010/wordprocessingGroup" xmlns:wpi="http://schemas.microsoft.com/office/word/2010/wordprocessingInk" xmlns:wne="http://schemas.microsoft.com/office/word/2006/wordml" xmlns:wps="http://schemas.microsoft.com/office/word/2010/wordprocessingShape" mc:Ignorable="w14 w15 w16se w16cid w16 w16cex w16sdtdh wp14">
+  <w:sdt>
+    <w:sdtPr>
+      <w:id w:val="1135378984"/>
+      <w:docPartObj>
+        <w:docPartGallery w:val="Page Numbers (Bottom of Page)"/>
+        <w:docPartUnique/>
+      </w:docPartObj>
+    </w:sdtPr>
+    <w:sdtEndPr/>
+    <w:sdtContent>
+      <w:sdt>
+        <w:sdtPr>
+          <w:id w:val="-1705238520"/>
+          <w:docPartObj>
+            <w:docPartGallery w:val="Page Numbers (Top of Page)"/>
+            <w:docPartUnique/>
+          </w:docPartObj>
+        </w:sdtPr>
+        <w:sdtEndPr/>
+        <w:sdtContent>
+          <w:p>
+            <w:pPr>
+              <w:pStyle w:val="Footer"/>
+              <w:jc w:val="right"/>
+            </w:pPr>
+            <w:r>
+              <w:t xml:space="preserve">Page </w:t>
+            </w:r>
+            <w:r>
+              <w:rPr>
+                <w:b/>
+                <w:bCs/>
+                <w:szCs w:val="24"/>
+              </w:rPr>
+              <w:fldChar w:fldCharType="begin"/>
+            </w:r>
+            <w:r>
+              <w:rPr>
+                <w:b/>
+                <w:bCs/>
+              </w:rPr>
+              <w:instrText xml:space="preserve"> PAGE </w:instrText>
+            </w:r>
+            <w:r>
+              <w:rPr>
+                <w:b/>
+                <w:bCs/>
+                <w:szCs w:val="24"/>
+              </w:rPr>
+              <w:fldChar w:fldCharType="separate"/>
+            </w:r>
+            <w:r>
+              <w:rPr>
+                <w:b/>
+                <w:bCs/>
+                <w:noProof/>
+              </w:rPr>
+              <w:t>2</w:t>
+            </w:r>
+            <w:r>
+              <w:rPr>
+                <w:b/>
+                <w:bCs/>
+                <w:szCs w:val="24"/>
+              </w:rPr>
+              <w:fldChar w:fldCharType="end"/>
+            </w:r>
+            <w:r>
+              <w:t xml:space="preserve"> of </w:t>
+            </w:r>
+            <w:r>
+              <w:rPr>
+                <w:b/>
+                <w:bCs/>
+                <w:szCs w:val="24"/>
+              </w:rPr>
+              <w:fldChar w:fldCharType="begin"/>
+            </w:r>
+            <w:r>
+              <w:rPr>
+                <w:b/>
+                <w:bCs/>
+              </w:rPr>
+              <w:instrText xml:space="preserve"> NUMPAGES  </w:instrText>
+            </w:r>
+            <w:r>
+              <w:rPr>
+                <w:b/>
+                <w:bCs/>
+                <w:szCs w:val="24"/>
+              </w:rPr>
+              <w:fldChar w:fldCharType="separate"/>
+            </w:r>
+            <w:r>
+              <w:rPr>
+                <w:b/>
+                <w:bCs/>
+                <w:noProof/>
+              </w:rPr>
+              <w:t>2</w:t>
+            </w:r>
+            <w:r>
+              <w:rPr>
+                <w:b/>
+                <w:bCs/>
+                <w:szCs w:val="24"/>
+              </w:rPr>
+              <w:fldChar w:fldCharType="end"/>
+            </w:r>
+          </w:p>
+        </w:sdtContent>
+      </w:sdt>
+    </w:sdtContent>
+  </w:sdt>
   <w:p>
     <w:pPr>
       <w:pBdr>
@@ -9940,32 +10114,12 @@
         <w:lang w:val="en-GB" w:eastAsia="en-GB"/>
       </w:rPr>
     </w:pPr>
-    <w:r>
-      <w:rPr>
-        <w:rFonts w:ascii="Arial" w:hAnsi="Arial" w:cs="Arial"/>
-        <w:color w:val="555555"/>
-        <w:sz w:val="18"/>
-        <w:szCs w:val="18"/>
-        <w:lang w:val="en-GB" w:eastAsia="en-GB"/>
-      </w:rPr>
-      <w:t xml:space="preserve">SETU Carlow | Computer Games Development CW208 | Page </w:t>
-    </w:r>
-    <w:r>
-      <w:rPr>
-        <w:rFonts w:ascii="Arial" w:hAnsi="Arial" w:cs="Arial"/>
-        <w:color w:val="555555"/>
-        <w:sz w:val="18"/>
-        <w:szCs w:val="18"/>
-        <w:lang w:val="en-GB" w:eastAsia="en-GB"/>
-      </w:rPr>
-      <w:t>1</w:t>
-    </w:r>
   </w:p>
 </w:ftr>
 </file>
 
 <file path=word/footnotes.xml><?xml version="1.0" encoding="utf-8"?>
-<w:footnotes xmlns:wpc="http://schemas.microsoft.com/office/word/2010/wordprocessingCanvas" xmlns:cx="http://schemas.microsoft.com/office/drawing/2014/chartex" xmlns:cx1="http://schemas.microsoft.com/office/drawing/2015/9/8/chartex" xmlns:cx2="http://schemas.microsoft.com/office/drawing/2015/10/21/chartex" xmlns:cx3="http://schemas.microsoft.com/office/drawing/2016/5/9/chartex" xmlns:cx4="http://schemas.microsoft.com/office/drawing/2016/5/10/chartex" xmlns:cx5="http://schemas.microsoft.com/office/drawing/2016/5/11/chartex" xmlns:cx6="http://schemas.microsoft.com/office/drawing/2016/5/12/chartex" xmlns:cx7="http://schemas.microsoft.com/office/drawing/2016/5/13/chartex" xmlns:cx8="http://schemas.microsoft.com/office/drawing/2016/5/14/chartex" xmlns:mc="http://schemas.openxmlformats.org/markup-compatibility/2006" xmlns:aink="http://schemas.microsoft.com/office/drawing/2016/ink" xmlns:am3d="http://schemas.microsoft.com/office/drawing/2017/model3d" xmlns:o="urn:schemas-microsoft-com:office:office" xmlns:oel="http://schemas.microsoft.com/office/2019/extlst" xmlns:r="http://schemas.openxmlformats.org/officeDocument/2006/relationships" xmlns:m="http://schemas.openxmlformats.org/officeDocument/2006/math" xmlns:v="urn:schemas-microsoft-com:vml" xmlns:wp14="http://schemas.microsoft.com/office/word/2010/wordprocessingDrawing" xmlns:wp="http://schemas.openxmlformats.org/drawingml/2006/wordprocessingDrawing" xmlns:w10="urn:schemas-microsoft-com:office:word" xmlns:w="http://schemas.openxmlformats.org/wordprocessingml/2006/main" xmlns:w14="http://schemas.microsoft.com/office/word/2010/wordml" xmlns:w15="http://schemas.microsoft.com/office/word/2012/wordml" xmlns:w16cex="http://schemas.microsoft.com/office/word/2018/wordml/cex" xmlns:w16cid="http://schemas.microsoft.com/office/word/2016/wordml/cid" xmlns:w16="http://schemas.microsoft.com/office/word/2018/wordml" xmlns:w16du="http://schemas.microsoft.com/office/word/2023/wordml/word16du" xmlns:w16sdtdh="http://schemas.microsoft.com/office/word/2020/wordml/sdtdatahash" xmlns:w16sdtfl="http://schemas.microsoft.com/office/word/2024/wordml/sdtformatlock" xmlns:w16se="http://schemas.microsoft.com/office/word/2015/wordml/symex" xmlns:wpg="http://schemas.microsoft.com/office/word/2010/wordprocessingGroup" xmlns:wpi="http://schemas.microsoft.com/office/word/2010/wordprocessingInk" xmlns:wne="http://schemas.microsoft.com/office/word/2006/wordml" xmlns:wps="http://schemas.microsoft.com/office/word/2010/wordprocessingShape" mc:Ignorable="w14 w15 w16se w16cid w16 w16cex w16sdtdh w16sdtfl w16du wp14">
+<w:footnotes xmlns:wpc="http://schemas.microsoft.com/office/word/2010/wordprocessingCanvas" xmlns:cx="http://schemas.microsoft.com/office/drawing/2014/chartex" xmlns:cx1="http://schemas.microsoft.com/office/drawing/2015/9/8/chartex" xmlns:cx2="http://schemas.microsoft.com/office/drawing/2015/10/21/chartex" xmlns:cx3="http://schemas.microsoft.com/office/drawing/2016/5/9/chartex" xmlns:cx4="http://schemas.microsoft.com/office/drawing/2016/5/10/chartex" xmlns:cx5="http://schemas.microsoft.com/office/drawing/2016/5/11/chartex" xmlns:cx6="http://schemas.microsoft.com/office/drawing/2016/5/12/chartex" xmlns:cx7="http://schemas.microsoft.com/office/drawing/2016/5/13/chartex" xmlns:cx8="http://schemas.microsoft.com/office/drawing/2016/5/14/chartex" xmlns:mc="http://schemas.openxmlformats.org/markup-compatibility/2006" xmlns:aink="http://schemas.microsoft.com/office/drawing/2016/ink" xmlns:am3d="http://schemas.microsoft.com/office/drawing/2017/model3d" xmlns:o="urn:schemas-microsoft-com:office:office" xmlns:r="http://schemas.openxmlformats.org/officeDocument/2006/relationships" xmlns:m="http://schemas.openxmlformats.org/officeDocument/2006/math" xmlns:v="urn:schemas-microsoft-com:vml" xmlns:wp14="http://schemas.microsoft.com/office/word/2010/wordprocessingDrawing" xmlns:wp="http://schemas.openxmlformats.org/drawingml/2006/wordprocessingDrawing" xmlns:w10="urn:schemas-microsoft-com:office:word" xmlns:w="http://schemas.openxmlformats.org/wordprocessingml/2006/main" xmlns:w14="http://schemas.microsoft.com/office/word/2010/wordml" xmlns:w15="http://schemas.microsoft.com/office/word/2012/wordml" xmlns:w16cex="http://schemas.microsoft.com/office/word/2018/wordml/cex" xmlns:w16cid="http://schemas.microsoft.com/office/word/2016/wordml/cid" xmlns:w16="http://schemas.microsoft.com/office/word/2018/wordml" xmlns:w16sdtdh="http://schemas.microsoft.com/office/word/2020/wordml/sdtdatahash" xmlns:w16se="http://schemas.microsoft.com/office/word/2015/wordml/symex" xmlns:wpg="http://schemas.microsoft.com/office/word/2010/wordprocessingGroup" xmlns:wpi="http://schemas.microsoft.com/office/word/2010/wordprocessingInk" xmlns:wne="http://schemas.microsoft.com/office/word/2006/wordml" xmlns:wps="http://schemas.microsoft.com/office/word/2010/wordprocessingShape" mc:Ignorable="w14 w15 w16se w16cid w16 w16cex w16sdtdh wp14">
   <w:footnote w:type="separator" w:id="-1">
     <w:p>
       <w:pPr>
@@ -9990,45 +10144,23 @@
 </file>
 
 <file path=word/header1.xml><?xml version="1.0" encoding="utf-8"?>
-<w:hdr xmlns:wpc="http://schemas.microsoft.com/office/word/2010/wordprocessingCanvas" xmlns:cx="http://schemas.microsoft.com/office/drawing/2014/chartex" xmlns:cx1="http://schemas.microsoft.com/office/drawing/2015/9/8/chartex" xmlns:cx2="http://schemas.microsoft.com/office/drawing/2015/10/21/chartex" xmlns:cx3="http://schemas.microsoft.com/office/drawing/2016/5/9/chartex" xmlns:cx4="http://schemas.microsoft.com/office/drawing/2016/5/10/chartex" xmlns:cx5="http://schemas.microsoft.com/office/drawing/2016/5/11/chartex" xmlns:cx6="http://schemas.microsoft.com/office/drawing/2016/5/12/chartex" xmlns:cx7="http://schemas.microsoft.com/office/drawing/2016/5/13/chartex" xmlns:cx8="http://schemas.microsoft.com/office/drawing/2016/5/14/chartex" xmlns:mc="http://schemas.openxmlformats.org/markup-compatibility/2006" xmlns:aink="http://schemas.microsoft.com/office/drawing/2016/ink" xmlns:am3d="http://schemas.microsoft.com/office/drawing/2017/model3d" xmlns:o="urn:schemas-microsoft-com:office:office" xmlns:oel="http://schemas.microsoft.com/office/2019/extlst" xmlns:r="http://schemas.openxmlformats.org/officeDocument/2006/relationships" xmlns:m="http://schemas.openxmlformats.org/officeDocument/2006/math" xmlns:v="urn:schemas-microsoft-com:vml" xmlns:wp14="http://schemas.microsoft.com/office/word/2010/wordprocessingDrawing" xmlns:wp="http://schemas.openxmlformats.org/drawingml/2006/wordprocessingDrawing" xmlns:w10="urn:schemas-microsoft-com:office:word" xmlns:w="http://schemas.openxmlformats.org/wordprocessingml/2006/main" xmlns:w14="http://schemas.microsoft.com/office/word/2010/wordml" xmlns:w15="http://schemas.microsoft.com/office/word/2012/wordml" xmlns:w16cex="http://schemas.microsoft.com/office/word/2018/wordml/cex" xmlns:w16cid="http://schemas.microsoft.com/office/word/2016/wordml/cid" xmlns:w16="http://schemas.microsoft.com/office/word/2018/wordml" xmlns:w16du="http://schemas.microsoft.com/office/word/2023/wordml/word16du" xmlns:w16sdtdh="http://schemas.microsoft.com/office/word/2020/wordml/sdtdatahash" xmlns:w16sdtfl="http://schemas.microsoft.com/office/word/2024/wordml/sdtformatlock" xmlns:w16se="http://schemas.microsoft.com/office/word/2015/wordml/symex" xmlns:wpg="http://schemas.microsoft.com/office/word/2010/wordprocessingGroup" xmlns:wpi="http://schemas.microsoft.com/office/word/2010/wordprocessingInk" xmlns:wne="http://schemas.microsoft.com/office/word/2006/wordml" xmlns:wps="http://schemas.microsoft.com/office/word/2010/wordprocessingShape" mc:Ignorable="w14 w15 w16se w16cid w16 w16cex w16sdtdh w16sdtfl w16du wp14">
+<w:hdr xmlns:wpc="http://schemas.microsoft.com/office/word/2010/wordprocessingCanvas" xmlns:cx="http://schemas.microsoft.com/office/drawing/2014/chartex" xmlns:cx1="http://schemas.microsoft.com/office/drawing/2015/9/8/chartex" xmlns:cx2="http://schemas.microsoft.com/office/drawing/2015/10/21/chartex" xmlns:cx3="http://schemas.microsoft.com/office/drawing/2016/5/9/chartex" xmlns:cx4="http://schemas.microsoft.com/office/drawing/2016/5/10/chartex" xmlns:cx5="http://schemas.microsoft.com/office/drawing/2016/5/11/chartex" xmlns:cx6="http://schemas.microsoft.com/office/drawing/2016/5/12/chartex" xmlns:cx7="http://schemas.microsoft.com/office/drawing/2016/5/13/chartex" xmlns:cx8="http://schemas.microsoft.com/office/drawing/2016/5/14/chartex" xmlns:mc="http://schemas.openxmlformats.org/markup-compatibility/2006" xmlns:aink="http://schemas.microsoft.com/office/drawing/2016/ink" xmlns:am3d="http://schemas.microsoft.com/office/drawing/2017/model3d" xmlns:o="urn:schemas-microsoft-com:office:office" xmlns:r="http://schemas.openxmlformats.org/officeDocument/2006/relationships" xmlns:m="http://schemas.openxmlformats.org/officeDocument/2006/math" xmlns:v="urn:schemas-microsoft-com:vml" xmlns:wp14="http://schemas.microsoft.com/office/word/2010/wordprocessingDrawing" xmlns:wp="http://schemas.openxmlformats.org/drawingml/2006/wordprocessingDrawing" xmlns:w10="urn:schemas-microsoft-com:office:word" xmlns:w="http://schemas.openxmlformats.org/wordprocessingml/2006/main" xmlns:w14="http://schemas.microsoft.com/office/word/2010/wordml" xmlns:w15="http://schemas.microsoft.com/office/word/2012/wordml" xmlns:w16cex="http://schemas.microsoft.com/office/word/2018/wordml/cex" xmlns:w16cid="http://schemas.microsoft.com/office/word/2016/wordml/cid" xmlns:w16="http://schemas.microsoft.com/office/word/2018/wordml" xmlns:w16sdtdh="http://schemas.microsoft.com/office/word/2020/wordml/sdtdatahash" xmlns:w16se="http://schemas.microsoft.com/office/word/2015/wordml/symex" xmlns:wpg="http://schemas.microsoft.com/office/word/2010/wordprocessingGroup" xmlns:wpi="http://schemas.microsoft.com/office/word/2010/wordprocessingInk" xmlns:wne="http://schemas.microsoft.com/office/word/2006/wordml" xmlns:wps="http://schemas.microsoft.com/office/word/2010/wordprocessingShape" mc:Ignorable="w14 w15 w16se w16cid w16 w16cex w16sdtdh wp14">
   <w:p>
     <w:pPr>
       <w:pBdr>
         <w:bottom w:val="single" w:sz="4" w:space="1" w:color="2E75B6"/>
       </w:pBdr>
       <w:tabs>
+        <w:tab w:val="left" w:pos="2787"/>
         <w:tab w:val="right" w:pos="9026"/>
       </w:tabs>
     </w:pPr>
-    <w:r>
-      <w:rPr>
-        <w:color w:val="555555"/>
-        <w:sz w:val="18"/>
-        <w:szCs w:val="18"/>
-      </w:rPr>
-      <w:t>Thorns | Project Report</w:t>
-    </w:r>
-    <w:r>
-      <w:rPr>
-        <w:sz w:val="18"/>
-        <w:szCs w:val="18"/>
-      </w:rPr>
-      <w:tab/>
-    </w:r>
-    <w:r>
-      <w:rPr>
-        <w:color w:val="555555"/>
-        <w:sz w:val="18"/>
-        <w:szCs w:val="18"/>
-      </w:rPr>
-      <w:t>Edward Norton | C00286807</w:t>
-    </w:r>
   </w:p>
 </w:hdr>
 </file>
 
 <file path=word/header2.xml><?xml version="1.0" encoding="utf-8"?>
-<w:hdr xmlns:wpc="http://schemas.microsoft.com/office/word/2010/wordprocessingCanvas" xmlns:cx="http://schemas.microsoft.com/office/drawing/2014/chartex" xmlns:cx1="http://schemas.microsoft.com/office/drawing/2015/9/8/chartex" xmlns:cx2="http://schemas.microsoft.com/office/drawing/2015/10/21/chartex" xmlns:cx3="http://schemas.microsoft.com/office/drawing/2016/5/9/chartex" xmlns:cx4="http://schemas.microsoft.com/office/drawing/2016/5/10/chartex" xmlns:cx5="http://schemas.microsoft.com/office/drawing/2016/5/11/chartex" xmlns:cx6="http://schemas.microsoft.com/office/drawing/2016/5/12/chartex" xmlns:cx7="http://schemas.microsoft.com/office/drawing/2016/5/13/chartex" xmlns:cx8="http://schemas.microsoft.com/office/drawing/2016/5/14/chartex" xmlns:mc="http://schemas.openxmlformats.org/markup-compatibility/2006" xmlns:aink="http://schemas.microsoft.com/office/drawing/2016/ink" xmlns:am3d="http://schemas.microsoft.com/office/drawing/2017/model3d" xmlns:o="urn:schemas-microsoft-com:office:office" xmlns:oel="http://schemas.microsoft.com/office/2019/extlst" xmlns:r="http://schemas.openxmlformats.org/officeDocument/2006/relationships" xmlns:m="http://schemas.openxmlformats.org/officeDocument/2006/math" xmlns:v="urn:schemas-microsoft-com:vml" xmlns:wp14="http://schemas.microsoft.com/office/word/2010/wordprocessingDrawing" xmlns:wp="http://schemas.openxmlformats.org/drawingml/2006/wordprocessingDrawing" xmlns:w10="urn:schemas-microsoft-com:office:word" xmlns:w="http://schemas.openxmlformats.org/wordprocessingml/2006/main" xmlns:w14="http://schemas.microsoft.com/office/word/2010/wordml" xmlns:w15="http://schemas.microsoft.com/office/word/2012/wordml" xmlns:w16cex="http://schemas.microsoft.com/office/word/2018/wordml/cex" xmlns:w16cid="http://schemas.microsoft.com/office/word/2016/wordml/cid" xmlns:w16="http://schemas.microsoft.com/office/word/2018/wordml" xmlns:w16du="http://schemas.microsoft.com/office/word/2023/wordml/word16du" xmlns:w16sdtdh="http://schemas.microsoft.com/office/word/2020/wordml/sdtdatahash" xmlns:w16sdtfl="http://schemas.microsoft.com/office/word/2024/wordml/sdtformatlock" xmlns:w16se="http://schemas.microsoft.com/office/word/2015/wordml/symex" xmlns:wpg="http://schemas.microsoft.com/office/word/2010/wordprocessingGroup" xmlns:wpi="http://schemas.microsoft.com/office/word/2010/wordprocessingInk" xmlns:wne="http://schemas.microsoft.com/office/word/2006/wordml" xmlns:wps="http://schemas.microsoft.com/office/word/2010/wordprocessingShape" mc:Ignorable="w14 w15 w16se w16cid w16 w16cex w16sdtdh w16sdtfl w16du wp14">
+<w:hdr xmlns:wpc="http://schemas.microsoft.com/office/word/2010/wordprocessingCanvas" xmlns:cx="http://schemas.microsoft.com/office/drawing/2014/chartex" xmlns:cx1="http://schemas.microsoft.com/office/drawing/2015/9/8/chartex" xmlns:cx2="http://schemas.microsoft.com/office/drawing/2015/10/21/chartex" xmlns:cx3="http://schemas.microsoft.com/office/drawing/2016/5/9/chartex" xmlns:cx4="http://schemas.microsoft.com/office/drawing/2016/5/10/chartex" xmlns:cx5="http://schemas.microsoft.com/office/drawing/2016/5/11/chartex" xmlns:cx6="http://schemas.microsoft.com/office/drawing/2016/5/12/chartex" xmlns:cx7="http://schemas.microsoft.com/office/drawing/2016/5/13/chartex" xmlns:cx8="http://schemas.microsoft.com/office/drawing/2016/5/14/chartex" xmlns:mc="http://schemas.openxmlformats.org/markup-compatibility/2006" xmlns:aink="http://schemas.microsoft.com/office/drawing/2016/ink" xmlns:am3d="http://schemas.microsoft.com/office/drawing/2017/model3d" xmlns:o="urn:schemas-microsoft-com:office:office" xmlns:r="http://schemas.openxmlformats.org/officeDocument/2006/relationships" xmlns:m="http://schemas.openxmlformats.org/officeDocument/2006/math" xmlns:v="urn:schemas-microsoft-com:vml" xmlns:wp14="http://schemas.microsoft.com/office/word/2010/wordprocessingDrawing" xmlns:wp="http://schemas.openxmlformats.org/drawingml/2006/wordprocessingDrawing" xmlns:w10="urn:schemas-microsoft-com:office:word" xmlns:w="http://schemas.openxmlformats.org/wordprocessingml/2006/main" xmlns:w14="http://schemas.microsoft.com/office/word/2010/wordml" xmlns:w15="http://schemas.microsoft.com/office/word/2012/wordml" xmlns:w16cex="http://schemas.microsoft.com/office/word/2018/wordml/cex" xmlns:w16cid="http://schemas.microsoft.com/office/word/2016/wordml/cid" xmlns:w16="http://schemas.microsoft.com/office/word/2018/wordml" xmlns:w16sdtdh="http://schemas.microsoft.com/office/word/2020/wordml/sdtdatahash" xmlns:w16se="http://schemas.microsoft.com/office/word/2015/wordml/symex" xmlns:wpg="http://schemas.microsoft.com/office/word/2010/wordprocessingGroup" xmlns:wpi="http://schemas.microsoft.com/office/word/2010/wordprocessingInk" xmlns:wne="http://schemas.microsoft.com/office/word/2006/wordml" xmlns:wps="http://schemas.microsoft.com/office/word/2010/wordprocessingShape" mc:Ignorable="w14 w15 w16se w16cid w16 w16cex w16sdtdh wp14">
   <w:p>
     <w:pPr>
       <w:pBdr>
@@ -10066,7 +10198,7 @@
 </file>
 
 <file path=word/numbering.xml><?xml version="1.0" encoding="utf-8"?>
-<w:numbering xmlns:wpc="http://schemas.microsoft.com/office/word/2010/wordprocessingCanvas" xmlns:cx="http://schemas.microsoft.com/office/drawing/2014/chartex" xmlns:cx1="http://schemas.microsoft.com/office/drawing/2015/9/8/chartex" xmlns:cx2="http://schemas.microsoft.com/office/drawing/2015/10/21/chartex" xmlns:cx3="http://schemas.microsoft.com/office/drawing/2016/5/9/chartex" xmlns:cx4="http://schemas.microsoft.com/office/drawing/2016/5/10/chartex" xmlns:cx5="http://schemas.microsoft.com/office/drawing/2016/5/11/chartex" xmlns:cx6="http://schemas.microsoft.com/office/drawing/2016/5/12/chartex" xmlns:cx7="http://schemas.microsoft.com/office/drawing/2016/5/13/chartex" xmlns:cx8="http://schemas.microsoft.com/office/drawing/2016/5/14/chartex" xmlns:mc="http://schemas.openxmlformats.org/markup-compatibility/2006" xmlns:aink="http://schemas.microsoft.com/office/drawing/2016/ink" xmlns:am3d="http://schemas.microsoft.com/office/drawing/2017/model3d" xmlns:o="urn:schemas-microsoft-com:office:office" xmlns:oel="http://schemas.microsoft.com/office/2019/extlst" xmlns:r="http://schemas.openxmlformats.org/officeDocument/2006/relationships" xmlns:m="http://schemas.openxmlformats.org/officeDocument/2006/math" xmlns:v="urn:schemas-microsoft-com:vml" xmlns:wp14="http://schemas.microsoft.com/office/word/2010/wordprocessingDrawing" xmlns:wp="http://schemas.openxmlformats.org/drawingml/2006/wordprocessingDrawing" xmlns:w10="urn:schemas-microsoft-com:office:word" xmlns:w="http://schemas.openxmlformats.org/wordprocessingml/2006/main" xmlns:w14="http://schemas.microsoft.com/office/word/2010/wordml" xmlns:w15="http://schemas.microsoft.com/office/word/2012/wordml" xmlns:w16cex="http://schemas.microsoft.com/office/word/2018/wordml/cex" xmlns:w16cid="http://schemas.microsoft.com/office/word/2016/wordml/cid" xmlns:w16="http://schemas.microsoft.com/office/word/2018/wordml" xmlns:w16du="http://schemas.microsoft.com/office/word/2023/wordml/word16du" xmlns:w16sdtdh="http://schemas.microsoft.com/office/word/2020/wordml/sdtdatahash" xmlns:w16sdtfl="http://schemas.microsoft.com/office/word/2024/wordml/sdtformatlock" xmlns:w16se="http://schemas.microsoft.com/office/word/2015/wordml/symex" xmlns:wpg="http://schemas.microsoft.com/office/word/2010/wordprocessingGroup" xmlns:wpi="http://schemas.microsoft.com/office/word/2010/wordprocessingInk" xmlns:wne="http://schemas.microsoft.com/office/word/2006/wordml" xmlns:wps="http://schemas.microsoft.com/office/word/2010/wordprocessingShape" mc:Ignorable="w14 w15 w16se w16cid w16 w16cex w16sdtdh w16sdtfl w16du wp14">
+<w:numbering xmlns:wpc="http://schemas.microsoft.com/office/word/2010/wordprocessingCanvas" xmlns:cx="http://schemas.microsoft.com/office/drawing/2014/chartex" xmlns:cx1="http://schemas.microsoft.com/office/drawing/2015/9/8/chartex" xmlns:cx2="http://schemas.microsoft.com/office/drawing/2015/10/21/chartex" xmlns:cx3="http://schemas.microsoft.com/office/drawing/2016/5/9/chartex" xmlns:cx4="http://schemas.microsoft.com/office/drawing/2016/5/10/chartex" xmlns:cx5="http://schemas.microsoft.com/office/drawing/2016/5/11/chartex" xmlns:cx6="http://schemas.microsoft.com/office/drawing/2016/5/12/chartex" xmlns:cx7="http://schemas.microsoft.com/office/drawing/2016/5/13/chartex" xmlns:cx8="http://schemas.microsoft.com/office/drawing/2016/5/14/chartex" xmlns:mc="http://schemas.openxmlformats.org/markup-compatibility/2006" xmlns:aink="http://schemas.microsoft.com/office/drawing/2016/ink" xmlns:am3d="http://schemas.microsoft.com/office/drawing/2017/model3d" xmlns:o="urn:schemas-microsoft-com:office:office" xmlns:r="http://schemas.openxmlformats.org/officeDocument/2006/relationships" xmlns:m="http://schemas.openxmlformats.org/officeDocument/2006/math" xmlns:v="urn:schemas-microsoft-com:vml" xmlns:wp14="http://schemas.microsoft.com/office/word/2010/wordprocessingDrawing" xmlns:wp="http://schemas.openxmlformats.org/drawingml/2006/wordprocessingDrawing" xmlns:w10="urn:schemas-microsoft-com:office:word" xmlns:w="http://schemas.openxmlformats.org/wordprocessingml/2006/main" xmlns:w14="http://schemas.microsoft.com/office/word/2010/wordml" xmlns:w15="http://schemas.microsoft.com/office/word/2012/wordml" xmlns:w16cex="http://schemas.microsoft.com/office/word/2018/wordml/cex" xmlns:w16cid="http://schemas.microsoft.com/office/word/2016/wordml/cid" xmlns:w16="http://schemas.microsoft.com/office/word/2018/wordml" xmlns:w16sdtdh="http://schemas.microsoft.com/office/word/2020/wordml/sdtdatahash" xmlns:w16se="http://schemas.microsoft.com/office/word/2015/wordml/symex" xmlns:wpg="http://schemas.microsoft.com/office/word/2010/wordprocessingGroup" xmlns:wpi="http://schemas.microsoft.com/office/word/2010/wordprocessingInk" xmlns:wne="http://schemas.microsoft.com/office/word/2006/wordml" xmlns:wps="http://schemas.microsoft.com/office/word/2010/wordprocessingShape" mc:Ignorable="w14 w15 w16se w16cid w16 w16cex w16sdtdh wp14">
   <w:abstractNum w:abstractNumId="0" w15:restartNumberingAfterBreak="0">
     <w:nsid w:val="055B1CEC"/>
     <w:multiLevelType w:val="hybridMultilevel"/>
@@ -12067,52 +12199,52 @@
       </w:rPr>
     </w:lvl>
   </w:abstractNum>
-  <w:num w:numId="1" w16cid:durableId="1975329846">
+  <w:num w:numId="1">
     <w:abstractNumId w:val="7"/>
   </w:num>
-  <w:num w:numId="2" w16cid:durableId="1658419339">
+  <w:num w:numId="2">
     <w:abstractNumId w:val="2"/>
   </w:num>
-  <w:num w:numId="3" w16cid:durableId="1168594837">
+  <w:num w:numId="3">
     <w:abstractNumId w:val="1"/>
   </w:num>
-  <w:num w:numId="4" w16cid:durableId="1063722414">
+  <w:num w:numId="4">
     <w:abstractNumId w:val="4"/>
   </w:num>
-  <w:num w:numId="5" w16cid:durableId="1058894684">
+  <w:num w:numId="5">
     <w:abstractNumId w:val="10"/>
   </w:num>
-  <w:num w:numId="6" w16cid:durableId="690306413">
+  <w:num w:numId="6">
     <w:abstractNumId w:val="14"/>
   </w:num>
-  <w:num w:numId="7" w16cid:durableId="2028631086">
+  <w:num w:numId="7">
     <w:abstractNumId w:val="5"/>
   </w:num>
-  <w:num w:numId="8" w16cid:durableId="1113523333">
+  <w:num w:numId="8">
     <w:abstractNumId w:val="6"/>
   </w:num>
-  <w:num w:numId="9" w16cid:durableId="1470169560">
+  <w:num w:numId="9">
     <w:abstractNumId w:val="8"/>
   </w:num>
-  <w:num w:numId="10" w16cid:durableId="117728788">
+  <w:num w:numId="10">
     <w:abstractNumId w:val="12"/>
   </w:num>
-  <w:num w:numId="11" w16cid:durableId="1272129986">
+  <w:num w:numId="11">
     <w:abstractNumId w:val="9"/>
   </w:num>
-  <w:num w:numId="12" w16cid:durableId="1635912615">
+  <w:num w:numId="12">
     <w:abstractNumId w:val="11"/>
   </w:num>
-  <w:num w:numId="13" w16cid:durableId="800535091">
+  <w:num w:numId="13">
     <w:abstractNumId w:val="0"/>
   </w:num>
-  <w:num w:numId="14" w16cid:durableId="1768964835">
+  <w:num w:numId="14">
     <w:abstractNumId w:val="3"/>
     <w:lvlOverride w:ilvl="0">
       <w:startOverride w:val="1"/>
     </w:lvlOverride>
   </w:num>
-  <w:num w:numId="15" w16cid:durableId="1820922682">
+  <w:num w:numId="15">
     <w:abstractNumId w:val="13"/>
     <w:lvlOverride w:ilvl="0">
       <w:startOverride w:val="1"/>
@@ -12122,7 +12254,7 @@
 </file>
 
 <file path=word/styles.xml><?xml version="1.0" encoding="utf-8"?>
-<w:styles xmlns:mc="http://schemas.openxmlformats.org/markup-compatibility/2006" xmlns:r="http://schemas.openxmlformats.org/officeDocument/2006/relationships" xmlns:w="http://schemas.openxmlformats.org/wordprocessingml/2006/main" xmlns:w14="http://schemas.microsoft.com/office/word/2010/wordml" xmlns:w15="http://schemas.microsoft.com/office/word/2012/wordml" xmlns:w16cex="http://schemas.microsoft.com/office/word/2018/wordml/cex" xmlns:w16cid="http://schemas.microsoft.com/office/word/2016/wordml/cid" xmlns:w16="http://schemas.microsoft.com/office/word/2018/wordml" xmlns:w16du="http://schemas.microsoft.com/office/word/2023/wordml/word16du" xmlns:w16sdtdh="http://schemas.microsoft.com/office/word/2020/wordml/sdtdatahash" xmlns:w16sdtfl="http://schemas.microsoft.com/office/word/2024/wordml/sdtformatlock" xmlns:w16se="http://schemas.microsoft.com/office/word/2015/wordml/symex" mc:Ignorable="w14 w15 w16se w16cid w16 w16cex w16sdtdh w16sdtfl w16du">
+<w:styles xmlns:mc="http://schemas.openxmlformats.org/markup-compatibility/2006" xmlns:r="http://schemas.openxmlformats.org/officeDocument/2006/relationships" xmlns:w="http://schemas.openxmlformats.org/wordprocessingml/2006/main" xmlns:w14="http://schemas.microsoft.com/office/word/2010/wordml" xmlns:w15="http://schemas.microsoft.com/office/word/2012/wordml" xmlns:w16cex="http://schemas.microsoft.com/office/word/2018/wordml/cex" xmlns:w16cid="http://schemas.microsoft.com/office/word/2016/wordml/cid" xmlns:w16="http://schemas.microsoft.com/office/word/2018/wordml" xmlns:w16sdtdh="http://schemas.microsoft.com/office/word/2020/wordml/sdtdatahash" xmlns:w16se="http://schemas.microsoft.com/office/word/2015/wordml/symex" mc:Ignorable="w14 w15 w16se w16cid w16 w16cex w16sdtdh">
   <w:docDefaults>
     <w:rPrDefault>
       <w:rPr>
@@ -13194,6 +13326,25 @@
 </file>
 
 <file path=customXml/item1.xml><?xml version="1.0" encoding="utf-8"?>
+<?mso-contentType ?>
+<FormTemplates xmlns="http://schemas.microsoft.com/sharepoint/v3/contenttype/forms">
+  <Display>DocumentLibraryForm</Display>
+  <Edit>DocumentLibraryForm</Edit>
+  <New>DocumentLibraryForm</New>
+</FormTemplates>
+</file>
+
+<file path=customXml/item2.xml><?xml version="1.0" encoding="utf-8"?>
+<p:properties xmlns:p="http://schemas.microsoft.com/office/2006/metadata/properties" xmlns:xsi="http://www.w3.org/2001/XMLSchema-instance" xmlns:pc="http://schemas.microsoft.com/office/infopath/2007/PartnerControls">
+  <documentManagement/>
+</p:properties>
+</file>
+
+<file path=customXml/item3.xml><?xml version="1.0" encoding="utf-8"?>
+<b:Sources xmlns:b="http://schemas.openxmlformats.org/officeDocument/2006/bibliography" xmlns="http://schemas.openxmlformats.org/officeDocument/2006/bibliography" SelectedStyle="\APASixthEditionOfficeOnline.xsl" StyleName="APA" Version="6"/>
+</file>
+
+<file path=customXml/item4.xml><?xml version="1.0" encoding="utf-8"?>
 <ct:contentTypeSchema xmlns:ct="http://schemas.microsoft.com/office/2006/metadata/contentType" xmlns:ma="http://schemas.microsoft.com/office/2006/metadata/properties/metaAttributes" ct:_="" ma:_="" ma:contentTypeName="Document" ma:contentTypeID="0x010100B4B3963D136B89489C303B1F134CDEFE" ma:contentTypeVersion="2" ma:contentTypeDescription="Create a new document." ma:contentTypeScope="" ma:versionID="308c9ae795ee33ed826f6ffffe232275">
   <xsd:schema xmlns:xsd="http://www.w3.org/2001/XMLSchema" xmlns:xs="http://www.w3.org/2001/XMLSchema" xmlns:p="http://schemas.microsoft.com/office/2006/metadata/properties" xmlns:ns2="3d09ae41-e7b8-4678-82ce-f613907bc86b" targetNamespace="http://schemas.microsoft.com/office/2006/metadata/properties" ma:root="true" ma:fieldsID="ae9e1e531943a4b87ea1040b939bb65d" ns2:_="">
     <xsd:import namespace="3d09ae41-e7b8-4678-82ce-f613907bc86b"/>
@@ -13325,26 +13476,32 @@
 </ct:contentTypeSchema>
 </file>
 
-<file path=customXml/item2.xml><?xml version="1.0" encoding="utf-8"?>
-<?mso-contentType ?>
-<FormTemplates xmlns="http://schemas.microsoft.com/sharepoint/v3/contenttype/forms">
-  <Display>DocumentLibraryForm</Display>
-  <Edit>DocumentLibraryForm</Edit>
-  <New>DocumentLibraryForm</New>
-</FormTemplates>
+<file path=customXml/itemProps1.xml><?xml version="1.0" encoding="utf-8"?>
+<ds:datastoreItem xmlns:ds="http://schemas.openxmlformats.org/officeDocument/2006/customXml" ds:itemID="{62938047-4573-473E-BF0E-290566D59595}">
+  <ds:schemaRefs>
+    <ds:schemaRef ds:uri="http://schemas.microsoft.com/sharepoint/v3/contenttype/forms"/>
+  </ds:schemaRefs>
+</ds:datastoreItem>
 </file>
 
-<file path=customXml/item3.xml><?xml version="1.0" encoding="utf-8"?>
-<p:properties xmlns:p="http://schemas.microsoft.com/office/2006/metadata/properties" xmlns:xsi="http://www.w3.org/2001/XMLSchema-instance" xmlns:pc="http://schemas.microsoft.com/office/infopath/2007/PartnerControls">
-  <documentManagement/>
-</p:properties>
+<file path=customXml/itemProps2.xml><?xml version="1.0" encoding="utf-8"?>
+<ds:datastoreItem xmlns:ds="http://schemas.openxmlformats.org/officeDocument/2006/customXml" ds:itemID="{B81975BD-F3A5-4B76-88D3-92416F194EA7}">
+  <ds:schemaRefs>
+    <ds:schemaRef ds:uri="http://schemas.microsoft.com/office/2006/metadata/properties"/>
+    <ds:schemaRef ds:uri="http://schemas.microsoft.com/office/infopath/2007/PartnerControls"/>
+  </ds:schemaRefs>
+</ds:datastoreItem>
 </file>
 
-<file path=customXml/item4.xml><?xml version="1.0" encoding="utf-8"?>
-<b:Sources xmlns:b="http://schemas.openxmlformats.org/officeDocument/2006/bibliography" xmlns="http://schemas.openxmlformats.org/officeDocument/2006/bibliography" SelectedStyle="\APASixthEditionOfficeOnline.xsl" StyleName="APA" Version="6"/>
+<file path=customXml/itemProps3.xml><?xml version="1.0" encoding="utf-8"?>
+<ds:datastoreItem xmlns:ds="http://schemas.openxmlformats.org/officeDocument/2006/customXml" ds:itemID="{2CDFF8FE-BF0C-42DA-AA01-C71B0B153D14}">
+  <ds:schemaRefs>
+    <ds:schemaRef ds:uri="http://schemas.openxmlformats.org/officeDocument/2006/bibliography"/>
+  </ds:schemaRefs>
+</ds:datastoreItem>
 </file>
 
-<file path=customXml/itemProps1.xml><?xml version="1.0" encoding="utf-8"?>
+<file path=customXml/itemProps4.xml><?xml version="1.0" encoding="utf-8"?>
 <ds:datastoreItem xmlns:ds="http://schemas.openxmlformats.org/officeDocument/2006/customXml" ds:itemID="{2565A03E-28DF-494F-BAE7-C32272330B83}">
   <ds:schemaRefs>
     <ds:schemaRef ds:uri="http://schemas.microsoft.com/office/2006/metadata/contentType"/>
@@ -13360,29 +13517,4 @@
     <ds:schemaRef ds:uri="http://schemas.microsoft.com/internal/obd"/>
   </ds:schemaRefs>
 </ds:datastoreItem>
-</file>
-
-<file path=customXml/itemProps2.xml><?xml version="1.0" encoding="utf-8"?>
-<ds:datastoreItem xmlns:ds="http://schemas.openxmlformats.org/officeDocument/2006/customXml" ds:itemID="{62938047-4573-473E-BF0E-290566D59595}">
-  <ds:schemaRefs>
-    <ds:schemaRef ds:uri="http://schemas.microsoft.com/sharepoint/v3/contenttype/forms"/>
-  </ds:schemaRefs>
-</ds:datastoreItem>
-</file>
-
-<file path=customXml/itemProps3.xml><?xml version="1.0" encoding="utf-8"?>
-<ds:datastoreItem xmlns:ds="http://schemas.openxmlformats.org/officeDocument/2006/customXml" ds:itemID="{B81975BD-F3A5-4B76-88D3-92416F194EA7}">
-  <ds:schemaRefs>
-    <ds:schemaRef ds:uri="http://schemas.microsoft.com/office/2006/metadata/properties"/>
-    <ds:schemaRef ds:uri="http://schemas.microsoft.com/office/infopath/2007/PartnerControls"/>
-  </ds:schemaRefs>
-</ds:datastoreItem>
-</file>
-
-<file path=customXml/itemProps4.xml><?xml version="1.0" encoding="utf-8"?>
-<ds:datastoreItem xmlns:ds="http://schemas.openxmlformats.org/officeDocument/2006/customXml" ds:itemID="{2CDFF8FE-BF0C-42DA-AA01-C71B0B153D14}">
-  <ds:schemaRefs>
-    <ds:schemaRef ds:uri="http://schemas.openxmlformats.org/officeDocument/2006/bibliography"/>
-  </ds:schemaRefs>
-</ds:datastoreItem>
 </file>
</xml_diff>